<commit_message>
Refine SCI introduction and deep-learning methods
Co-authored-by: arena-agent <297053741+arena-agent@users.noreply.github.com>
</commit_message>
<xml_diff>
--- a/projects/porphyromonas-ad-mechanism-manuscript/manuscript/concise/Chinese.docx
+++ b/projects/porphyromonas-ad-mechanism-manuscript/manuscript/concise/Chinese.docx
@@ -8,7 +8,7 @@
         <w:keepNext/>
       </w:pPr>
       <w:r>
-        <w:t>牙周炎—阿尔茨海默病界面口腔微肽的汇总优选</w:t>
+        <w:t>深度学习引导的牙周炎—阿尔茨海默病界面口腔微肽多模型优选</w:t>
       </w:r>
     </w:p>
     <w:p>
@@ -77,7 +77,7 @@
         <w:t>方法：</w:t>
       </w:r>
       <w:r>
-        <w:t xml:space="preserve"> 对健康标记和牙周炎标记的口腔宏基因组候选集汇总记录进行蛋白质组支持、血脑屏障（BBB）、神经毒性、金属结合、抗氧化预测及来源报告乙酰胆碱酯酶（AChE）对接筛选。核查公共登录记录，以区分PRJNA678453来源队列与其衍生的EBI-EMG/MGnify第三方注释（TPA）组装项目PRJEB65451。仅进行描述性计算。</w:t>
+        <w:t xml:space="preserve"> 对健康标记和牙周炎标记的口腔宏基因组候选集汇总记录实施深度学习引导的级联分析，整合蛋白质语言模型嵌入、任务特异性卷积神经网络、分层神经网络金属结合预测及多任务抗氧化预测。核查公共登录记录，以区分PRJNA678453来源队列与其衍生的EBI-EMG/MGnify第三方注释（TPA）组装项目PRJEB65451。来源报告乙酰胆碱酯酶（AChE）对接单独汇总，并仅进行描述性计算。</w:t>
       </w:r>
     </w:p>
     <w:p>
@@ -136,7 +136,7 @@
         <w:pStyle w:val="Normal"/>
       </w:pPr>
       <w:r>
-        <w:t>阿尔茨海默病是一种进行性神经退行性疾病，淀粉样蛋白β积累、tau病理、突触功能障碍、神经炎症和血管异常可在漫长的临床前阶段相互作用[1,2]。这些过程具有明显异质性，不能被简化为单一的感染、炎症或蛋白聚集通路。</w:t>
+        <w:t>阿尔茨海默病（Alzheimer’s disease，AD）是一种进行性神经退行性疾病，也是痴呆的首要原因，其病理连续过程可在明显认知障碍出现前多年启动[1]。当前疾病模型将淀粉样蛋白β积累置于tau病理、突触功能障碍、先天免疫激活和神经血管损伤相互作用的网络中，而不再把疾病进展归因于单一通路[2]。</w:t>
       </w:r>
     </w:p>
     <w:p>
@@ -144,16 +144,33 @@
         <w:pStyle w:val="Normal"/>
       </w:pPr>
       <w:r>
-        <w:t>牙龈卟啉单胞菌是一种与失调性牙周生物膜相关的革兰阴性厌氧条件致病菌。牙周炎可增加机体反复暴露于口腔微生物、炎症介质和微生物产物的机会。因此，实验研究和死后组织研究提出了多条连接</w:t>
+        <w:t>牙周炎是一种与菌群失调相关的慢性炎症性疾病，其潜在神经系统影响推动了口腔—脑轴研究[3]。在失调性牙周生物膜中，牙龈卟啉单胞菌（</w:t>
       </w:r>
       <w:r>
         <w:rPr>
           <w:i/>
         </w:rPr>
+        <w:t>Porphyromonas gingivalis</w:t>
+      </w:r>
+      <w:r>
+        <w:t>）是一种具有显著免疫调节和组织破坏能力的革兰阴性厌氧条件致病菌[4]。溃疡化牙周界面可能使机体间歇性暴露于细菌、炎症介质和毒力产物，从而为局部口腔感染影响远隔组织提供生物学上合理的路径。</w:t>
+      </w:r>
+    </w:p>
+    <w:p>
+      <w:pPr>
+        <w:pStyle w:val="Normal"/>
+      </w:pPr>
+      <w:r>
+        <w:t>多条互不排斥的路径可能连接</w:t>
+      </w:r>
+      <w:r>
+        <w:rPr>
+          <w:i/>
+        </w:rPr>
         <w:t>P. gingivalis</w:t>
       </w:r>
       <w:r>
-        <w:t>与AD相关病理的可能路径：循环炎症可能影响BBB完整性并激活小胶质细胞；脂多糖和牙龈蛋白酶可能扰动宿主信号与蛋白稳态；外膜囊泡则可能把毒力成分带离牙周生态位[3–7]。这些发现为研究提供了生物学上合理的假设，但不能证明</w:t>
+        <w:t>暴露与AD相关分子过程。一项死后组织研究在AD脑组织中报告了</w:t>
       </w:r>
       <w:r>
         <w:rPr>
@@ -162,7 +179,16 @@
         <w:t>P. gingivalis</w:t>
       </w:r>
       <w:r>
-        <w:t>在人类中导致AD。现有证据具有异质性，而且一项双样本孟德尔随机化研究未发现牙周病导致AD的遗传学证据[8]。</w:t>
+        <w:t xml:space="preserve"> DNA和牙龈蛋白酶免疫反应性，但这些观察尚不足以确定方向性或因果关系[5]。在野生型小鼠中，反复口腔感染引起神经炎症和淀粉样蛋白相关改变，支持实验可行性，但不能直接外推到人类[6]。另一项小鼠研究显示，</w:t>
+      </w:r>
+      <w:r>
+        <w:rPr>
+          <w:i/>
+        </w:rPr>
+        <w:t>P. gingivalis</w:t>
+      </w:r>
+      <w:r>
+        <w:t>外膜囊泡可到达脑组织，并与炎症小体激活、tau磷酸化和记忆功能障碍相关[7]。相反，一项双样本孟德尔随机化分析未发现牙周病导致AD的遗传学证据，进一步表明人类因果关系仍未解决[8]。</w:t>
       </w:r>
     </w:p>
     <w:p>
@@ -170,7 +196,7 @@
         <w:pStyle w:val="Normal"/>
       </w:pPr>
       <w:r>
-        <w:t>另一个尚未解决的机制空白涉及口腔微生物群编码的小蛋白和小肽。微生物组研究表明，小开放阅读框广泛存在，并可能编码此前未知的生物活性分子[9,10]。目前尚不清楚牙周炎标记候选集所代表的口腔微生物肽能否进入循环、跨越BBB、影响神经元或胶质细胞、扰动金属/氧化还原稳态或调节AChE；本研究所考察的候选是否源于</w:t>
+        <w:t>因此，牙周菌群失调与神经退行性改变之间的分子桥梁仍不完整。人类相关微生物组中广泛存在小开放阅读框，并编码数量庞大但尚未得到充分表征的肽分子库[9]。计算注释能够发现常规基因识别流程容易遗漏的候选小蛋白[10]。牙周炎标记口腔宏基因组候选集所代表的肽是否真实表达、能否从生物膜释放并进入循环、能否跨越血脑屏障（BBB），以及是否会影响神经元、金属/氧化还原或胆碱能过程，均属尚未解决的机制空白。为此，本研究实施深度学习引导的多模型优选，以形成可开展来源链重建和实验验证的候选集合。本分析明确保持探索性定位，不把候选归属于</w:t>
       </w:r>
       <w:r>
         <w:rPr>
@@ -179,7 +205,7 @@
         <w:t>P. gingivalis</w:t>
       </w:r>
       <w:r>
-        <w:t>同样未知。因此，本研究开展探索性的汇总层面优选，以确定一组可供来源链重建和实验检验的候选，同时不把计算标签视为生物学验证。</w:t>
+        <w:t>，也不把模型分数视为AD机制证据。</w:t>
       </w:r>
     </w:p>
     <w:p>
@@ -197,7 +223,7 @@
         <w:keepNext/>
       </w:pPr>
       <w:r>
-        <w:t>研究设计与数据来源核验</w:t>
+        <w:t>研究设计与登录号来源</w:t>
       </w:r>
     </w:p>
     <w:p>
@@ -205,7 +231,7 @@
         <w:pStyle w:val="Normal"/>
       </w:pPr>
       <w:r>
-        <w:t>本研究为基于所提供汇总计数的描述性二次分析。来源材料将健康标记和牙周炎标记候选集归于BioProject PRJNA678453及PRJEB65451。登录号核查表明，PRJEB65451并非独立临床队列，而是由PRJNA678453衍生、经metaSPAdes v3.15.3组装并由EBI-EMG/MGnify代理的TPA宏基因组组装项目。已发表来源队列共22名参与者，包括11名口腔健康对照和11名牙周炎患者；每名参与者采集三个口腔部位标本，共66份标本，包括22份龈下菌斑、22份舌刮取物和22份刺激性唾液标本，并进行了配对宏基因组和宏转录组测量[11]。ENA项目页面目前在PRJEB65451下列出118项序列组装分析；这些是组装记录数，而不是参与者数或临床标本数。</w:t>
+        <w:t>本研究为基于所提供汇总筛选记录的结构化描述性二次分析。记录包含健康标记和牙周炎标记候选的汇总数量，但不含参与者层面映射、登录号—分组对应表或逐行模型输出。</w:t>
       </w:r>
     </w:p>
     <w:p>
@@ -213,7 +239,7 @@
         <w:pStyle w:val="Normal"/>
       </w:pPr>
       <w:r>
-        <w:t>所提供汇总数据不含参与者层面映射、登录号—分组对应表或逐序列模型输出。因此，经核验的11比11队列构成仅用于说明来源，不能作为候选层面推断的分母。来源材料所述24名健康对照、26名牙周炎患者及296个高质量宏基因组组装基因组未予保留，因为这些数字无法由PRJNA678453、PRJEB65451或队列论文证实。</w:t>
+        <w:t>主要序列来源为BioProject PRJNA678453。已发表队列共22名参与者，包括11名口腔健康对照和11名牙周炎患者；共采集66份口腔标本，包括22份龈下菌斑、22份舌刮取物和22份刺激性唾液，并完成配对宏基因组和宏转录组测量[11]。PRJEB65451经核验为由PRJNA678453衍生、使用metaSPAdes v3.15.3组装并由EBI-EMG/MGnify代理的第三方注释宏基因组组装项目，而不是独立临床队列。ENA记录目前在PRJEB65451下列出118项序列组装分析；这些组装记录不被解释为参与者、临床标本或宏基因组组装基因组。由于该登录号链及队列论文不支持24名健康对照、26名牙周炎患者和296个高质量宏基因组组装基因组的另一种构成，本研究不使用这些数量。经核验的临床构成仅用于说明来源，不作为候选层面推断的分母。</w:t>
       </w:r>
     </w:p>
     <w:p>
@@ -222,7 +248,7 @@
         <w:keepNext/>
       </w:pPr>
       <w:r>
-        <w:t>汇总筛选与预测算法</w:t>
+        <w:t>候选定义与蛋白质组证据过滤</w:t>
       </w:r>
     </w:p>
     <w:p>
@@ -230,7 +256,16 @@
         <w:pStyle w:val="Normal"/>
       </w:pPr>
       <w:r>
-        <w:t>所提供流程从按健康状态标记的4–50 aa smORF开始。通过与口腔蛋白质组资源进行精确序列匹配并去重，获得有蛋白质组支持的候选集。UniDL4BioPep预测概率≥0.8定义为高置信度功能预测，BBB概率≥0.8的候选进入下游筛选。NTxPred2仅用于其记录的7–50 aa输入范围；mebipred以0.5为阈值评估Cu/Fe/Zn相关金属结合潜力；AnOxPePred先按CHEL≥0.25筛选，再应用记录中的FRS标准。</w:t>
+        <w:t>根据归档的汇总流程，编码4–50 aa肽的推定小开放阅读框按来源提供的健康状态标签分组。候选序列与来源记录中的口腔蛋白质组资源进行精确匹配，包括PXD003151、PXD004319、PXD026727及HOMD相关蛋白序列。精确匹配结果经去重后形成非冗余、具有蛋白质组支持的候选集合。由于逐序列输入和匹配表不可得，该阶段按来源报告过滤步骤处理，未被独立重新运行。</w:t>
+      </w:r>
+    </w:p>
+    <w:p>
+      <w:pPr>
+        <w:pStyle w:val="Heading3"/>
+        <w:keepNext/>
+      </w:pPr>
+      <w:r>
+        <w:t>深度学习引导的多模型优选</w:t>
       </w:r>
     </w:p>
     <w:p>
@@ -238,7 +273,15 @@
         <w:pStyle w:val="Normal"/>
       </w:pPr>
       <w:r>
-        <w:t>这些网站并非采用统一的“深度学习”方法。UniDL4BioPep首先使用预训练ESM-2模型</w:t>
+        <w:t>本研究采用串行架构，依次整合上下文序列表征、任务特异性深度分类、分层金属结合预测和多任务抗氧化评分。各阶段回答不同的生物学优选问题，因此下游保留代表串行决策规则，而不是相互独立的实验确证。</w:t>
+      </w:r>
+    </w:p>
+    <w:p>
+      <w:pPr>
+        <w:pStyle w:val="Normal"/>
+      </w:pPr>
+      <w:r>
+        <w:t>首先，UniDL4BioPep使用预训练ESM-2模型</w:t>
       </w:r>
       <w:r>
         <w:rPr>
@@ -248,7 +291,39 @@
         <w:t>esm2_t6_8M_UR50D</w:t>
       </w:r>
       <w:r>
-        <w:t>把肽序列表示为320维嵌入，再输入六层卷积神经网络进行任务特异性二分类[12]。NTxPred2的肽模式微调ESM2-t30进行神经毒性预测，而蛋白模式和混合模式使用ESM-2嵌入与Extra Trees（极端随机树）分类器[13]。mebipred是一种无需序列比对的前馈神经网络方法，以氨基酸组成、理化描述符和金属结合5-mer计数为特征，先预测一般金属结合，再由第二层模型预测特定离子结合[14]。AnOxPePred对肽序列进行one-hot编码，经一维卷积、平均池化和全连接层，分别输出自由基清除和螯合预测[15]。因此，该流程混合了蛋白质语言模型、卷积神经网络、常规集成学习和基于人工特征的神经网络。由于缺少当时服务器快照、提交输入文件和逐行输出，这些说明记录的是文献所述实现，而不是本研究重新运行的模型。</w:t>
+        <w:t>，将每条肽转换为320维上下文敏感嵌入。该嵌入随后输入针对不同肽活性任务分别训练的六层深度卷积神经网络[12]。预测概率≥0.8定义为高置信度模型输出，仅BBB概率≥0.8的候选进入后续级联。</w:t>
+      </w:r>
+    </w:p>
+    <w:p>
+      <w:pPr>
+        <w:pStyle w:val="Normal"/>
+      </w:pPr>
+      <w:r>
+        <w:t>其次，采用肽特异性NTxPred2架构评价神经毒性。该模型通过迁移学习，在神经毒性肽序列上微调ESM2-t30蛋白质语言模型[13]。分析仅覆盖模型规定的7–50 aa输入范围；长度小于7 aa的序列记录为模型覆盖范围之外，而不视为阴性预测。</w:t>
+      </w:r>
+    </w:p>
+    <w:p>
+      <w:pPr>
+        <w:pStyle w:val="Normal"/>
+      </w:pPr>
+      <w:r>
+        <w:t>第三，采用mebipred评价Cu、Fe和Zn相关结合潜力。该方法将氨基酸组成、理化描述符和金属结合5-mer频率整合到两级人工神经网络框架中：先由一般金属结合网络进行判定，再进入离子特异性神经分类器[14]。来源记录中的判定阈值为0.5。</w:t>
+      </w:r>
+    </w:p>
+    <w:p>
+      <w:pPr>
+        <w:pStyle w:val="Normal"/>
+      </w:pPr>
+      <w:r>
+        <w:t>第四，采用多任务深度卷积神经网络AnOxPePred评价抗氧化相关特征。经one-hot编码的肽序列依次通过一维卷积层、平均池化和含256个单元的全连接层，最终分别输出自由基清除（FRS）和螯合（CHEL）分数[15]。首先应用CHEL≥0.25阈值，再应用来源记录中的CHEL/FRS组合标准。</w:t>
+      </w:r>
+    </w:p>
+    <w:p>
+      <w:pPr>
+        <w:pStyle w:val="Normal"/>
+      </w:pPr>
+      <w:r>
+        <w:t>本次二次分析未重新训练或微调任何模型。历史网页服务器构建版本、模型哈希、随机种子、提交输入文件及逐行输出均未被保存。因此，上述算法说明记录的是文献所述架构及与本研究相关的肽模式，而阈值和保留数量仍属于来源报告的汇总记录。</w:t>
       </w:r>
     </w:p>
     <w:p>
@@ -257,7 +332,7 @@
         <w:keepNext/>
       </w:pPr>
       <w:r>
-        <w:t>外部序列集与对接证据</w:t>
+        <w:t>外部序列表征与对接证据</w:t>
       </w:r>
     </w:p>
     <w:p>
@@ -265,7 +340,15 @@
         <w:pStyle w:val="Normal"/>
       </w:pPr>
       <w:r>
-        <w:t>另一份外部记录包含12条互不重复的7–9 aa序列及AChE对接汇总。序列长度、分子质量、电荷、疏水残基比例和残基组成均由序列字符串重新计算。对接数值按来源报告转录为针对人AChE（PDB 4EY6）的Vina均值和标准差。AChE与胆碱能信号相关，其外周区域可与淀粉样蛋白β发生相互作用[16,17]，但对接本身不能证明亲和力或功能。由于缺少受体和配体原始文件、质子化设置、搜索盒、构象、日志及逐次运行分数，本研究未重新运行对接。该12条外部序列无法逐行连接到汇总漏斗或更严格的8条终点集。</w:t>
+        <w:t>外部12条序列记录作为独立证据层分析，不与汇总筛选漏斗进行逐行合并。使用版本控制代码直接依据序列字符串重新计算序列长度、分子质量、名义电荷、疏水残基比例和氨基酸组成。</w:t>
+      </w:r>
+    </w:p>
+    <w:p>
+      <w:pPr>
+        <w:pStyle w:val="Normal"/>
+      </w:pPr>
+      <w:r>
+        <w:t>AChE被选作结构分析背景靶点，是因为已有研究报告该酶可通过外周区域加速淀粉样蛋白β纤维形成[16]。外部记录指定人AChE结构PDB 4EY6，该结构具有配体结合结构信息[17]。Vina均值和标准差按来源报告精确转录。由于受体及配体原始文件、质子化状态、网格定义、构象、日志和逐次运行分数均不可得，本研究未重新运行对接，也不推断接触模式、亲和力或功能。该12条外部序列无法映射到更严格的8条汇总终点集。</w:t>
       </w:r>
     </w:p>
     <w:p>
@@ -274,7 +357,7 @@
         <w:keepNext/>
       </w:pPr>
       <w:r>
-        <w:t>统计分析</w:t>
+        <w:t>统计分析与证据解释</w:t>
       </w:r>
     </w:p>
     <w:p>
@@ -282,7 +365,15 @@
         <w:pStyle w:val="Normal"/>
       </w:pPr>
       <w:r>
-        <w:t>计数和百分比仅作描述性报告。候选序列是计算记账单位，而非独立参与者或生物学重复，因此未进行肽层面的健康—牙周炎显著性检验。依据既有对接方法学认识，对对接分数作为终点替代指标的局限进行解释[18–20]。</w:t>
+        <w:t>所有分析均为描述性分析。保留率以前一个有记录的阶段作为分母。候选序列属于计算记账单位，而不是独立参与者或生物学重复，因此未开展健康—牙周炎假设检验、置信区间估计或肽层面推断模型，也未对缺失的逐行数据进行插补。</w:t>
+      </w:r>
+    </w:p>
+    <w:p>
+      <w:pPr>
+        <w:pStyle w:val="Normal"/>
+      </w:pPr>
+      <w:r>
+        <w:t>Vina分数仅用于来源记录内部排序，不被解释为实验亲和力或结合自由能[18]。当前Vina实现虽改进了搜索和力场选项，但仍无法消除受体准备、搜索空间定义及采样设置的影响[19]。鉴于蛋白质—肽识别可能涉及分散的界面热点片段，单一刚性受体对接排序不被转化为机制结论[20]。</w:t>
       </w:r>
     </w:p>
     <w:p>

</xml_diff>

<commit_message>
deliver clean full and concise manuscripts v3.6.0
Co-authored-by: arena-agent <297053741+arena-agent@users.noreply.github.com>
</commit_message>
<xml_diff>
--- a/projects/porphyromonas-ad-mechanism-manuscript/manuscript/concise/Chinese.docx
+++ b/projects/porphyromonas-ad-mechanism-manuscript/manuscript/concise/Chinese.docx
@@ -4,15 +4,6 @@
   <w:body>
     <w:p>
       <w:pPr>
-        <w:pStyle w:val="Heading1"/>
-        <w:keepNext/>
-      </w:pPr>
-      <w:r>
-        <w:t>深度学习引导的牙周炎—阿尔茨海默病界面口腔微肽多模型优选</w:t>
-      </w:r>
-    </w:p>
-    <w:p>
-      <w:pPr>
         <w:pStyle w:val="Heading2"/>
         <w:keepNext/>
       </w:pPr>
@@ -25,101 +16,30 @@
         <w:pStyle w:val="Normal"/>
       </w:pPr>
       <w:r>
+        <w:t>牙周炎相关口腔菌群失调被认为可能影响阿尔茨海默病（AD）相关炎症，但具体分子链路仍不确定。本研究对口腔小开放阅读框（smORF）汇总数据进行纯计算二次分析，以优选可供验证的微肽。筛选级联整合ESM-2嵌入与任务特异性卷积网络、ESM2-t30神经毒性模型、两级神经网络金属结合预测器和多任务抗氧化卷积网络。序列证据过滤从11,269,961条和11,721,988条smORF起始库中分别保留31,510条和33,786条候选。在牙周炎标记分支中，3,518条候选达到BBB高分；NTxPred2评价3,299条并将923条判为阳性，后续筛选依次保留111、15、12和8条候选。另一张表包含12条7–9 aa序列，其AChE Vina均值范围为−9.60至−8.25 kcal/mol。序列组成和评分排序可以核对，但12条序列与汇总终点的关系、对接执行和分子动力学结果均不可获得。因此，本研究形成的是供独立重现和实验检验的计算候选清单，而不是</w:t>
+      </w:r>
+      <w:r>
+        <w:rPr>
+          <w:i/>
+        </w:rPr>
+        <w:t>Porphyromonas gingivalis</w:t>
+      </w:r>
+      <w:r>
+        <w:t>来源、脑暴露、AChE结合或AD机制的证据。</w:t>
+      </w:r>
+    </w:p>
+    <w:p>
+      <w:pPr>
+        <w:pStyle w:val="Keywords"/>
+      </w:pPr>
+      <w:r>
         <w:rPr>
           <w:b/>
         </w:rPr>
-        <w:t>背景：</w:t>
-      </w:r>
-      <w:r>
-        <w:t xml:space="preserve"> 阿尔茨海默病（Alzheimer’s disease，AD）涉及淀粉样蛋白、tau、神经免疫和血管异常的相互作用。牙周感染，特别是涉及牙龈卟啉单胞菌（</w:t>
-      </w:r>
-      <w:r>
-        <w:rPr>
-          <w:i/>
-        </w:rPr>
-        <w:t>Porphyromonas gingivalis</w:t>
-      </w:r>
-      <w:r>
-        <w:t>）的感染，被认为可能参与这一多因素过程，但其在人类中的因果关系和分子链路仍未解决。</w:t>
-      </w:r>
-    </w:p>
-    <w:p>
-      <w:pPr>
-        <w:pStyle w:val="Normal"/>
-      </w:pPr>
-      <w:r>
-        <w:rPr>
-          <w:b/>
-        </w:rPr>
-        <w:t>目的：</w:t>
-      </w:r>
-      <w:r>
-        <w:t xml:space="preserve"> 在由</w:t>
-      </w:r>
-      <w:r>
-        <w:rPr>
-          <w:i/>
-        </w:rPr>
-        <w:t>P. gingivalis</w:t>
-      </w:r>
-      <w:r>
-        <w:t>启发、但不进行菌种来源指认的AD假设框架内，优选可供机制验证的口腔微肽候选。</w:t>
-      </w:r>
-    </w:p>
-    <w:p>
-      <w:pPr>
-        <w:pStyle w:val="Normal"/>
-      </w:pPr>
-      <w:r>
-        <w:rPr>
-          <w:b/>
-        </w:rPr>
-        <w:t>方法：</w:t>
-      </w:r>
-      <w:r>
-        <w:t xml:space="preserve"> 对健康标记和牙周炎标记的口腔宏基因组候选集汇总记录实施深度学习引导的级联分析，整合蛋白质语言模型嵌入、任务特异性卷积神经网络、分层神经网络金属结合预测及多任务抗氧化预测。核查公共登录记录，以区分PRJNA678453来源队列与其衍生的EBI-EMG/MGnify第三方注释（TPA）组装项目PRJEB65451。来源报告乙酰胆碱酯酶（AChE）对接单独汇总，并仅进行描述性计算。</w:t>
-      </w:r>
-    </w:p>
-    <w:p>
-      <w:pPr>
-        <w:pStyle w:val="Normal"/>
-      </w:pPr>
-      <w:r>
-        <w:rPr>
-          <w:b/>
-        </w:rPr>
-        <w:t>结果：</w:t>
-      </w:r>
-      <w:r>
-        <w:t xml:space="preserve"> 所提供漏斗始于11,269,961条健康标记和11,721,988条牙周炎标记smORF，分别保留31,510条和33,786条经蛋白质组支持的非冗余候选。后续汇总记录包含3,518条BBB高分候选；NTxPred2实际覆盖3,299条，其中923条被判为神经毒性阳性。金属结合和抗氧化筛选依次保留111、15、12和最终8条候选。另一份外部记录列出12条序列，首尾为FLLHTTR和HVLLLRQCA，并报告其针对AChE的Vina均值范围为−9.60至−8.25 kcal/mol。</w:t>
-      </w:r>
-    </w:p>
-    <w:p>
-      <w:pPr>
-        <w:pStyle w:val="Normal"/>
-      </w:pPr>
-      <w:r>
-        <w:rPr>
-          <w:b/>
-        </w:rPr>
-        <w:t>结论：</w:t>
-      </w:r>
-      <w:r>
-        <w:t xml:space="preserve"> 本分析得到的是用于后续验证的紧凑计算候选集，而非已经证实的牙周炎—AD机制。序列来源链、菌种归属、独立对接复现和实验验证仍不可缺少。</w:t>
-      </w:r>
-    </w:p>
-    <w:p>
-      <w:pPr>
-        <w:pStyle w:val="Keywords"/>
-      </w:pPr>
-      <w:r>
-        <w:rPr>
-          <w:b/>
-        </w:rPr>
         <w:t>关键词：</w:t>
       </w:r>
       <w:r>
-        <w:t xml:space="preserve"> 阿尔茨海默病；牙龈卟啉单胞菌；牙周炎；口腔微肽；宏基因组学；机器学习；乙酰胆碱酯酶</w:t>
+        <w:t xml:space="preserve"> 阿尔茨海默病；牙龈卟啉单胞菌；牙周炎；口腔微肽；smORF；深度学习；乙酰胆碱酯酶</w:t>
       </w:r>
     </w:p>
     <w:p>
@@ -136,7 +56,19 @@
         <w:pStyle w:val="Normal"/>
       </w:pPr>
       <w:r>
-        <w:t>阿尔茨海默病（Alzheimer’s disease，AD）是一种进行性神经退行性疾病，也是痴呆的首要原因，其病理连续过程可在明显认知障碍出现前多年启动[1]。当前疾病模型将淀粉样蛋白β积累置于tau病理、突触功能障碍、先天免疫激活和神经血管损伤相互作用的网络中，而不再把疾病进展归因于单一通路[2]。</w:t>
+        <w:t>阿尔茨海默病（AD）的发生发展涉及淀粉样蛋白、tau、突触、免疫和血管过程的相互作用，而非单一分子通路</w:t>
+      </w:r>
+      <w:r>
+        <w:t>[1]</w:t>
+      </w:r>
+      <w:r>
+        <w:t>。淀粉样蛋白仍具有重要生物学意义，但其与疾病进展的关系必须在这一更广泛网络中解释</w:t>
+      </w:r>
+      <w:r>
+        <w:t>[2]</w:t>
+      </w:r>
+      <w:r>
+        <w:t>。</w:t>
       </w:r>
     </w:p>
     <w:p>
@@ -144,7 +76,13 @@
         <w:pStyle w:val="Normal"/>
       </w:pPr>
       <w:r>
-        <w:t>牙周炎是一种与菌群失调相关的慢性炎症性疾病，其潜在神经系统影响推动了口腔—脑轴研究[3]。在失调性牙周生物膜中，牙龈卟啉单胞菌（</w:t>
+        <w:t>牙周炎是一种与菌群失调相关的炎症性疾病，可能增加全身炎症负担，并推动了口腔—脑轴研究</w:t>
+      </w:r>
+      <w:r>
+        <w:t>[3]</w:t>
+      </w:r>
+      <w:r>
+        <w:t>。在牙周生物膜中，牙龈卟啉单胞菌（</w:t>
       </w:r>
       <w:r>
         <w:rPr>
@@ -153,7 +91,46 @@
         <w:t>Porphyromonas gingivalis</w:t>
       </w:r>
       <w:r>
-        <w:t>）是一种具有显著免疫调节和组织破坏能力的革兰阴性厌氧条件致病菌[4]。溃疡化牙周界面可能使机体间歇性暴露于细菌、炎症介质和毒力产物，从而为局部口腔感染影响远隔组织提供生物学上合理的路径。</w:t>
+        <w:t>）是一种可参与蛋白水解、免疫调节、组织破坏和群落重塑的条件致病菌</w:t>
+      </w:r>
+      <w:r>
+        <w:t>[4]</w:t>
+      </w:r>
+      <w:r>
+        <w:t>。死后组织研究曾在AD脑组织中报告</w:t>
+      </w:r>
+      <w:r>
+        <w:rPr>
+          <w:i/>
+        </w:rPr>
+        <w:t>P. gingivalis</w:t>
+      </w:r>
+      <w:r>
+        <w:t>相关信号，但不能据此确定方向或因果关系</w:t>
+      </w:r>
+      <w:r>
+        <w:t>[5]</w:t>
+      </w:r>
+      <w:r>
+        <w:t>。小鼠反复口腔暴露可引起神经炎症和淀粉样蛋白相关改变，支持实验合理性，但不能直接外推到人类</w:t>
+      </w:r>
+      <w:r>
+        <w:t>[6]</w:t>
+      </w:r>
+      <w:r>
+        <w:t>。囊泡也被提出可运输浓缩微生物货物，但其与人类自然脑暴露的关系仍未解决</w:t>
+      </w:r>
+      <w:r>
+        <w:t>[7]</w:t>
+      </w:r>
+      <w:r>
+        <w:t>。一项孟德尔随机化分析未确认牙周病对AD的遗传因果效应，为强因果表述提供了重要限制</w:t>
+      </w:r>
+      <w:r>
+        <w:t>[8]</w:t>
+      </w:r>
+      <w:r>
+        <w:t>。</w:t>
       </w:r>
     </w:p>
     <w:p>
@@ -161,7 +138,27 @@
         <w:pStyle w:val="Normal"/>
       </w:pPr>
       <w:r>
-        <w:t>多条互不排斥的路径可能连接</w:t>
+        <w:t>微生物组编码的微肽可能是一类尚未充分研究的分子。人类相关微生物组含有大量保守小基因</w:t>
+      </w:r>
+      <w:r>
+        <w:t>[9]</w:t>
+      </w:r>
+      <w:r>
+        <w:t>，专用注释方法能够提高常规流程容易遗漏的smORF检出率</w:t>
+      </w:r>
+      <w:r>
+        <w:t>[10]</w:t>
+      </w:r>
+      <w:r>
+        <w:t>。然而，预测序列不一定被翻译、从生物膜释放、在循环中保持稳定、跨越血脑屏障（BBB）或在神经组织中发挥作用。</w:t>
+      </w:r>
+    </w:p>
+    <w:p>
+      <w:pPr>
+        <w:pStyle w:val="Normal"/>
+      </w:pPr>
+      <w:r>
+        <w:t>因此，相关机制仍不清楚。本研究旨在采用现代序列模型缩小口腔smORF汇总候选空间，表征现有12条肽，并明确检验AChE、金属/氧化还原、BBB和神经毒性假设所需的后续工作。分析保持探索性，不把任何候选归属于</w:t>
       </w:r>
       <w:r>
         <w:rPr>
@@ -170,42 +167,7 @@
         <w:t>P. gingivalis</w:t>
       </w:r>
       <w:r>
-        <w:t>暴露与AD相关分子过程。一项死后组织研究在AD脑组织中报告了</w:t>
-      </w:r>
-      <w:r>
-        <w:rPr>
-          <w:i/>
-        </w:rPr>
-        <w:t>P. gingivalis</w:t>
-      </w:r>
-      <w:r>
-        <w:t xml:space="preserve"> DNA和牙龈蛋白酶免疫反应性，但这些观察尚不足以确定方向性或因果关系[5]。在野生型小鼠中，反复口腔感染引起神经炎症和淀粉样蛋白相关改变，支持实验可行性，但不能直接外推到人类[6]。另一项小鼠研究显示，</w:t>
-      </w:r>
-      <w:r>
-        <w:rPr>
-          <w:i/>
-        </w:rPr>
-        <w:t>P. gingivalis</w:t>
-      </w:r>
-      <w:r>
-        <w:t>外膜囊泡可到达脑组织，并与炎症小体激活、tau磷酸化和记忆功能障碍相关[7]。相反，一项双样本孟德尔随机化分析未发现牙周病导致AD的遗传学证据，进一步表明人类因果关系仍未解决[8]。</w:t>
-      </w:r>
-    </w:p>
-    <w:p>
-      <w:pPr>
-        <w:pStyle w:val="Normal"/>
-      </w:pPr>
-      <w:r>
-        <w:t>因此，牙周菌群失调与神经退行性改变之间的分子桥梁仍不完整。人类相关微生物组中广泛存在小开放阅读框，并编码数量庞大但尚未得到充分表征的肽分子库[9]。计算注释能够发现常规基因识别流程容易遗漏的候选小蛋白[10]。牙周炎标记口腔宏基因组候选集所代表的肽是否真实表达、能否从生物膜释放并进入循环、能否跨越血脑屏障（BBB），以及是否会影响神经元、金属/氧化还原或胆碱能过程，均属尚未解决的机制空白。为此，本研究实施深度学习引导的多模型优选，以形成可开展来源链重建和实验验证的候选集合。本分析明确保持探索性定位，不把候选归属于</w:t>
-      </w:r>
-      <w:r>
-        <w:rPr>
-          <w:i/>
-        </w:rPr>
-        <w:t>P. gingivalis</w:t>
-      </w:r>
-      <w:r>
-        <w:t>，也不把模型分数视为AD机制证据。</w:t>
+        <w:t>，也不把模型评分视为生物学确认。</w:t>
       </w:r>
     </w:p>
     <w:p>
@@ -223,7 +185,7 @@
         <w:keepNext/>
       </w:pPr>
       <w:r>
-        <w:t>研究设计与登录号来源</w:t>
+        <w:t>研究设计与数据范围</w:t>
       </w:r>
     </w:p>
     <w:p>
@@ -231,7 +193,7 @@
         <w:pStyle w:val="Normal"/>
       </w:pPr>
       <w:r>
-        <w:t>本研究为基于所提供汇总筛选记录的结构化描述性二次分析。记录包含健康标记和牙周炎标记候选的汇总数量，但不含参与者层面映射、登录号—分组对应表或逐行模型输出。</w:t>
+        <w:t>本研究为纯计算二次分析，使用汇总筛选计数、一张12条序列表和一张AChE对接评分表。本文未开展参与者招募、标本采集、湿实验、新组学处理、预测器再训练、对接重跑或完整MD分析。完整漏斗的逐行序列、受试者/样本映射、登录号与分组对应关系、分类学信息、肽谱匹配、完整模型输出及对接输入均不可获得。</w:t>
       </w:r>
     </w:p>
     <w:p>
@@ -239,7 +201,13 @@
         <w:pStyle w:val="Normal"/>
       </w:pPr>
       <w:r>
-        <w:t>主要序列来源为BioProject PRJNA678453。已发表队列共22名参与者，包括11名口腔健康对照和11名牙周炎患者；共采集66份口腔标本，包括22份龈下菌斑、22份舌刮取物和22份刺激性唾液，并完成配对宏基因组和宏转录组测量[11]。PRJEB65451经核验为由PRJNA678453衍生、使用metaSPAdes v3.15.3组装并由EBI-EMG/MGnify代理的第三方注释宏基因组组装项目，而不是独立临床队列。ENA记录目前在PRJEB65451下列出118项序列组装分析；这些组装记录不被解释为参与者、临床标本或宏基因组组装基因组。由于该登录号链及队列论文不支持24名健康对照、26名牙周炎患者和296个高质量宏基因组组装基因组的另一种构成，本研究不使用这些数量。经核验的临床构成仅用于说明来源，不作为候选层面推断的分母。</w:t>
+        <w:t>PRJNA678453被视为配对口腔宏基因组和宏转录组数据的来源项目</w:t>
+      </w:r>
+      <w:r>
+        <w:t>[11]</w:t>
+      </w:r>
+      <w:r>
+        <w:t>。PRJEB65451并非独立临床队列，而是由PRJNA678453衍生、使用metaSPAdes v3.15.3组装并由EBI-EMG/MGnify代理的第三方注释宏基因组组装项目。由于缺少一致的映射和bin层面清单，本文不报告具体参与者、标本、组装分析或宏基因组组装基因组总数。</w:t>
       </w:r>
     </w:p>
     <w:p>
@@ -248,7 +216,7 @@
         <w:keepNext/>
       </w:pPr>
       <w:r>
-        <w:t>候选定义与蛋白质组证据过滤</w:t>
+        <w:t>候选构建与模型级联</w:t>
       </w:r>
     </w:p>
     <w:p>
@@ -256,7 +224,57 @@
         <w:pStyle w:val="Normal"/>
       </w:pPr>
       <w:r>
-        <w:t>根据归档的汇总流程，编码4–50 aa肽的推定小开放阅读框按来源提供的健康状态标签分组。候选序列与来源记录中的口腔蛋白质组资源进行精确匹配，包括PXD003151、PXD004319、PXD026727及HOMD相关蛋白序列。精确匹配结果经去重后形成非冗余、具有蛋白质组支持的候选集合。由于逐序列输入和匹配表不可得，该阶段按来源报告过滤步骤处理，未被独立重新运行。</w:t>
+        <w:t>所提供分析保留编码4–50 aa肽的smORF。健康标记和牙周炎标记起始库分别含11,269,961条和11,721,988条候选。与指定口腔序列和蛋白质组资源精确匹配并去冗余后，分别保留31,510条和33,786条候选。资源匹配被解释为序列支持信息，而不是分析临床分组中真实表达的证明。</w:t>
+      </w:r>
+    </w:p>
+    <w:p>
+      <w:pPr>
+        <w:pStyle w:val="Normal"/>
+      </w:pPr>
+      <w:r>
+        <w:t>UniDL4BioPep采用预训练ESM-2模型</w:t>
+      </w:r>
+      <w:r>
+        <w:rPr>
+          <w:rFonts w:ascii="Consolas" w:hAnsi="Consolas" w:eastAsia="等线"/>
+          <w:shd w:val="clear" w:color="auto" w:fill="F2F4F7"/>
+        </w:rPr>
+        <w:t>esm2_t6_8M_UR50D</w:t>
+      </w:r>
+      <w:r>
+        <w:t>编码肽序列，产生320维上下文嵌入，再输入六层任务特异性卷积神经网络</w:t>
+      </w:r>
+      <w:r>
+        <w:t>[12]</w:t>
+      </w:r>
+      <w:r>
+        <w:t>。应用阈值为≥0.80，包括BBB优选。NTxPred2随后在文献规定的7–50 aa范围内评价候选，其方法是在神经毒性肽序列上微调ESM2-t30蛋白质语言模型</w:t>
+      </w:r>
+      <w:r>
+        <w:t>[13]</w:t>
+      </w:r>
+      <w:r>
+        <w:t>。短于7 aa的序列记为模型覆盖范围之外，而不是阴性。</w:t>
+      </w:r>
+    </w:p>
+    <w:p>
+      <w:pPr>
+        <w:pStyle w:val="Normal"/>
+      </w:pPr>
+      <w:r>
+        <w:t>Mebipred把氨基酸组成、理化描述符和金属结合5-mer频率整合到两级人工神经网络框架中，包括一般和离子特异性分类器</w:t>
+      </w:r>
+      <w:r>
+        <w:t>[14]</w:t>
+      </w:r>
+      <w:r>
+        <w:t>，应用阈值为0.50。AnOxPePred使用包含一维卷积、平均池化和256单元全连接层的多任务深度卷积神经网络，产生自由基清除（FRS）和螯合（CHEL）评分</w:t>
+      </w:r>
+      <w:r>
+        <w:t>[15]</w:t>
+      </w:r>
+      <w:r>
+        <w:t>。分析终点为CHEL≥0.25、CHEL≥0.25且FRS&lt;0.50，以及CHEL≥0.25且FRS&lt;0.45。本研究未重新训练模型，多模型串行一致不视为独立验证。</w:t>
       </w:r>
     </w:p>
     <w:p>
@@ -265,7 +283,7 @@
         <w:keepNext/>
       </w:pPr>
       <w:r>
-        <w:t>深度学习引导的多模型优选</w:t>
+        <w:t>序列、对接与前瞻性MD分析</w:t>
       </w:r>
     </w:p>
     <w:p>
@@ -273,7 +291,7 @@
         <w:pStyle w:val="Normal"/>
       </w:pPr>
       <w:r>
-        <w:t>本研究采用串行架构，依次整合上下文序列表征、任务特异性深度分类、分层金属结合预测和多任务抗氧化评分。各阶段回答不同的生物学优选问题，因此下游保留代表串行决策规则，而不是相互独立的实验确证。</w:t>
+        <w:t>对于另一张12条序列表，我们直接依据字符串重算长度，以及组氨酸、半胱氨酸、Arg+Lys和Phe+Tyr+Trp数量。现有对接汇总描述了人AChE PDB 4EY6的AutoDock Vina 1.2.5评分。本研究仅对均值和标准差进行描述性分析。由于缺少制备结构、PDBQT输入、质子化和电荷设置、精确搜索坐标、运行定义、原始分数、日志、构象和相互作用表，未重跑对接，也不把Vina评分解释为亲和力或自由能。</w:t>
       </w:r>
     </w:p>
     <w:p>
@@ -281,49 +299,19 @@
         <w:pStyle w:val="Normal"/>
       </w:pPr>
       <w:r>
-        <w:t>首先，UniDL4BioPep使用预训练ESM-2模型</w:t>
-      </w:r>
-      <w:r>
-        <w:rPr>
-          <w:rFonts w:ascii="Consolas" w:hAnsi="Consolas" w:eastAsia="等线"/>
-          <w:shd w:val="clear" w:color="auto" w:fill="F2F4F7"/>
-        </w:rPr>
-        <w:t>esm2_t6_8M_UR50D</w:t>
-      </w:r>
-      <w:r>
-        <w:t>，将每条肽转换为320维上下文敏感嵌入。该嵌入随后输入针对不同肽活性任务分别训练的六层深度卷积神经网络[12]。预测概率≥0.8定义为高置信度模型输出，仅BBB概率≥0.8的候选进入后续级联。</w:t>
-      </w:r>
-    </w:p>
-    <w:p>
-      <w:pPr>
-        <w:pStyle w:val="Normal"/>
-      </w:pPr>
-      <w:r>
-        <w:t>其次，采用肽特异性NTxPred2架构评价神经毒性。该模型通过迁移学习，在神经毒性肽序列上微调ESM2-t30蛋白质语言模型[13]。分析仅覆盖模型规定的7–50 aa输入范围；长度小于7 aa的序列记录为模型覆盖范围之外，而不视为阴性预测。</w:t>
-      </w:r>
-    </w:p>
-    <w:p>
-      <w:pPr>
-        <w:pStyle w:val="Normal"/>
-      </w:pPr>
-      <w:r>
-        <w:t>第三，采用mebipred评价Cu、Fe和Zn相关结合潜力。该方法将氨基酸组成、理化描述符和金属结合5-mer频率整合到两级人工神经网络框架中：先由一般金属结合网络进行判定，再进入离子特异性神经分类器[14]。来源记录中的判定阈值为0.5。</w:t>
-      </w:r>
-    </w:p>
-    <w:p>
-      <w:pPr>
-        <w:pStyle w:val="Normal"/>
-      </w:pPr>
-      <w:r>
-        <w:t>第四，采用多任务深度卷积神经网络AnOxPePred评价抗氧化相关特征。经one-hot编码的肽序列依次通过一维卷积层、平均池化和含256个单元的全连接层，最终分别输出自由基清除（FRS）和螯合（CHEL）分数[15]。首先应用CHEL≥0.25阈值，再应用来源记录中的CHEL/FRS组合标准。</w:t>
-      </w:r>
-    </w:p>
-    <w:p>
-      <w:pPr>
-        <w:pStyle w:val="Normal"/>
-      </w:pPr>
-      <w:r>
-        <w:t>本次二次分析未重新训练或微调任何模型。历史网页服务器构建版本、模型哈希、随机种子、提交输入文件及逐行输出均未被保存。因此，上述算法说明记录的是文献所述架构及与本研究相关的肽模式，而阈值和保留数量仍属于来源报告的汇总记录。</w:t>
+        <w:t>前瞻性100 ns方案用于游离AChE及标记为ALLLHRC、FLLHTTR和YLSLLQR的复合物。计划使用GROMACS</w:t>
+      </w:r>
+      <w:r>
+        <w:t>[16]</w:t>
+      </w:r>
+      <w:r>
+        <w:t>、Amber99SB-ILDN</w:t>
+      </w:r>
+      <w:r>
+        <w:t>[17]</w:t>
+      </w:r>
+      <w:r>
+        <w:t>、TIP3P水和0.15 mol/L NaCl，依次开展约束NVT、约束NPT和无约束NPT平衡，随后在300 K、1 bar条件下以2 fs步长进行100 ns生产模拟。计划分析RMSD/RMSF、回转半径、溶剂可及表面积、氢键、残基接触、二级结构、径向分布函数和桥连水。由于起始复合物和完整轨迹不可获得，本文不分析任何MD结果。</w:t>
       </w:r>
     </w:p>
     <w:p>
@@ -332,7 +320,7 @@
         <w:keepNext/>
       </w:pPr>
       <w:r>
-        <w:t>外部序列表征与对接证据</w:t>
+        <w:t>统计分析</w:t>
       </w:r>
     </w:p>
     <w:p>
@@ -340,15 +328,16 @@
         <w:pStyle w:val="Normal"/>
       </w:pPr>
       <w:r>
-        <w:t>外部12条序列记录作为独立证据层分析，不与汇总筛选漏斗进行逐行合并。使用版本控制代码直接依据序列字符串重新计算序列长度、分子质量、名义电荷、疏水残基比例和氨基酸组成。</w:t>
-      </w:r>
-    </w:p>
-    <w:p>
-      <w:pPr>
-        <w:pStyle w:val="Normal"/>
-      </w:pPr>
-      <w:r>
-        <w:t>AChE被选作结构分析背景靶点，是因为已有研究报告该酶可通过外周区域加速淀粉样蛋白β纤维形成[16]。外部记录指定人AChE结构PDB 4EY6，该结构具有配体结合结构信息[17]。Vina均值和标准差按来源报告精确转录。由于受体及配体原始文件、质子化状态、网格定义、构象、日志和逐次运行分数均不可得，本研究未重新运行对接，也不推断接触模式、亲和力或功能。该12条外部序列无法映射到更严格的8条汇总终点集。</w:t>
+        <w:t>所有分析均为描述性分析。保留率以前一有明确记录的阶段为分母。候选序列是嵌套于样本、组装、基因组和同源序列组的计算单位，而非独立生物学重复。因此，未开展健康与牙周炎的汇总假设检验，也未计算置信区间和效应量。</w:t>
+      </w:r>
+    </w:p>
+    <w:p>
+      <w:pPr>
+        <w:pStyle w:val="Heading2"/>
+        <w:keepNext/>
+      </w:pPr>
+      <w:r>
+        <w:t>结果</w:t>
       </w:r>
     </w:p>
     <w:p>
@@ -357,7 +346,7 @@
         <w:keepNext/>
       </w:pPr>
       <w:r>
-        <w:t>统计分析与证据解释</w:t>
+        <w:t>汇总优选漏斗</w:t>
       </w:r>
     </w:p>
     <w:p>
@@ -365,66 +354,32 @@
         <w:pStyle w:val="Normal"/>
       </w:pPr>
       <w:r>
-        <w:t>所有分析均为描述性分析。保留率以前一个有记录的阶段作为分母。候选序列属于计算记账单位，而不是独立参与者或生物学重复，因此未开展健康—牙周炎假设检验、置信区间估计或肽层面推断模型，也未对缺失的逐行数据进行插补。</w:t>
-      </w:r>
-    </w:p>
-    <w:p>
-      <w:pPr>
-        <w:pStyle w:val="Normal"/>
-      </w:pPr>
-      <w:r>
-        <w:t>Vina分数仅用于来源记录内部排序，不被解释为实验亲和力或结合自由能[18]。当前Vina实现虽改进了搜索和力场选项，但仍无法消除受体准备、搜索空间定义及采样设置的影响[19]。鉴于蛋白质—肽识别可能涉及分散的界面热点片段，单一刚性受体对接排序不被转化为机制结论[20]。</w:t>
-      </w:r>
-    </w:p>
-    <w:p>
-      <w:pPr>
-        <w:pStyle w:val="Heading2"/>
-        <w:keepNext/>
-      </w:pPr>
-      <w:r>
-        <w:t>结果</w:t>
-      </w:r>
-    </w:p>
-    <w:p>
-      <w:pPr>
-        <w:pStyle w:val="Heading3"/>
-        <w:keepNext/>
-      </w:pPr>
-      <w:r>
-        <w:t>汇总优选漏斗</w:t>
-      </w:r>
-    </w:p>
-    <w:p>
-      <w:pPr>
-        <w:pStyle w:val="Normal"/>
-      </w:pPr>
-      <w:r>
-        <w:t>来源提供11,269,961条健康标记和11,721,988条牙周炎标记smORF。经蛋白质组匹配和去重后分别保留31,510条和33,786条候选，占各自起始库的0.2796%和0.2882%。后续记录包含3,518条BBB高分候选。219条长度小于7 aa的序列超出所记录的NTxPred2输入范围，NTxPred2对3,299条序列给出预测，其中923条标记为神经毒性阳性。面向Cu/Fe/Zn的mebipred筛选保留111条；AnOxPePred在CHEL≥0.25时保留15条，按记录的组合标准保留12条，最终优选8条。</w:t>
-      </w:r>
-    </w:p>
-    <w:p>
-      <w:pPr>
-        <w:pStyle w:val="Normal"/>
+        <w:t>序列证据过滤分别保留31,510/11,269,961条健康标记候选（0.2796%）和33,786/11,721,988条牙周炎标记候选（0.2882%）。牙周炎标记分支含3,518条BBB高分输出。NTxPred2评价3,299条，其中923条为模型阳性；另有219条低于规定长度范围。后续筛选得到111条金属结合阳性候选、15条CHEL≥0.25候选、12条CHEL≥0.25且FRS&lt;0.50候选，以及8条CHEL≥0.25且FRS&lt;0.45候选（表1）。由于缺少NTxPred2至mebipred的逐行交接，111/923不被视为已验证转换率。</w:t>
+      </w:r>
+    </w:p>
+    <w:p>
+      <w:pPr>
+        <w:pStyle w:val="Caption"/>
       </w:pPr>
       <w:r>
         <w:rPr>
           <w:b/>
         </w:rPr>
-        <w:t>表1. 汇总计算筛选漏斗。计数为描述性计算记账单位。</w:t>
+        <w:t>表1. 汇总计算优选结果。</w:t>
       </w:r>
     </w:p>
     <w:tbl>
       <w:tblPr>
-        <w:tblStyle w:val="TableGrid"/>
+        <w:tblStyle w:val="ThreeLineTable"/>
         <w:tblW w:w="5000" w:type="pct"/>
         <w:tblLayout w:type="fixed"/>
         <w:tblBorders>
-          <w:top w:val="single" w:sz="4" w:space="0" w:color="9AA6B2"/>
-          <w:left w:val="single" w:sz="4" w:space="0" w:color="9AA6B2"/>
-          <w:bottom w:val="single" w:sz="4" w:space="0" w:color="9AA6B2"/>
-          <w:right w:val="single" w:sz="4" w:space="0" w:color="9AA6B2"/>
-          <w:insideH w:val="single" w:sz="4" w:space="0" w:color="9AA6B2"/>
-          <w:insideV w:val="single" w:sz="4" w:space="0" w:color="9AA6B2"/>
+          <w:top w:val="single" w:sz="12" w:space="0" w:color="000000"/>
+          <w:left w:val="nil"/>
+          <w:bottom w:val="single" w:sz="12" w:space="0" w:color="000000"/>
+          <w:right w:val="nil"/>
+          <w:insideH w:val="nil"/>
+          <w:insideV w:val="nil"/>
         </w:tblBorders>
         <w:tblCellMar>
           <w:top w:w="70" w:type="dxa"/>
@@ -434,9 +389,10 @@
         </w:tblCellMar>
       </w:tblPr>
       <w:tblGrid>
-        <w:gridCol w:w="3120"/>
-        <w:gridCol w:w="3120"/>
-        <w:gridCol w:w="3120"/>
+        <w:gridCol w:w="2340"/>
+        <w:gridCol w:w="2340"/>
+        <w:gridCol w:w="2340"/>
+        <w:gridCol w:w="2340"/>
       </w:tblGrid>
       <w:tr>
         <w:trPr>
@@ -444,8 +400,10 @@
         </w:trPr>
         <w:tc>
           <w:tcPr>
-            <w:tcW w:w="3120" w:type="dxa"/>
-            <w:shd w:val="clear" w:color="auto" w:fill="DCE6F1"/>
+            <w:tcW w:w="2340" w:type="dxa"/>
+            <w:tcBorders>
+              <w:bottom w:val="single" w:sz="8" w:space="0" w:color="000000"/>
+            </w:tcBorders>
             <w:vAlign w:val="center"/>
           </w:tcPr>
           <w:p>
@@ -464,41 +422,67 @@
         </w:tc>
         <w:tc>
           <w:tcPr>
-            <w:tcW w:w="3120" w:type="dxa"/>
-            <w:shd w:val="clear" w:color="auto" w:fill="DCE6F1"/>
-            <w:vAlign w:val="center"/>
-          </w:tcPr>
-          <w:p>
-            <w:pPr>
-              <w:pStyle w:val="TableText"/>
-              <w:spacing w:before="0" w:after="0" w:line="220" w:lineRule="auto"/>
-            </w:pPr>
-            <w:r>
-              <w:rPr>
-                <w:sz w:val="17"/>
-                <w:szCs w:val="17"/>
-              </w:rPr>
-              <w:t>保留数量</w:t>
-            </w:r>
-          </w:p>
-        </w:tc>
-        <w:tc>
-          <w:tcPr>
-            <w:tcW w:w="3120" w:type="dxa"/>
-            <w:shd w:val="clear" w:color="auto" w:fill="DCE6F1"/>
-            <w:vAlign w:val="center"/>
-          </w:tcPr>
-          <w:p>
-            <w:pPr>
-              <w:pStyle w:val="TableText"/>
-              <w:spacing w:before="0" w:after="0" w:line="220" w:lineRule="auto"/>
-            </w:pPr>
-            <w:r>
-              <w:rPr>
-                <w:sz w:val="17"/>
-                <w:szCs w:val="17"/>
-              </w:rPr>
-              <w:t>证据状态</w:t>
+            <w:tcW w:w="2340" w:type="dxa"/>
+            <w:tcBorders>
+              <w:bottom w:val="single" w:sz="8" w:space="0" w:color="000000"/>
+            </w:tcBorders>
+            <w:vAlign w:val="center"/>
+          </w:tcPr>
+          <w:p>
+            <w:pPr>
+              <w:pStyle w:val="TableText"/>
+              <w:spacing w:before="0" w:after="0" w:line="220" w:lineRule="auto"/>
+            </w:pPr>
+            <w:r>
+              <w:rPr>
+                <w:sz w:val="17"/>
+                <w:szCs w:val="17"/>
+              </w:rPr>
+              <w:t>操作规则</w:t>
+            </w:r>
+          </w:p>
+        </w:tc>
+        <w:tc>
+          <w:tcPr>
+            <w:tcW w:w="2340" w:type="dxa"/>
+            <w:tcBorders>
+              <w:bottom w:val="single" w:sz="8" w:space="0" w:color="000000"/>
+            </w:tcBorders>
+            <w:vAlign w:val="center"/>
+          </w:tcPr>
+          <w:p>
+            <w:pPr>
+              <w:pStyle w:val="TableText"/>
+              <w:spacing w:before="0" w:after="0" w:line="220" w:lineRule="auto"/>
+            </w:pPr>
+            <w:r>
+              <w:rPr>
+                <w:sz w:val="17"/>
+                <w:szCs w:val="17"/>
+              </w:rPr>
+              <w:t>n</w:t>
+            </w:r>
+          </w:p>
+        </w:tc>
+        <w:tc>
+          <w:tcPr>
+            <w:tcW w:w="2340" w:type="dxa"/>
+            <w:tcBorders>
+              <w:bottom w:val="single" w:sz="8" w:space="0" w:color="000000"/>
+            </w:tcBorders>
+            <w:vAlign w:val="center"/>
+          </w:tcPr>
+          <w:p>
+            <w:pPr>
+              <w:pStyle w:val="TableText"/>
+              <w:spacing w:before="0" w:after="0" w:line="220" w:lineRule="auto"/>
+            </w:pPr>
+            <w:r>
+              <w:rPr>
+                <w:sz w:val="17"/>
+                <w:szCs w:val="17"/>
+              </w:rPr>
+              <w:t>分母或限制</w:t>
             </w:r>
           </w:p>
         </w:tc>
@@ -506,7 +490,7 @@
       <w:tr>
         <w:tc>
           <w:tcPr>
-            <w:tcW w:w="3120" w:type="dxa"/>
+            <w:tcW w:w="2340" w:type="dxa"/>
             <w:vAlign w:val="center"/>
           </w:tcPr>
           <w:p>
@@ -525,7 +509,26 @@
         </w:tc>
         <w:tc>
           <w:tcPr>
-            <w:tcW w:w="3120" w:type="dxa"/>
+            <w:tcW w:w="2340" w:type="dxa"/>
+            <w:vAlign w:val="center"/>
+          </w:tcPr>
+          <w:p>
+            <w:pPr>
+              <w:pStyle w:val="TableText"/>
+              <w:spacing w:before="0" w:after="0" w:line="220" w:lineRule="auto"/>
+            </w:pPr>
+            <w:r>
+              <w:rPr>
+                <w:sz w:val="17"/>
+                <w:szCs w:val="17"/>
+              </w:rPr>
+              <w:t>4–50 aa</w:t>
+            </w:r>
+          </w:p>
+        </w:tc>
+        <w:tc>
+          <w:tcPr>
+            <w:tcW w:w="2340" w:type="dxa"/>
             <w:vAlign w:val="center"/>
           </w:tcPr>
           <w:p>
@@ -544,20 +547,20 @@
         </w:tc>
         <w:tc>
           <w:tcPr>
-            <w:tcW w:w="3120" w:type="dxa"/>
-            <w:vAlign w:val="center"/>
-          </w:tcPr>
-          <w:p>
-            <w:pPr>
-              <w:pStyle w:val="TableText"/>
-              <w:spacing w:before="0" w:after="0" w:line="220" w:lineRule="auto"/>
-            </w:pPr>
-            <w:r>
-              <w:rPr>
-                <w:sz w:val="17"/>
-                <w:szCs w:val="17"/>
-              </w:rPr>
-              <w:t>来源汇总计数</w:t>
+            <w:tcW w:w="2340" w:type="dxa"/>
+            <w:vAlign w:val="center"/>
+          </w:tcPr>
+          <w:p>
+            <w:pPr>
+              <w:pStyle w:val="TableText"/>
+              <w:spacing w:before="0" w:after="0" w:line="220" w:lineRule="auto"/>
+            </w:pPr>
+            <w:r>
+              <w:rPr>
+                <w:sz w:val="17"/>
+                <w:szCs w:val="17"/>
+              </w:rPr>
+              <w:t>起始库</w:t>
             </w:r>
           </w:p>
         </w:tc>
@@ -565,7 +568,7 @@
       <w:tr>
         <w:tc>
           <w:tcPr>
-            <w:tcW w:w="3120" w:type="dxa"/>
+            <w:tcW w:w="2340" w:type="dxa"/>
             <w:vAlign w:val="center"/>
           </w:tcPr>
           <w:p>
@@ -584,7 +587,26 @@
         </w:tc>
         <w:tc>
           <w:tcPr>
-            <w:tcW w:w="3120" w:type="dxa"/>
+            <w:tcW w:w="2340" w:type="dxa"/>
+            <w:vAlign w:val="center"/>
+          </w:tcPr>
+          <w:p>
+            <w:pPr>
+              <w:pStyle w:val="TableText"/>
+              <w:spacing w:before="0" w:after="0" w:line="220" w:lineRule="auto"/>
+            </w:pPr>
+            <w:r>
+              <w:rPr>
+                <w:sz w:val="17"/>
+                <w:szCs w:val="17"/>
+              </w:rPr>
+              <w:t>4–50 aa</w:t>
+            </w:r>
+          </w:p>
+        </w:tc>
+        <w:tc>
+          <w:tcPr>
+            <w:tcW w:w="2340" w:type="dxa"/>
             <w:vAlign w:val="center"/>
           </w:tcPr>
           <w:p>
@@ -603,20 +625,20 @@
         </w:tc>
         <w:tc>
           <w:tcPr>
-            <w:tcW w:w="3120" w:type="dxa"/>
-            <w:vAlign w:val="center"/>
-          </w:tcPr>
-          <w:p>
-            <w:pPr>
-              <w:pStyle w:val="TableText"/>
-              <w:spacing w:before="0" w:after="0" w:line="220" w:lineRule="auto"/>
-            </w:pPr>
-            <w:r>
-              <w:rPr>
-                <w:sz w:val="17"/>
-                <w:szCs w:val="17"/>
-              </w:rPr>
-              <w:t>来源汇总计数</w:t>
+            <w:tcW w:w="2340" w:type="dxa"/>
+            <w:vAlign w:val="center"/>
+          </w:tcPr>
+          <w:p>
+            <w:pPr>
+              <w:pStyle w:val="TableText"/>
+              <w:spacing w:before="0" w:after="0" w:line="220" w:lineRule="auto"/>
+            </w:pPr>
+            <w:r>
+              <w:rPr>
+                <w:sz w:val="17"/>
+                <w:szCs w:val="17"/>
+              </w:rPr>
+              <w:t>起始库</w:t>
             </w:r>
           </w:p>
         </w:tc>
@@ -624,26 +646,45 @@
       <w:tr>
         <w:tc>
           <w:tcPr>
-            <w:tcW w:w="3120" w:type="dxa"/>
-            <w:vAlign w:val="center"/>
-          </w:tcPr>
-          <w:p>
-            <w:pPr>
-              <w:pStyle w:val="TableText"/>
-              <w:spacing w:before="0" w:after="0" w:line="220" w:lineRule="auto"/>
-            </w:pPr>
-            <w:r>
-              <w:rPr>
-                <w:sz w:val="17"/>
-                <w:szCs w:val="17"/>
-              </w:rPr>
-              <w:t>蛋白质组支持的健康标记候选</w:t>
-            </w:r>
-          </w:p>
-        </w:tc>
-        <w:tc>
-          <w:tcPr>
-            <w:tcW w:w="3120" w:type="dxa"/>
+            <w:tcW w:w="2340" w:type="dxa"/>
+            <w:vAlign w:val="center"/>
+          </w:tcPr>
+          <w:p>
+            <w:pPr>
+              <w:pStyle w:val="TableText"/>
+              <w:spacing w:before="0" w:after="0" w:line="220" w:lineRule="auto"/>
+            </w:pPr>
+            <w:r>
+              <w:rPr>
+                <w:sz w:val="17"/>
+                <w:szCs w:val="17"/>
+              </w:rPr>
+              <w:t>证据过滤后健康标记候选</w:t>
+            </w:r>
+          </w:p>
+        </w:tc>
+        <w:tc>
+          <w:tcPr>
+            <w:tcW w:w="2340" w:type="dxa"/>
+            <w:vAlign w:val="center"/>
+          </w:tcPr>
+          <w:p>
+            <w:pPr>
+              <w:pStyle w:val="TableText"/>
+              <w:spacing w:before="0" w:after="0" w:line="220" w:lineRule="auto"/>
+            </w:pPr>
+            <w:r>
+              <w:rPr>
+                <w:sz w:val="17"/>
+                <w:szCs w:val="17"/>
+              </w:rPr>
+              <w:t>精确匹配与去冗余</w:t>
+            </w:r>
+          </w:p>
+        </w:tc>
+        <w:tc>
+          <w:tcPr>
+            <w:tcW w:w="2340" w:type="dxa"/>
             <w:vAlign w:val="center"/>
           </w:tcPr>
           <w:p>
@@ -662,20 +703,20 @@
         </w:tc>
         <w:tc>
           <w:tcPr>
-            <w:tcW w:w="3120" w:type="dxa"/>
-            <w:vAlign w:val="center"/>
-          </w:tcPr>
-          <w:p>
-            <w:pPr>
-              <w:pStyle w:val="TableText"/>
-              <w:spacing w:before="0" w:after="0" w:line="220" w:lineRule="auto"/>
-            </w:pPr>
-            <w:r>
-              <w:rPr>
-                <w:sz w:val="17"/>
-                <w:szCs w:val="17"/>
-              </w:rPr>
-              <w:t>来源汇总计数</w:t>
+            <w:tcW w:w="2340" w:type="dxa"/>
+            <w:vAlign w:val="center"/>
+          </w:tcPr>
+          <w:p>
+            <w:pPr>
+              <w:pStyle w:val="TableText"/>
+              <w:spacing w:before="0" w:after="0" w:line="220" w:lineRule="auto"/>
+            </w:pPr>
+            <w:r>
+              <w:rPr>
+                <w:sz w:val="17"/>
+                <w:szCs w:val="17"/>
+              </w:rPr>
+              <w:t>11,269,961</w:t>
             </w:r>
           </w:p>
         </w:tc>
@@ -683,26 +724,45 @@
       <w:tr>
         <w:tc>
           <w:tcPr>
-            <w:tcW w:w="3120" w:type="dxa"/>
-            <w:vAlign w:val="center"/>
-          </w:tcPr>
-          <w:p>
-            <w:pPr>
-              <w:pStyle w:val="TableText"/>
-              <w:spacing w:before="0" w:after="0" w:line="220" w:lineRule="auto"/>
-            </w:pPr>
-            <w:r>
-              <w:rPr>
-                <w:sz w:val="17"/>
-                <w:szCs w:val="17"/>
-              </w:rPr>
-              <w:t>蛋白质组支持的牙周炎标记候选</w:t>
-            </w:r>
-          </w:p>
-        </w:tc>
-        <w:tc>
-          <w:tcPr>
-            <w:tcW w:w="3120" w:type="dxa"/>
+            <w:tcW w:w="2340" w:type="dxa"/>
+            <w:vAlign w:val="center"/>
+          </w:tcPr>
+          <w:p>
+            <w:pPr>
+              <w:pStyle w:val="TableText"/>
+              <w:spacing w:before="0" w:after="0" w:line="220" w:lineRule="auto"/>
+            </w:pPr>
+            <w:r>
+              <w:rPr>
+                <w:sz w:val="17"/>
+                <w:szCs w:val="17"/>
+              </w:rPr>
+              <w:t>证据过滤后牙周炎标记候选</w:t>
+            </w:r>
+          </w:p>
+        </w:tc>
+        <w:tc>
+          <w:tcPr>
+            <w:tcW w:w="2340" w:type="dxa"/>
+            <w:vAlign w:val="center"/>
+          </w:tcPr>
+          <w:p>
+            <w:pPr>
+              <w:pStyle w:val="TableText"/>
+              <w:spacing w:before="0" w:after="0" w:line="220" w:lineRule="auto"/>
+            </w:pPr>
+            <w:r>
+              <w:rPr>
+                <w:sz w:val="17"/>
+                <w:szCs w:val="17"/>
+              </w:rPr>
+              <w:t>精确匹配与去冗余</w:t>
+            </w:r>
+          </w:p>
+        </w:tc>
+        <w:tc>
+          <w:tcPr>
+            <w:tcW w:w="2340" w:type="dxa"/>
             <w:vAlign w:val="center"/>
           </w:tcPr>
           <w:p>
@@ -721,20 +781,20 @@
         </w:tc>
         <w:tc>
           <w:tcPr>
-            <w:tcW w:w="3120" w:type="dxa"/>
-            <w:vAlign w:val="center"/>
-          </w:tcPr>
-          <w:p>
-            <w:pPr>
-              <w:pStyle w:val="TableText"/>
-              <w:spacing w:before="0" w:after="0" w:line="220" w:lineRule="auto"/>
-            </w:pPr>
-            <w:r>
-              <w:rPr>
-                <w:sz w:val="17"/>
-                <w:szCs w:val="17"/>
-              </w:rPr>
-              <w:t>来源汇总计数</w:t>
+            <w:tcW w:w="2340" w:type="dxa"/>
+            <w:vAlign w:val="center"/>
+          </w:tcPr>
+          <w:p>
+            <w:pPr>
+              <w:pStyle w:val="TableText"/>
+              <w:spacing w:before="0" w:after="0" w:line="220" w:lineRule="auto"/>
+            </w:pPr>
+            <w:r>
+              <w:rPr>
+                <w:sz w:val="17"/>
+                <w:szCs w:val="17"/>
+              </w:rPr>
+              <w:t>11,721,988</w:t>
             </w:r>
           </w:p>
         </w:tc>
@@ -742,26 +802,45 @@
       <w:tr>
         <w:tc>
           <w:tcPr>
-            <w:tcW w:w="3120" w:type="dxa"/>
-            <w:vAlign w:val="center"/>
-          </w:tcPr>
-          <w:p>
-            <w:pPr>
-              <w:pStyle w:val="TableText"/>
-              <w:spacing w:before="0" w:after="0" w:line="220" w:lineRule="auto"/>
-            </w:pPr>
-            <w:r>
-              <w:rPr>
-                <w:sz w:val="17"/>
-                <w:szCs w:val="17"/>
-              </w:rPr>
-              <w:t>BBB概率≥0.8</w:t>
-            </w:r>
-          </w:p>
-        </w:tc>
-        <w:tc>
-          <w:tcPr>
-            <w:tcW w:w="3120" w:type="dxa"/>
+            <w:tcW w:w="2340" w:type="dxa"/>
+            <w:vAlign w:val="center"/>
+          </w:tcPr>
+          <w:p>
+            <w:pPr>
+              <w:pStyle w:val="TableText"/>
+              <w:spacing w:before="0" w:after="0" w:line="220" w:lineRule="auto"/>
+            </w:pPr>
+            <w:r>
+              <w:rPr>
+                <w:sz w:val="17"/>
+                <w:szCs w:val="17"/>
+              </w:rPr>
+              <w:t>BBB高分</w:t>
+            </w:r>
+          </w:p>
+        </w:tc>
+        <w:tc>
+          <w:tcPr>
+            <w:tcW w:w="2340" w:type="dxa"/>
+            <w:vAlign w:val="center"/>
+          </w:tcPr>
+          <w:p>
+            <w:pPr>
+              <w:pStyle w:val="TableText"/>
+              <w:spacing w:before="0" w:after="0" w:line="220" w:lineRule="auto"/>
+            </w:pPr>
+            <w:r>
+              <w:rPr>
+                <w:sz w:val="17"/>
+                <w:szCs w:val="17"/>
+              </w:rPr>
+              <w:t>UniDL4BioPep输出≥0.80</w:t>
+            </w:r>
+          </w:p>
+        </w:tc>
+        <w:tc>
+          <w:tcPr>
+            <w:tcW w:w="2340" w:type="dxa"/>
             <w:vAlign w:val="center"/>
           </w:tcPr>
           <w:p>
@@ -780,20 +859,20 @@
         </w:tc>
         <w:tc>
           <w:tcPr>
-            <w:tcW w:w="3120" w:type="dxa"/>
-            <w:vAlign w:val="center"/>
-          </w:tcPr>
-          <w:p>
-            <w:pPr>
-              <w:pStyle w:val="TableText"/>
-              <w:spacing w:before="0" w:after="0" w:line="220" w:lineRule="auto"/>
-            </w:pPr>
-            <w:r>
-              <w:rPr>
-                <w:sz w:val="17"/>
-                <w:szCs w:val="17"/>
-              </w:rPr>
-              <w:t>来源模型汇总</w:t>
+            <w:tcW w:w="2340" w:type="dxa"/>
+            <w:vAlign w:val="center"/>
+          </w:tcPr>
+          <w:p>
+            <w:pPr>
+              <w:pStyle w:val="TableText"/>
+              <w:spacing w:before="0" w:after="0" w:line="220" w:lineRule="auto"/>
+            </w:pPr>
+            <w:r>
+              <w:rPr>
+                <w:sz w:val="17"/>
+                <w:szCs w:val="17"/>
+              </w:rPr>
+              <w:t>牙周炎标记分支</w:t>
             </w:r>
           </w:p>
         </w:tc>
@@ -801,26 +880,45 @@
       <w:tr>
         <w:tc>
           <w:tcPr>
-            <w:tcW w:w="3120" w:type="dxa"/>
-            <w:vAlign w:val="center"/>
-          </w:tcPr>
-          <w:p>
-            <w:pPr>
-              <w:pStyle w:val="TableText"/>
-              <w:spacing w:before="0" w:after="0" w:line="220" w:lineRule="auto"/>
-            </w:pPr>
-            <w:r>
-              <w:rPr>
-                <w:sz w:val="17"/>
-                <w:szCs w:val="17"/>
-              </w:rPr>
-              <w:t>NTxPred2实际输出</w:t>
-            </w:r>
-          </w:p>
-        </w:tc>
-        <w:tc>
-          <w:tcPr>
-            <w:tcW w:w="3120" w:type="dxa"/>
+            <w:tcW w:w="2340" w:type="dxa"/>
+            <w:vAlign w:val="center"/>
+          </w:tcPr>
+          <w:p>
+            <w:pPr>
+              <w:pStyle w:val="TableText"/>
+              <w:spacing w:before="0" w:after="0" w:line="220" w:lineRule="auto"/>
+            </w:pPr>
+            <w:r>
+              <w:rPr>
+                <w:sz w:val="17"/>
+                <w:szCs w:val="17"/>
+              </w:rPr>
+              <w:t>NTxPred2已评估</w:t>
+            </w:r>
+          </w:p>
+        </w:tc>
+        <w:tc>
+          <w:tcPr>
+            <w:tcW w:w="2340" w:type="dxa"/>
+            <w:vAlign w:val="center"/>
+          </w:tcPr>
+          <w:p>
+            <w:pPr>
+              <w:pStyle w:val="TableText"/>
+              <w:spacing w:before="0" w:after="0" w:line="220" w:lineRule="auto"/>
+            </w:pPr>
+            <w:r>
+              <w:rPr>
+                <w:sz w:val="17"/>
+                <w:szCs w:val="17"/>
+              </w:rPr>
+              <w:t>7–50 aa</w:t>
+            </w:r>
+          </w:p>
+        </w:tc>
+        <w:tc>
+          <w:tcPr>
+            <w:tcW w:w="2340" w:type="dxa"/>
             <w:vAlign w:val="center"/>
           </w:tcPr>
           <w:p>
@@ -839,20 +937,20 @@
         </w:tc>
         <w:tc>
           <w:tcPr>
-            <w:tcW w:w="3120" w:type="dxa"/>
-            <w:vAlign w:val="center"/>
-          </w:tcPr>
-          <w:p>
-            <w:pPr>
-              <w:pStyle w:val="TableText"/>
-              <w:spacing w:before="0" w:after="0" w:line="220" w:lineRule="auto"/>
-            </w:pPr>
-            <w:r>
-              <w:rPr>
-                <w:sz w:val="17"/>
-                <w:szCs w:val="17"/>
-              </w:rPr>
-              <w:t>来源模型汇总</w:t>
+            <w:tcW w:w="2340" w:type="dxa"/>
+            <w:vAlign w:val="center"/>
+          </w:tcPr>
+          <w:p>
+            <w:pPr>
+              <w:pStyle w:val="TableText"/>
+              <w:spacing w:before="0" w:after="0" w:line="220" w:lineRule="auto"/>
+            </w:pPr>
+            <w:r>
+              <w:rPr>
+                <w:sz w:val="17"/>
+                <w:szCs w:val="17"/>
+              </w:rPr>
+              <w:t>3,518</w:t>
             </w:r>
           </w:p>
         </w:tc>
@@ -860,26 +958,45 @@
       <w:tr>
         <w:tc>
           <w:tcPr>
-            <w:tcW w:w="3120" w:type="dxa"/>
-            <w:vAlign w:val="center"/>
-          </w:tcPr>
-          <w:p>
-            <w:pPr>
-              <w:pStyle w:val="TableText"/>
-              <w:spacing w:before="0" w:after="0" w:line="220" w:lineRule="auto"/>
-            </w:pPr>
-            <w:r>
-              <w:rPr>
-                <w:sz w:val="17"/>
-                <w:szCs w:val="17"/>
-              </w:rPr>
-              <w:t>神经毒性阳性</w:t>
-            </w:r>
-          </w:p>
-        </w:tc>
-        <w:tc>
-          <w:tcPr>
-            <w:tcW w:w="3120" w:type="dxa"/>
+            <w:tcW w:w="2340" w:type="dxa"/>
+            <w:vAlign w:val="center"/>
+          </w:tcPr>
+          <w:p>
+            <w:pPr>
+              <w:pStyle w:val="TableText"/>
+              <w:spacing w:before="0" w:after="0" w:line="220" w:lineRule="auto"/>
+            </w:pPr>
+            <w:r>
+              <w:rPr>
+                <w:sz w:val="17"/>
+                <w:szCs w:val="17"/>
+              </w:rPr>
+              <w:t>NTxPred2阳性</w:t>
+            </w:r>
+          </w:p>
+        </w:tc>
+        <w:tc>
+          <w:tcPr>
+            <w:tcW w:w="2340" w:type="dxa"/>
+            <w:vAlign w:val="center"/>
+          </w:tcPr>
+          <w:p>
+            <w:pPr>
+              <w:pStyle w:val="TableText"/>
+              <w:spacing w:before="0" w:after="0" w:line="220" w:lineRule="auto"/>
+            </w:pPr>
+            <w:r>
+              <w:rPr>
+                <w:sz w:val="17"/>
+                <w:szCs w:val="17"/>
+              </w:rPr>
+              <w:t>模型阳性标签</w:t>
+            </w:r>
+          </w:p>
+        </w:tc>
+        <w:tc>
+          <w:tcPr>
+            <w:tcW w:w="2340" w:type="dxa"/>
             <w:vAlign w:val="center"/>
           </w:tcPr>
           <w:p>
@@ -898,20 +1015,20 @@
         </w:tc>
         <w:tc>
           <w:tcPr>
-            <w:tcW w:w="3120" w:type="dxa"/>
-            <w:vAlign w:val="center"/>
-          </w:tcPr>
-          <w:p>
-            <w:pPr>
-              <w:pStyle w:val="TableText"/>
-              <w:spacing w:before="0" w:after="0" w:line="220" w:lineRule="auto"/>
-            </w:pPr>
-            <w:r>
-              <w:rPr>
-                <w:sz w:val="17"/>
-                <w:szCs w:val="17"/>
-              </w:rPr>
-              <w:t>来源模型汇总</w:t>
+            <w:tcW w:w="2340" w:type="dxa"/>
+            <w:vAlign w:val="center"/>
+          </w:tcPr>
+          <w:p>
+            <w:pPr>
+              <w:pStyle w:val="TableText"/>
+              <w:spacing w:before="0" w:after="0" w:line="220" w:lineRule="auto"/>
+            </w:pPr>
+            <w:r>
+              <w:rPr>
+                <w:sz w:val="17"/>
+                <w:szCs w:val="17"/>
+              </w:rPr>
+              <w:t>3,299</w:t>
             </w:r>
           </w:p>
         </w:tc>
@@ -919,26 +1036,45 @@
       <w:tr>
         <w:tc>
           <w:tcPr>
-            <w:tcW w:w="3120" w:type="dxa"/>
-            <w:vAlign w:val="center"/>
-          </w:tcPr>
-          <w:p>
-            <w:pPr>
-              <w:pStyle w:val="TableText"/>
-              <w:spacing w:before="0" w:after="0" w:line="220" w:lineRule="auto"/>
-            </w:pPr>
-            <w:r>
-              <w:rPr>
-                <w:sz w:val="17"/>
-                <w:szCs w:val="17"/>
-              </w:rPr>
-              <w:t>Cu/Fe/Zn金属结合阳性</w:t>
-            </w:r>
-          </w:p>
-        </w:tc>
-        <w:tc>
-          <w:tcPr>
-            <w:tcW w:w="3120" w:type="dxa"/>
+            <w:tcW w:w="2340" w:type="dxa"/>
+            <w:vAlign w:val="center"/>
+          </w:tcPr>
+          <w:p>
+            <w:pPr>
+              <w:pStyle w:val="TableText"/>
+              <w:spacing w:before="0" w:after="0" w:line="220" w:lineRule="auto"/>
+            </w:pPr>
+            <w:r>
+              <w:rPr>
+                <w:sz w:val="17"/>
+                <w:szCs w:val="17"/>
+              </w:rPr>
+              <w:t>金属结合阳性</w:t>
+            </w:r>
+          </w:p>
+        </w:tc>
+        <w:tc>
+          <w:tcPr>
+            <w:tcW w:w="2340" w:type="dxa"/>
+            <w:vAlign w:val="center"/>
+          </w:tcPr>
+          <w:p>
+            <w:pPr>
+              <w:pStyle w:val="TableText"/>
+              <w:spacing w:before="0" w:after="0" w:line="220" w:lineRule="auto"/>
+            </w:pPr>
+            <w:r>
+              <w:rPr>
+                <w:sz w:val="17"/>
+                <w:szCs w:val="17"/>
+              </w:rPr>
+              <w:t>Mebipred输出≥0.50</w:t>
+            </w:r>
+          </w:p>
+        </w:tc>
+        <w:tc>
+          <w:tcPr>
+            <w:tcW w:w="2340" w:type="dxa"/>
             <w:vAlign w:val="center"/>
           </w:tcPr>
           <w:p>
@@ -957,20 +1093,20 @@
         </w:tc>
         <w:tc>
           <w:tcPr>
-            <w:tcW w:w="3120" w:type="dxa"/>
-            <w:vAlign w:val="center"/>
-          </w:tcPr>
-          <w:p>
-            <w:pPr>
-              <w:pStyle w:val="TableText"/>
-              <w:spacing w:before="0" w:after="0" w:line="220" w:lineRule="auto"/>
-            </w:pPr>
-            <w:r>
-              <w:rPr>
-                <w:sz w:val="17"/>
-                <w:szCs w:val="17"/>
-              </w:rPr>
-              <w:t>来源模型汇总</w:t>
+            <w:tcW w:w="2340" w:type="dxa"/>
+            <w:vAlign w:val="center"/>
+          </w:tcPr>
+          <w:p>
+            <w:pPr>
+              <w:pStyle w:val="TableText"/>
+              <w:spacing w:before="0" w:after="0" w:line="220" w:lineRule="auto"/>
+            </w:pPr>
+            <w:r>
+              <w:rPr>
+                <w:sz w:val="17"/>
+                <w:szCs w:val="17"/>
+              </w:rPr>
+              <w:t>逐行交接不可获得</w:t>
             </w:r>
           </w:p>
         </w:tc>
@@ -978,7 +1114,26 @@
       <w:tr>
         <w:tc>
           <w:tcPr>
-            <w:tcW w:w="3120" w:type="dxa"/>
+            <w:tcW w:w="2340" w:type="dxa"/>
+            <w:vAlign w:val="center"/>
+          </w:tcPr>
+          <w:p>
+            <w:pPr>
+              <w:pStyle w:val="TableText"/>
+              <w:spacing w:before="0" w:after="0" w:line="220" w:lineRule="auto"/>
+            </w:pPr>
+            <w:r>
+              <w:rPr>
+                <w:sz w:val="17"/>
+                <w:szCs w:val="17"/>
+              </w:rPr>
+              <w:t>CHEL优先</w:t>
+            </w:r>
+          </w:p>
+        </w:tc>
+        <w:tc>
+          <w:tcPr>
+            <w:tcW w:w="2340" w:type="dxa"/>
             <w:vAlign w:val="center"/>
           </w:tcPr>
           <w:p>
@@ -997,7 +1152,7 @@
         </w:tc>
         <w:tc>
           <w:tcPr>
-            <w:tcW w:w="3120" w:type="dxa"/>
+            <w:tcW w:w="2340" w:type="dxa"/>
             <w:vAlign w:val="center"/>
           </w:tcPr>
           <w:p>
@@ -1016,20 +1171,20 @@
         </w:tc>
         <w:tc>
           <w:tcPr>
-            <w:tcW w:w="3120" w:type="dxa"/>
-            <w:vAlign w:val="center"/>
-          </w:tcPr>
-          <w:p>
-            <w:pPr>
-              <w:pStyle w:val="TableText"/>
-              <w:spacing w:before="0" w:after="0" w:line="220" w:lineRule="auto"/>
-            </w:pPr>
-            <w:r>
-              <w:rPr>
-                <w:sz w:val="17"/>
-                <w:szCs w:val="17"/>
-              </w:rPr>
-              <w:t>来源模型汇总</w:t>
+            <w:tcW w:w="2340" w:type="dxa"/>
+            <w:vAlign w:val="center"/>
+          </w:tcPr>
+          <w:p>
+            <w:pPr>
+              <w:pStyle w:val="TableText"/>
+              <w:spacing w:before="0" w:after="0" w:line="220" w:lineRule="auto"/>
+            </w:pPr>
+            <w:r>
+              <w:rPr>
+                <w:sz w:val="17"/>
+                <w:szCs w:val="17"/>
+              </w:rPr>
+              <w:t>111</w:t>
             </w:r>
           </w:p>
         </w:tc>
@@ -1037,26 +1192,45 @@
       <w:tr>
         <w:tc>
           <w:tcPr>
-            <w:tcW w:w="3120" w:type="dxa"/>
-            <w:vAlign w:val="center"/>
-          </w:tcPr>
-          <w:p>
-            <w:pPr>
-              <w:pStyle w:val="TableText"/>
-              <w:spacing w:before="0" w:after="0" w:line="220" w:lineRule="auto"/>
-            </w:pPr>
-            <w:r>
-              <w:rPr>
-                <w:sz w:val="17"/>
-                <w:szCs w:val="17"/>
-              </w:rPr>
-              <w:t>组合筛选</w:t>
-            </w:r>
-          </w:p>
-        </w:tc>
-        <w:tc>
-          <w:tcPr>
-            <w:tcW w:w="3120" w:type="dxa"/>
+            <w:tcW w:w="2340" w:type="dxa"/>
+            <w:vAlign w:val="center"/>
+          </w:tcPr>
+          <w:p>
+            <w:pPr>
+              <w:pStyle w:val="TableText"/>
+              <w:spacing w:before="0" w:after="0" w:line="220" w:lineRule="auto"/>
+            </w:pPr>
+            <w:r>
+              <w:rPr>
+                <w:sz w:val="17"/>
+                <w:szCs w:val="17"/>
+              </w:rPr>
+              <w:t>主集合</w:t>
+            </w:r>
+          </w:p>
+        </w:tc>
+        <w:tc>
+          <w:tcPr>
+            <w:tcW w:w="2340" w:type="dxa"/>
+            <w:vAlign w:val="center"/>
+          </w:tcPr>
+          <w:p>
+            <w:pPr>
+              <w:pStyle w:val="TableText"/>
+              <w:spacing w:before="0" w:after="0" w:line="220" w:lineRule="auto"/>
+            </w:pPr>
+            <w:r>
+              <w:rPr>
+                <w:sz w:val="17"/>
+                <w:szCs w:val="17"/>
+              </w:rPr>
+              <w:t>CHEL≥0.25且FRS&lt;0.50</w:t>
+            </w:r>
+          </w:p>
+        </w:tc>
+        <w:tc>
+          <w:tcPr>
+            <w:tcW w:w="2340" w:type="dxa"/>
             <w:vAlign w:val="center"/>
           </w:tcPr>
           <w:p>
@@ -1075,20 +1249,20 @@
         </w:tc>
         <w:tc>
           <w:tcPr>
-            <w:tcW w:w="3120" w:type="dxa"/>
-            <w:vAlign w:val="center"/>
-          </w:tcPr>
-          <w:p>
-            <w:pPr>
-              <w:pStyle w:val="TableText"/>
-              <w:spacing w:before="0" w:after="0" w:line="220" w:lineRule="auto"/>
-            </w:pPr>
-            <w:r>
-              <w:rPr>
-                <w:sz w:val="17"/>
-                <w:szCs w:val="17"/>
-              </w:rPr>
-              <w:t>来源模型汇总</w:t>
+            <w:tcW w:w="2340" w:type="dxa"/>
+            <w:vAlign w:val="center"/>
+          </w:tcPr>
+          <w:p>
+            <w:pPr>
+              <w:pStyle w:val="TableText"/>
+              <w:spacing w:before="0" w:after="0" w:line="220" w:lineRule="auto"/>
+            </w:pPr>
+            <w:r>
+              <w:rPr>
+                <w:sz w:val="17"/>
+                <w:szCs w:val="17"/>
+              </w:rPr>
+              <w:t>111</w:t>
             </w:r>
           </w:p>
         </w:tc>
@@ -1096,26 +1270,45 @@
       <w:tr>
         <w:tc>
           <w:tcPr>
-            <w:tcW w:w="3120" w:type="dxa"/>
-            <w:vAlign w:val="center"/>
-          </w:tcPr>
-          <w:p>
-            <w:pPr>
-              <w:pStyle w:val="TableText"/>
-              <w:spacing w:before="0" w:after="0" w:line="220" w:lineRule="auto"/>
-            </w:pPr>
-            <w:r>
-              <w:rPr>
-                <w:sz w:val="17"/>
-                <w:szCs w:val="17"/>
-              </w:rPr>
-              <w:t>最终严格集</w:t>
-            </w:r>
-          </w:p>
-        </w:tc>
-        <w:tc>
-          <w:tcPr>
-            <w:tcW w:w="3120" w:type="dxa"/>
+            <w:tcW w:w="2340" w:type="dxa"/>
+            <w:vAlign w:val="center"/>
+          </w:tcPr>
+          <w:p>
+            <w:pPr>
+              <w:pStyle w:val="TableText"/>
+              <w:spacing w:before="0" w:after="0" w:line="220" w:lineRule="auto"/>
+            </w:pPr>
+            <w:r>
+              <w:rPr>
+                <w:sz w:val="17"/>
+                <w:szCs w:val="17"/>
+              </w:rPr>
+              <w:t>严格子集</w:t>
+            </w:r>
+          </w:p>
+        </w:tc>
+        <w:tc>
+          <w:tcPr>
+            <w:tcW w:w="2340" w:type="dxa"/>
+            <w:vAlign w:val="center"/>
+          </w:tcPr>
+          <w:p>
+            <w:pPr>
+              <w:pStyle w:val="TableText"/>
+              <w:spacing w:before="0" w:after="0" w:line="220" w:lineRule="auto"/>
+            </w:pPr>
+            <w:r>
+              <w:rPr>
+                <w:sz w:val="17"/>
+                <w:szCs w:val="17"/>
+              </w:rPr>
+              <w:t>CHEL≥0.25且FRS&lt;0.45</w:t>
+            </w:r>
+          </w:p>
+        </w:tc>
+        <w:tc>
+          <w:tcPr>
+            <w:tcW w:w="2340" w:type="dxa"/>
             <w:vAlign w:val="center"/>
           </w:tcPr>
           <w:p>
@@ -1134,7 +1327,7 @@
         </w:tc>
         <w:tc>
           <w:tcPr>
-            <w:tcW w:w="3120" w:type="dxa"/>
+            <w:tcW w:w="2340" w:type="dxa"/>
             <w:vAlign w:val="center"/>
           </w:tcPr>
           <w:p>
@@ -1160,69 +1353,11 @@
     </w:p>
     <w:p>
       <w:pPr>
-        <w:pStyle w:val="Figure"/>
-        <w:jc w:val="center"/>
-        <w:keepNext/>
-      </w:pPr>
-      <w:r>
-        <w:drawing>
-          <wp:inline distT="0" distB="0" distL="0" distR="0">
-            <wp:extent cx="6150000" cy="5261666"/>
-            <wp:effectExtent l="0" t="0" r="0" b="0"/>
-            <wp:docPr id="1" name="Figure 1" descr="汇总计算优选漏斗"/>
-            <wp:cNvGraphicFramePr>
-              <a:graphicFrameLocks noChangeAspect="1"/>
-            </wp:cNvGraphicFramePr>
-            <a:graphic>
-              <a:graphicData uri="http://schemas.openxmlformats.org/drawingml/2006/picture">
-                <pic:pic>
-                  <pic:nvPicPr>
-                    <pic:cNvPr id="0" name="prioritization_funnel.png"/>
-                    <pic:cNvPicPr/>
-                  </pic:nvPicPr>
-                  <pic:blipFill>
-                    <a:blip r:embed="rId10"/>
-                    <a:stretch>
-                      <a:fillRect/>
-                    </a:stretch>
-                  </pic:blipFill>
-                  <pic:spPr>
-                    <a:xfrm>
-                      <a:off x="0" y="0"/>
-                      <a:ext cx="6150000" cy="5261666"/>
-                    </a:xfrm>
-                    <a:prstGeom prst="rect">
-                      <a:avLst/>
-                    </a:prstGeom>
-                  </pic:spPr>
-                </pic:pic>
-              </a:graphicData>
-            </a:graphic>
-          </wp:inline>
-        </w:drawing>
-      </w:r>
-    </w:p>
-    <w:p>
-      <w:pPr>
-        <w:pStyle w:val="Normal"/>
-      </w:pPr>
-      <w:r>
-        <w:rPr>
-          <w:b/>
-        </w:rPr>
-        <w:t>图1.</w:t>
-      </w:r>
-      <w:r>
-        <w:t xml:space="preserve"> 汇总计算优选漏斗。该图汇总来源计数，不代表参与者流程或独立生物学重复。</w:t>
-      </w:r>
-    </w:p>
-    <w:p>
-      <w:pPr>
         <w:pStyle w:val="Heading3"/>
         <w:keepNext/>
       </w:pPr>
       <w:r>
-        <w:t>外部12条序列记录</w:t>
+        <w:t>12条序列表与对接评分</w:t>
       </w:r>
     </w:p>
     <w:p>
@@ -1230,32 +1365,32 @@
         <w:pStyle w:val="Normal"/>
       </w:pPr>
       <w:r>
-        <w:t>外部记录列出12条互不重复的肽。其针对AChE的来源报告Vina均值范围为−9.60至−8.25 kcal/mol。在该记录内部，FLLHTTR排序第一，HVLLLRQCA排序最后。序列组成经独立重算，但对接构象和分数未被独立复现。</w:t>
-      </w:r>
-    </w:p>
-    <w:p>
-      <w:pPr>
-        <w:pStyle w:val="Normal"/>
+        <w:t>另一张表包含12条互不重复的7–9 aa肽。其中11条含组氨酸，6条含半胱氨酸，每条均含Arg或Lys。Vina均值范围为−9.60至−8.25 kcal/mol（表2）。在现有评分表内，FLLHTTR排名第一，HVLLLRQCA排名最后。序列组成可以重算，但无法建立对接执行及这些序列与汇总12条或8条集合之间的关系。</w:t>
+      </w:r>
+    </w:p>
+    <w:p>
+      <w:pPr>
+        <w:pStyle w:val="Caption"/>
       </w:pPr>
       <w:r>
         <w:rPr>
           <w:b/>
         </w:rPr>
-        <w:t>表2. 外部序列记录及来源报告AChE对接汇总。</w:t>
+        <w:t>表2. 12条序列及现有AChE对接评分。</w:t>
       </w:r>
     </w:p>
     <w:tbl>
       <w:tblPr>
-        <w:tblStyle w:val="TableGrid"/>
+        <w:tblStyle w:val="ThreeLineTable"/>
         <w:tblW w:w="5000" w:type="pct"/>
         <w:tblLayout w:type="fixed"/>
         <w:tblBorders>
-          <w:top w:val="single" w:sz="4" w:space="0" w:color="9AA6B2"/>
-          <w:left w:val="single" w:sz="4" w:space="0" w:color="9AA6B2"/>
-          <w:bottom w:val="single" w:sz="4" w:space="0" w:color="9AA6B2"/>
-          <w:right w:val="single" w:sz="4" w:space="0" w:color="9AA6B2"/>
-          <w:insideH w:val="single" w:sz="4" w:space="0" w:color="9AA6B2"/>
-          <w:insideV w:val="single" w:sz="4" w:space="0" w:color="9AA6B2"/>
+          <w:top w:val="single" w:sz="12" w:space="0" w:color="000000"/>
+          <w:left w:val="nil"/>
+          <w:bottom w:val="single" w:sz="12" w:space="0" w:color="000000"/>
+          <w:right w:val="nil"/>
+          <w:insideH w:val="nil"/>
+          <w:insideV w:val="nil"/>
         </w:tblBorders>
         <w:tblCellMar>
           <w:top w:w="70" w:type="dxa"/>
@@ -1278,7 +1413,9 @@
         <w:tc>
           <w:tcPr>
             <w:tcW w:w="1872" w:type="dxa"/>
-            <w:shd w:val="clear" w:color="auto" w:fill="DCE6F1"/>
+            <w:tcBorders>
+              <w:bottom w:val="single" w:sz="8" w:space="0" w:color="000000"/>
+            </w:tcBorders>
             <w:vAlign w:val="center"/>
           </w:tcPr>
           <w:p>
@@ -1298,7 +1435,9 @@
         <w:tc>
           <w:tcPr>
             <w:tcW w:w="1872" w:type="dxa"/>
-            <w:shd w:val="clear" w:color="auto" w:fill="DCE6F1"/>
+            <w:tcBorders>
+              <w:bottom w:val="single" w:sz="8" w:space="0" w:color="000000"/>
+            </w:tcBorders>
             <w:vAlign w:val="center"/>
           </w:tcPr>
           <w:p>
@@ -1318,7 +1457,9 @@
         <w:tc>
           <w:tcPr>
             <w:tcW w:w="1872" w:type="dxa"/>
-            <w:shd w:val="clear" w:color="auto" w:fill="DCE6F1"/>
+            <w:tcBorders>
+              <w:bottom w:val="single" w:sz="8" w:space="0" w:color="000000"/>
+            </w:tcBorders>
             <w:vAlign w:val="center"/>
           </w:tcPr>
           <w:p>
@@ -1338,40 +1479,44 @@
         <w:tc>
           <w:tcPr>
             <w:tcW w:w="1872" w:type="dxa"/>
-            <w:shd w:val="clear" w:color="auto" w:fill="DCE6F1"/>
-            <w:vAlign w:val="center"/>
-          </w:tcPr>
-          <w:p>
-            <w:pPr>
-              <w:pStyle w:val="TableText"/>
-              <w:spacing w:before="0" w:after="0" w:line="220" w:lineRule="auto"/>
-            </w:pPr>
-            <w:r>
-              <w:rPr>
-                <w:sz w:val="17"/>
-                <w:szCs w:val="17"/>
-              </w:rPr>
-              <w:t>来源报告均值（kcal/mol）</w:t>
-            </w:r>
-          </w:p>
-        </w:tc>
-        <w:tc>
-          <w:tcPr>
-            <w:tcW w:w="1872" w:type="dxa"/>
-            <w:shd w:val="clear" w:color="auto" w:fill="DCE6F1"/>
-            <w:vAlign w:val="center"/>
-          </w:tcPr>
-          <w:p>
-            <w:pPr>
-              <w:pStyle w:val="TableText"/>
-              <w:spacing w:before="0" w:after="0" w:line="220" w:lineRule="auto"/>
-            </w:pPr>
-            <w:r>
-              <w:rPr>
-                <w:sz w:val="17"/>
-                <w:szCs w:val="17"/>
-              </w:rPr>
-              <w:t>来源报告SD</w:t>
+            <w:tcBorders>
+              <w:bottom w:val="single" w:sz="8" w:space="0" w:color="000000"/>
+            </w:tcBorders>
+            <w:vAlign w:val="center"/>
+          </w:tcPr>
+          <w:p>
+            <w:pPr>
+              <w:pStyle w:val="TableText"/>
+              <w:spacing w:before="0" w:after="0" w:line="220" w:lineRule="auto"/>
+            </w:pPr>
+            <w:r>
+              <w:rPr>
+                <w:sz w:val="17"/>
+                <w:szCs w:val="17"/>
+              </w:rPr>
+              <w:t>平均评分（kcal/mol）</w:t>
+            </w:r>
+          </w:p>
+        </w:tc>
+        <w:tc>
+          <w:tcPr>
+            <w:tcW w:w="1872" w:type="dxa"/>
+            <w:tcBorders>
+              <w:bottom w:val="single" w:sz="8" w:space="0" w:color="000000"/>
+            </w:tcBorders>
+            <w:vAlign w:val="center"/>
+          </w:tcPr>
+          <w:p>
+            <w:pPr>
+              <w:pStyle w:val="TableText"/>
+              <w:spacing w:before="0" w:after="0" w:line="220" w:lineRule="auto"/>
+            </w:pPr>
+            <w:r>
+              <w:rPr>
+                <w:sz w:val="17"/>
+                <w:szCs w:val="17"/>
+              </w:rPr>
+              <w:t>SD</w:t>
             </w:r>
           </w:p>
         </w:tc>
@@ -1508,64 +1653,64 @@
                 <w:sz w:val="17"/>
                 <w:szCs w:val="17"/>
               </w:rPr>
-              <w:t>KNGIYHLK</w:t>
-            </w:r>
-          </w:p>
-        </w:tc>
-        <w:tc>
-          <w:tcPr>
-            <w:tcW w:w="1872" w:type="dxa"/>
-            <w:vAlign w:val="center"/>
-          </w:tcPr>
-          <w:p>
-            <w:pPr>
-              <w:pStyle w:val="TableText"/>
-              <w:spacing w:before="0" w:after="0" w:line="220" w:lineRule="auto"/>
-            </w:pPr>
-            <w:r>
-              <w:rPr>
-                <w:sz w:val="17"/>
-                <w:szCs w:val="17"/>
-              </w:rPr>
-              <w:t>8</w:t>
-            </w:r>
-          </w:p>
-        </w:tc>
-        <w:tc>
-          <w:tcPr>
-            <w:tcW w:w="1872" w:type="dxa"/>
-            <w:vAlign w:val="center"/>
-          </w:tcPr>
-          <w:p>
-            <w:pPr>
-              <w:pStyle w:val="TableText"/>
-              <w:spacing w:before="0" w:after="0" w:line="220" w:lineRule="auto"/>
-            </w:pPr>
-            <w:r>
-              <w:rPr>
-                <w:sz w:val="17"/>
-                <w:szCs w:val="17"/>
-              </w:rPr>
-              <w:t>−9.42</w:t>
-            </w:r>
-          </w:p>
-        </w:tc>
-        <w:tc>
-          <w:tcPr>
-            <w:tcW w:w="1872" w:type="dxa"/>
-            <w:vAlign w:val="center"/>
-          </w:tcPr>
-          <w:p>
-            <w:pPr>
-              <w:pStyle w:val="TableText"/>
-              <w:spacing w:before="0" w:after="0" w:line="220" w:lineRule="auto"/>
-            </w:pPr>
-            <w:r>
-              <w:rPr>
-                <w:sz w:val="17"/>
-                <w:szCs w:val="17"/>
-              </w:rPr>
-              <w:t>0.06</w:t>
+              <w:t>YLSLLQR</w:t>
+            </w:r>
+          </w:p>
+        </w:tc>
+        <w:tc>
+          <w:tcPr>
+            <w:tcW w:w="1872" w:type="dxa"/>
+            <w:vAlign w:val="center"/>
+          </w:tcPr>
+          <w:p>
+            <w:pPr>
+              <w:pStyle w:val="TableText"/>
+              <w:spacing w:before="0" w:after="0" w:line="220" w:lineRule="auto"/>
+            </w:pPr>
+            <w:r>
+              <w:rPr>
+                <w:sz w:val="17"/>
+                <w:szCs w:val="17"/>
+              </w:rPr>
+              <w:t>7</w:t>
+            </w:r>
+          </w:p>
+        </w:tc>
+        <w:tc>
+          <w:tcPr>
+            <w:tcW w:w="1872" w:type="dxa"/>
+            <w:vAlign w:val="center"/>
+          </w:tcPr>
+          <w:p>
+            <w:pPr>
+              <w:pStyle w:val="TableText"/>
+              <w:spacing w:before="0" w:after="0" w:line="220" w:lineRule="auto"/>
+            </w:pPr>
+            <w:r>
+              <w:rPr>
+                <w:sz w:val="17"/>
+                <w:szCs w:val="17"/>
+              </w:rPr>
+              <w:t>−9.49</w:t>
+            </w:r>
+          </w:p>
+        </w:tc>
+        <w:tc>
+          <w:tcPr>
+            <w:tcW w:w="1872" w:type="dxa"/>
+            <w:vAlign w:val="center"/>
+          </w:tcPr>
+          <w:p>
+            <w:pPr>
+              <w:pStyle w:val="TableText"/>
+              <w:spacing w:before="0" w:after="0" w:line="220" w:lineRule="auto"/>
+            </w:pPr>
+            <w:r>
+              <w:rPr>
+                <w:sz w:val="17"/>
+                <w:szCs w:val="17"/>
+              </w:rPr>
+              <w:t>0.05</w:t>
             </w:r>
           </w:p>
         </w:tc>
@@ -1605,7 +1750,7 @@
                 <w:sz w:val="17"/>
                 <w:szCs w:val="17"/>
               </w:rPr>
-              <w:t>KNAIRLQ</w:t>
+              <w:t>ALLLHRC</w:t>
             </w:r>
           </w:p>
         </w:tc>
@@ -1643,26 +1788,26 @@
                 <w:sz w:val="17"/>
                 <w:szCs w:val="17"/>
               </w:rPr>
-              <w:t>−9.31</w:t>
-            </w:r>
-          </w:p>
-        </w:tc>
-        <w:tc>
-          <w:tcPr>
-            <w:tcW w:w="1872" w:type="dxa"/>
-            <w:vAlign w:val="center"/>
-          </w:tcPr>
-          <w:p>
-            <w:pPr>
-              <w:pStyle w:val="TableText"/>
-              <w:spacing w:before="0" w:after="0" w:line="220" w:lineRule="auto"/>
-            </w:pPr>
-            <w:r>
-              <w:rPr>
-                <w:sz w:val="17"/>
-                <w:szCs w:val="17"/>
-              </w:rPr>
-              <w:t>0.05</w:t>
+              <w:t>−9.29</w:t>
+            </w:r>
+          </w:p>
+        </w:tc>
+        <w:tc>
+          <w:tcPr>
+            <w:tcW w:w="1872" w:type="dxa"/>
+            <w:vAlign w:val="center"/>
+          </w:tcPr>
+          <w:p>
+            <w:pPr>
+              <w:pStyle w:val="TableText"/>
+              <w:spacing w:before="0" w:after="0" w:line="220" w:lineRule="auto"/>
+            </w:pPr>
+            <w:r>
+              <w:rPr>
+                <w:sz w:val="17"/>
+                <w:szCs w:val="17"/>
+              </w:rPr>
+              <w:t>0.11</w:t>
             </w:r>
           </w:p>
         </w:tc>
@@ -1702,7 +1847,7 @@
                 <w:sz w:val="17"/>
                 <w:szCs w:val="17"/>
               </w:rPr>
-              <w:t>NRPPHPPY</w:t>
+              <w:t>FCLHLQLR</w:t>
             </w:r>
           </w:p>
         </w:tc>
@@ -1740,7 +1885,7 @@
                 <w:sz w:val="17"/>
                 <w:szCs w:val="17"/>
               </w:rPr>
-              <w:t>−9.18</w:t>
+              <w:t>−9.27</w:t>
             </w:r>
           </w:p>
         </w:tc>
@@ -1799,7 +1944,7 @@
                 <w:sz w:val="17"/>
                 <w:szCs w:val="17"/>
               </w:rPr>
-              <w:t>QMMKQAQK</w:t>
+              <w:t>YHHLLCRR</w:t>
             </w:r>
           </w:p>
         </w:tc>
@@ -1837,7 +1982,7 @@
                 <w:sz w:val="17"/>
                 <w:szCs w:val="17"/>
               </w:rPr>
-              <w:t>−9.05</w:t>
+              <w:t>−9.03</w:t>
             </w:r>
           </w:p>
         </w:tc>
@@ -1896,64 +2041,64 @@
                 <w:sz w:val="17"/>
                 <w:szCs w:val="17"/>
               </w:rPr>
-              <w:t>WNMSKYYK</w:t>
-            </w:r>
-          </w:p>
-        </w:tc>
-        <w:tc>
-          <w:tcPr>
-            <w:tcW w:w="1872" w:type="dxa"/>
-            <w:vAlign w:val="center"/>
-          </w:tcPr>
-          <w:p>
-            <w:pPr>
-              <w:pStyle w:val="TableText"/>
-              <w:spacing w:before="0" w:after="0" w:line="220" w:lineRule="auto"/>
-            </w:pPr>
-            <w:r>
-              <w:rPr>
-                <w:sz w:val="17"/>
-                <w:szCs w:val="17"/>
-              </w:rPr>
-              <w:t>8</w:t>
-            </w:r>
-          </w:p>
-        </w:tc>
-        <w:tc>
-          <w:tcPr>
-            <w:tcW w:w="1872" w:type="dxa"/>
-            <w:vAlign w:val="center"/>
-          </w:tcPr>
-          <w:p>
-            <w:pPr>
-              <w:pStyle w:val="TableText"/>
-              <w:spacing w:before="0" w:after="0" w:line="220" w:lineRule="auto"/>
-            </w:pPr>
-            <w:r>
-              <w:rPr>
-                <w:sz w:val="17"/>
-                <w:szCs w:val="17"/>
-              </w:rPr>
-              <w:t>−8.94</w:t>
-            </w:r>
-          </w:p>
-        </w:tc>
-        <w:tc>
-          <w:tcPr>
-            <w:tcW w:w="1872" w:type="dxa"/>
-            <w:vAlign w:val="center"/>
-          </w:tcPr>
-          <w:p>
-            <w:pPr>
-              <w:pStyle w:val="TableText"/>
-              <w:spacing w:before="0" w:after="0" w:line="220" w:lineRule="auto"/>
-            </w:pPr>
-            <w:r>
-              <w:rPr>
-                <w:sz w:val="17"/>
-                <w:szCs w:val="17"/>
-              </w:rPr>
-              <w:t>0.04</w:t>
+              <w:t>LLHLPKRTT</w:t>
+            </w:r>
+          </w:p>
+        </w:tc>
+        <w:tc>
+          <w:tcPr>
+            <w:tcW w:w="1872" w:type="dxa"/>
+            <w:vAlign w:val="center"/>
+          </w:tcPr>
+          <w:p>
+            <w:pPr>
+              <w:pStyle w:val="TableText"/>
+              <w:spacing w:before="0" w:after="0" w:line="220" w:lineRule="auto"/>
+            </w:pPr>
+            <w:r>
+              <w:rPr>
+                <w:sz w:val="17"/>
+                <w:szCs w:val="17"/>
+              </w:rPr>
+              <w:t>9</w:t>
+            </w:r>
+          </w:p>
+        </w:tc>
+        <w:tc>
+          <w:tcPr>
+            <w:tcW w:w="1872" w:type="dxa"/>
+            <w:vAlign w:val="center"/>
+          </w:tcPr>
+          <w:p>
+            <w:pPr>
+              <w:pStyle w:val="TableText"/>
+              <w:spacing w:before="0" w:after="0" w:line="220" w:lineRule="auto"/>
+            </w:pPr>
+            <w:r>
+              <w:rPr>
+                <w:sz w:val="17"/>
+                <w:szCs w:val="17"/>
+              </w:rPr>
+              <w:t>−9.01</w:t>
+            </w:r>
+          </w:p>
+        </w:tc>
+        <w:tc>
+          <w:tcPr>
+            <w:tcW w:w="1872" w:type="dxa"/>
+            <w:vAlign w:val="center"/>
+          </w:tcPr>
+          <w:p>
+            <w:pPr>
+              <w:pStyle w:val="TableText"/>
+              <w:spacing w:before="0" w:after="0" w:line="220" w:lineRule="auto"/>
+            </w:pPr>
+            <w:r>
+              <w:rPr>
+                <w:sz w:val="17"/>
+                <w:szCs w:val="17"/>
+              </w:rPr>
+              <w:t>0.06</w:t>
             </w:r>
           </w:p>
         </w:tc>
@@ -1993,45 +2138,45 @@
                 <w:sz w:val="17"/>
                 <w:szCs w:val="17"/>
               </w:rPr>
-              <w:t>YPWINHPQ</w:t>
-            </w:r>
-          </w:p>
-        </w:tc>
-        <w:tc>
-          <w:tcPr>
-            <w:tcW w:w="1872" w:type="dxa"/>
-            <w:vAlign w:val="center"/>
-          </w:tcPr>
-          <w:p>
-            <w:pPr>
-              <w:pStyle w:val="TableText"/>
-              <w:spacing w:before="0" w:after="0" w:line="220" w:lineRule="auto"/>
-            </w:pPr>
-            <w:r>
-              <w:rPr>
-                <w:sz w:val="17"/>
-                <w:szCs w:val="17"/>
-              </w:rPr>
-              <w:t>8</w:t>
-            </w:r>
-          </w:p>
-        </w:tc>
-        <w:tc>
-          <w:tcPr>
-            <w:tcW w:w="1872" w:type="dxa"/>
-            <w:vAlign w:val="center"/>
-          </w:tcPr>
-          <w:p>
-            <w:pPr>
-              <w:pStyle w:val="TableText"/>
-              <w:spacing w:before="0" w:after="0" w:line="220" w:lineRule="auto"/>
-            </w:pPr>
-            <w:r>
-              <w:rPr>
-                <w:sz w:val="17"/>
-                <w:szCs w:val="17"/>
-              </w:rPr>
-              <w:t>−8.83</w:t>
+              <w:t>LLHPLRL</w:t>
+            </w:r>
+          </w:p>
+        </w:tc>
+        <w:tc>
+          <w:tcPr>
+            <w:tcW w:w="1872" w:type="dxa"/>
+            <w:vAlign w:val="center"/>
+          </w:tcPr>
+          <w:p>
+            <w:pPr>
+              <w:pStyle w:val="TableText"/>
+              <w:spacing w:before="0" w:after="0" w:line="220" w:lineRule="auto"/>
+            </w:pPr>
+            <w:r>
+              <w:rPr>
+                <w:sz w:val="17"/>
+                <w:szCs w:val="17"/>
+              </w:rPr>
+              <w:t>7</w:t>
+            </w:r>
+          </w:p>
+        </w:tc>
+        <w:tc>
+          <w:tcPr>
+            <w:tcW w:w="1872" w:type="dxa"/>
+            <w:vAlign w:val="center"/>
+          </w:tcPr>
+          <w:p>
+            <w:pPr>
+              <w:pStyle w:val="TableText"/>
+              <w:spacing w:before="0" w:after="0" w:line="220" w:lineRule="auto"/>
+            </w:pPr>
+            <w:r>
+              <w:rPr>
+                <w:sz w:val="17"/>
+                <w:szCs w:val="17"/>
+              </w:rPr>
+              <w:t>−8.94</w:t>
             </w:r>
           </w:p>
         </w:tc>
@@ -2090,64 +2235,64 @@
                 <w:sz w:val="17"/>
                 <w:szCs w:val="17"/>
               </w:rPr>
-              <w:t>WVAHKNY</w:t>
-            </w:r>
-          </w:p>
-        </w:tc>
-        <w:tc>
-          <w:tcPr>
-            <w:tcW w:w="1872" w:type="dxa"/>
-            <w:vAlign w:val="center"/>
-          </w:tcPr>
-          <w:p>
-            <w:pPr>
-              <w:pStyle w:val="TableText"/>
-              <w:spacing w:before="0" w:after="0" w:line="220" w:lineRule="auto"/>
-            </w:pPr>
-            <w:r>
-              <w:rPr>
-                <w:sz w:val="17"/>
-                <w:szCs w:val="17"/>
-              </w:rPr>
-              <w:t>7</w:t>
-            </w:r>
-          </w:p>
-        </w:tc>
-        <w:tc>
-          <w:tcPr>
-            <w:tcW w:w="1872" w:type="dxa"/>
-            <w:vAlign w:val="center"/>
-          </w:tcPr>
-          <w:p>
-            <w:pPr>
-              <w:pStyle w:val="TableText"/>
-              <w:spacing w:before="0" w:after="0" w:line="220" w:lineRule="auto"/>
-            </w:pPr>
-            <w:r>
-              <w:rPr>
-                <w:sz w:val="17"/>
-                <w:szCs w:val="17"/>
-              </w:rPr>
-              <w:t>−8.71</w:t>
-            </w:r>
-          </w:p>
-        </w:tc>
-        <w:tc>
-          <w:tcPr>
-            <w:tcW w:w="1872" w:type="dxa"/>
-            <w:vAlign w:val="center"/>
-          </w:tcPr>
-          <w:p>
-            <w:pPr>
-              <w:pStyle w:val="TableText"/>
-              <w:spacing w:before="0" w:after="0" w:line="220" w:lineRule="auto"/>
-            </w:pPr>
-            <w:r>
-              <w:rPr>
-                <w:sz w:val="17"/>
-                <w:szCs w:val="17"/>
-              </w:rPr>
-              <w:t>0.06</w:t>
+              <w:t>WLLVHLKK</w:t>
+            </w:r>
+          </w:p>
+        </w:tc>
+        <w:tc>
+          <w:tcPr>
+            <w:tcW w:w="1872" w:type="dxa"/>
+            <w:vAlign w:val="center"/>
+          </w:tcPr>
+          <w:p>
+            <w:pPr>
+              <w:pStyle w:val="TableText"/>
+              <w:spacing w:before="0" w:after="0" w:line="220" w:lineRule="auto"/>
+            </w:pPr>
+            <w:r>
+              <w:rPr>
+                <w:sz w:val="17"/>
+                <w:szCs w:val="17"/>
+              </w:rPr>
+              <w:t>8</w:t>
+            </w:r>
+          </w:p>
+        </w:tc>
+        <w:tc>
+          <w:tcPr>
+            <w:tcW w:w="1872" w:type="dxa"/>
+            <w:vAlign w:val="center"/>
+          </w:tcPr>
+          <w:p>
+            <w:pPr>
+              <w:pStyle w:val="TableText"/>
+              <w:spacing w:before="0" w:after="0" w:line="220" w:lineRule="auto"/>
+            </w:pPr>
+            <w:r>
+              <w:rPr>
+                <w:sz w:val="17"/>
+                <w:szCs w:val="17"/>
+              </w:rPr>
+              <w:t>−8.94</w:t>
+            </w:r>
+          </w:p>
+        </w:tc>
+        <w:tc>
+          <w:tcPr>
+            <w:tcW w:w="1872" w:type="dxa"/>
+            <w:vAlign w:val="center"/>
+          </w:tcPr>
+          <w:p>
+            <w:pPr>
+              <w:pStyle w:val="TableText"/>
+              <w:spacing w:before="0" w:after="0" w:line="220" w:lineRule="auto"/>
+            </w:pPr>
+            <w:r>
+              <w:rPr>
+                <w:sz w:val="17"/>
+                <w:szCs w:val="17"/>
+              </w:rPr>
+              <w:t>0.04</w:t>
             </w:r>
           </w:p>
         </w:tc>
@@ -2187,64 +2332,64 @@
                 <w:sz w:val="17"/>
                 <w:szCs w:val="17"/>
               </w:rPr>
-              <w:t>YPIVIHPN</w:t>
-            </w:r>
-          </w:p>
-        </w:tc>
-        <w:tc>
-          <w:tcPr>
-            <w:tcW w:w="1872" w:type="dxa"/>
-            <w:vAlign w:val="center"/>
-          </w:tcPr>
-          <w:p>
-            <w:pPr>
-              <w:pStyle w:val="TableText"/>
-              <w:spacing w:before="0" w:after="0" w:line="220" w:lineRule="auto"/>
-            </w:pPr>
-            <w:r>
-              <w:rPr>
-                <w:sz w:val="17"/>
-                <w:szCs w:val="17"/>
-              </w:rPr>
-              <w:t>8</w:t>
-            </w:r>
-          </w:p>
-        </w:tc>
-        <w:tc>
-          <w:tcPr>
-            <w:tcW w:w="1872" w:type="dxa"/>
-            <w:vAlign w:val="center"/>
-          </w:tcPr>
-          <w:p>
-            <w:pPr>
-              <w:pStyle w:val="TableText"/>
-              <w:spacing w:before="0" w:after="0" w:line="220" w:lineRule="auto"/>
-            </w:pPr>
-            <w:r>
-              <w:rPr>
-                <w:sz w:val="17"/>
-                <w:szCs w:val="17"/>
-              </w:rPr>
-              <w:t>−8.58</w:t>
-            </w:r>
-          </w:p>
-        </w:tc>
-        <w:tc>
-          <w:tcPr>
-            <w:tcW w:w="1872" w:type="dxa"/>
-            <w:vAlign w:val="center"/>
-          </w:tcPr>
-          <w:p>
-            <w:pPr>
-              <w:pStyle w:val="TableText"/>
-              <w:spacing w:before="0" w:after="0" w:line="220" w:lineRule="auto"/>
-            </w:pPr>
-            <w:r>
-              <w:rPr>
-                <w:sz w:val="17"/>
-                <w:szCs w:val="17"/>
-              </w:rPr>
-              <w:t>0.11</w:t>
+              <w:t>LLHPLRC</w:t>
+            </w:r>
+          </w:p>
+        </w:tc>
+        <w:tc>
+          <w:tcPr>
+            <w:tcW w:w="1872" w:type="dxa"/>
+            <w:vAlign w:val="center"/>
+          </w:tcPr>
+          <w:p>
+            <w:pPr>
+              <w:pStyle w:val="TableText"/>
+              <w:spacing w:before="0" w:after="0" w:line="220" w:lineRule="auto"/>
+            </w:pPr>
+            <w:r>
+              <w:rPr>
+                <w:sz w:val="17"/>
+                <w:szCs w:val="17"/>
+              </w:rPr>
+              <w:t>7</w:t>
+            </w:r>
+          </w:p>
+        </w:tc>
+        <w:tc>
+          <w:tcPr>
+            <w:tcW w:w="1872" w:type="dxa"/>
+            <w:vAlign w:val="center"/>
+          </w:tcPr>
+          <w:p>
+            <w:pPr>
+              <w:pStyle w:val="TableText"/>
+              <w:spacing w:before="0" w:after="0" w:line="220" w:lineRule="auto"/>
+            </w:pPr>
+            <w:r>
+              <w:rPr>
+                <w:sz w:val="17"/>
+                <w:szCs w:val="17"/>
+              </w:rPr>
+              <w:t>−8.91</w:t>
+            </w:r>
+          </w:p>
+        </w:tc>
+        <w:tc>
+          <w:tcPr>
+            <w:tcW w:w="1872" w:type="dxa"/>
+            <w:vAlign w:val="center"/>
+          </w:tcPr>
+          <w:p>
+            <w:pPr>
+              <w:pStyle w:val="TableText"/>
+              <w:spacing w:before="0" w:after="0" w:line="220" w:lineRule="auto"/>
+            </w:pPr>
+            <w:r>
+              <w:rPr>
+                <w:sz w:val="17"/>
+                <w:szCs w:val="17"/>
+              </w:rPr>
+              <w:t>0.08</w:t>
             </w:r>
           </w:p>
         </w:tc>
@@ -2284,64 +2429,64 @@
                 <w:sz w:val="17"/>
                 <w:szCs w:val="17"/>
               </w:rPr>
-              <w:t>YDRNWNNK</w:t>
-            </w:r>
-          </w:p>
-        </w:tc>
-        <w:tc>
-          <w:tcPr>
-            <w:tcW w:w="1872" w:type="dxa"/>
-            <w:vAlign w:val="center"/>
-          </w:tcPr>
-          <w:p>
-            <w:pPr>
-              <w:pStyle w:val="TableText"/>
-              <w:spacing w:before="0" w:after="0" w:line="220" w:lineRule="auto"/>
-            </w:pPr>
-            <w:r>
-              <w:rPr>
-                <w:sz w:val="17"/>
-                <w:szCs w:val="17"/>
-              </w:rPr>
-              <w:t>8</w:t>
-            </w:r>
-          </w:p>
-        </w:tc>
-        <w:tc>
-          <w:tcPr>
-            <w:tcW w:w="1872" w:type="dxa"/>
-            <w:vAlign w:val="center"/>
-          </w:tcPr>
-          <w:p>
-            <w:pPr>
-              <w:pStyle w:val="TableText"/>
-              <w:spacing w:before="0" w:after="0" w:line="220" w:lineRule="auto"/>
-            </w:pPr>
-            <w:r>
-              <w:rPr>
-                <w:sz w:val="17"/>
-                <w:szCs w:val="17"/>
-              </w:rPr>
-              <w:t>−8.46</w:t>
-            </w:r>
-          </w:p>
-        </w:tc>
-        <w:tc>
-          <w:tcPr>
-            <w:tcW w:w="1872" w:type="dxa"/>
-            <w:vAlign w:val="center"/>
-          </w:tcPr>
-          <w:p>
-            <w:pPr>
-              <w:pStyle w:val="TableText"/>
-              <w:spacing w:before="0" w:after="0" w:line="220" w:lineRule="auto"/>
-            </w:pPr>
-            <w:r>
-              <w:rPr>
-                <w:sz w:val="17"/>
-                <w:szCs w:val="17"/>
-              </w:rPr>
-              <w:t>0.08</w:t>
+              <w:t>HLLTLKKHV</w:t>
+            </w:r>
+          </w:p>
+        </w:tc>
+        <w:tc>
+          <w:tcPr>
+            <w:tcW w:w="1872" w:type="dxa"/>
+            <w:vAlign w:val="center"/>
+          </w:tcPr>
+          <w:p>
+            <w:pPr>
+              <w:pStyle w:val="TableText"/>
+              <w:spacing w:before="0" w:after="0" w:line="220" w:lineRule="auto"/>
+            </w:pPr>
+            <w:r>
+              <w:rPr>
+                <w:sz w:val="17"/>
+                <w:szCs w:val="17"/>
+              </w:rPr>
+              <w:t>9</w:t>
+            </w:r>
+          </w:p>
+        </w:tc>
+        <w:tc>
+          <w:tcPr>
+            <w:tcW w:w="1872" w:type="dxa"/>
+            <w:vAlign w:val="center"/>
+          </w:tcPr>
+          <w:p>
+            <w:pPr>
+              <w:pStyle w:val="TableText"/>
+              <w:spacing w:before="0" w:after="0" w:line="220" w:lineRule="auto"/>
+            </w:pPr>
+            <w:r>
+              <w:rPr>
+                <w:sz w:val="17"/>
+                <w:szCs w:val="17"/>
+              </w:rPr>
+              <w:t>−8.88</w:t>
+            </w:r>
+          </w:p>
+        </w:tc>
+        <w:tc>
+          <w:tcPr>
+            <w:tcW w:w="1872" w:type="dxa"/>
+            <w:vAlign w:val="center"/>
+          </w:tcPr>
+          <w:p>
+            <w:pPr>
+              <w:pStyle w:val="TableText"/>
+              <w:spacing w:before="0" w:after="0" w:line="220" w:lineRule="auto"/>
+            </w:pPr>
+            <w:r>
+              <w:rPr>
+                <w:sz w:val="17"/>
+                <w:szCs w:val="17"/>
+              </w:rPr>
+              <w:t>0.05</w:t>
             </w:r>
           </w:p>
         </w:tc>
@@ -2381,64 +2526,64 @@
                 <w:sz w:val="17"/>
                 <w:szCs w:val="17"/>
               </w:rPr>
-              <w:t>RKQIKRYL</w:t>
-            </w:r>
-          </w:p>
-        </w:tc>
-        <w:tc>
-          <w:tcPr>
-            <w:tcW w:w="1872" w:type="dxa"/>
-            <w:vAlign w:val="center"/>
-          </w:tcPr>
-          <w:p>
-            <w:pPr>
-              <w:pStyle w:val="TableText"/>
-              <w:spacing w:before="0" w:after="0" w:line="220" w:lineRule="auto"/>
-            </w:pPr>
-            <w:r>
-              <w:rPr>
-                <w:sz w:val="17"/>
-                <w:szCs w:val="17"/>
-              </w:rPr>
-              <w:t>8</w:t>
-            </w:r>
-          </w:p>
-        </w:tc>
-        <w:tc>
-          <w:tcPr>
-            <w:tcW w:w="1872" w:type="dxa"/>
-            <w:vAlign w:val="center"/>
-          </w:tcPr>
-          <w:p>
-            <w:pPr>
-              <w:pStyle w:val="TableText"/>
-              <w:spacing w:before="0" w:after="0" w:line="220" w:lineRule="auto"/>
-            </w:pPr>
-            <w:r>
-              <w:rPr>
-                <w:sz w:val="17"/>
-                <w:szCs w:val="17"/>
-              </w:rPr>
-              <w:t>−8.34</w:t>
-            </w:r>
-          </w:p>
-        </w:tc>
-        <w:tc>
-          <w:tcPr>
-            <w:tcW w:w="1872" w:type="dxa"/>
-            <w:vAlign w:val="center"/>
-          </w:tcPr>
-          <w:p>
-            <w:pPr>
-              <w:pStyle w:val="TableText"/>
-              <w:spacing w:before="0" w:after="0" w:line="220" w:lineRule="auto"/>
-            </w:pPr>
-            <w:r>
-              <w:rPr>
-                <w:sz w:val="17"/>
-                <w:szCs w:val="17"/>
-              </w:rPr>
-              <w:t>0.05</w:t>
+              <w:t>HLPLLHRCC</w:t>
+            </w:r>
+          </w:p>
+        </w:tc>
+        <w:tc>
+          <w:tcPr>
+            <w:tcW w:w="1872" w:type="dxa"/>
+            <w:vAlign w:val="center"/>
+          </w:tcPr>
+          <w:p>
+            <w:pPr>
+              <w:pStyle w:val="TableText"/>
+              <w:spacing w:before="0" w:after="0" w:line="220" w:lineRule="auto"/>
+            </w:pPr>
+            <w:r>
+              <w:rPr>
+                <w:sz w:val="17"/>
+                <w:szCs w:val="17"/>
+              </w:rPr>
+              <w:t>9</w:t>
+            </w:r>
+          </w:p>
+        </w:tc>
+        <w:tc>
+          <w:tcPr>
+            <w:tcW w:w="1872" w:type="dxa"/>
+            <w:vAlign w:val="center"/>
+          </w:tcPr>
+          <w:p>
+            <w:pPr>
+              <w:pStyle w:val="TableText"/>
+              <w:spacing w:before="0" w:after="0" w:line="220" w:lineRule="auto"/>
+            </w:pPr>
+            <w:r>
+              <w:rPr>
+                <w:sz w:val="17"/>
+                <w:szCs w:val="17"/>
+              </w:rPr>
+              <w:t>−8.35</w:t>
+            </w:r>
+          </w:p>
+        </w:tc>
+        <w:tc>
+          <w:tcPr>
+            <w:tcW w:w="1872" w:type="dxa"/>
+            <w:vAlign w:val="center"/>
+          </w:tcPr>
+          <w:p>
+            <w:pPr>
+              <w:pStyle w:val="TableText"/>
+              <w:spacing w:before="0" w:after="0" w:line="220" w:lineRule="auto"/>
+            </w:pPr>
+            <w:r>
+              <w:rPr>
+                <w:sz w:val="17"/>
+                <w:szCs w:val="17"/>
+              </w:rPr>
+              <w:t>0.12</w:t>
             </w:r>
           </w:p>
         </w:tc>
@@ -2535,7 +2680,7 @@
                 <w:sz w:val="17"/>
                 <w:szCs w:val="17"/>
               </w:rPr>
-              <w:t>0.12</w:t>
+              <w:t>0.09</w:t>
             </w:r>
           </w:p>
         </w:tc>
@@ -2560,7 +2705,7 @@
         <w:pStyle w:val="Normal"/>
       </w:pPr>
       <w:r>
-        <w:t>本分析把规模很大的来源候选池压缩为两个边界清楚的后续对象：一个成员信息缺失的8条汇总终点集，以及一份独立的12条外部序列记录。其价值在于优选和定位证据缺口，而不是发现已经验证的AD机制。</w:t>
+        <w:t>本研究在保持“预测不等于机制”这一边界的同时形成紧凑验证集合。深度学习和神经网络模型使大规模搜索可行，但基于异质数据训练的输出可能不适用于极短微生物组肽。完整分析中几乎完全阳性的广义抗菌输出也说明，多个模型标签同时为阳性不能替代生物学重复。</w:t>
       </w:r>
     </w:p>
     <w:p>
@@ -2568,7 +2713,45 @@
         <w:pStyle w:val="Normal"/>
       </w:pPr>
       <w:r>
-        <w:t>本研究的生物学动机始于牙周炎—AD界面。</w:t>
+        <w:t>AChE外周区域可影响Aβ组装，因此可提供合理结构背景</w:t>
+      </w:r>
+      <w:r>
+        <w:t>[18]</w:t>
+      </w:r>
+      <w:r>
+        <w:t>；PDB 4EY6则提供实验测定的人源结构</w:t>
+      </w:r>
+      <w:r>
+        <w:t>[19]</w:t>
+      </w:r>
+      <w:r>
+        <w:t>。然而，Vina属于筛选方法，排序受受体与配体制备、搜索空间和采样影响</w:t>
+      </w:r>
+      <w:r>
+        <w:t>[20]</w:t>
+      </w:r>
+      <w:r>
+        <w:t>。较新Vina实现不能消除这些要求</w:t>
+      </w:r>
+      <w:r>
+        <w:t>[21]</w:t>
+      </w:r>
+      <w:r>
+        <w:t>，柔性肽对接还可能需要肽特异性精修</w:t>
+      </w:r>
+      <w:r>
+        <w:t>[22]</w:t>
+      </w:r>
+      <w:r>
+        <w:t>。缺少构象和运行定义时，评分范围不能证明AChE结合、位点偏好、抑制、选择性或Aβ调节。</w:t>
+      </w:r>
+    </w:p>
+    <w:p>
+      <w:pPr>
+        <w:pStyle w:val="Normal"/>
+      </w:pPr>
+      <w:r>
+        <w:t>牙周研究背景同样需要严格限定。现有研究支持考察炎症、牙龈蛋白酶、感染和囊泡相关路径，但不能把群落来源肽归属于</w:t>
       </w:r>
       <w:r>
         <w:rPr>
@@ -2577,16 +2760,7 @@
         <w:t>P. gingivalis</w:t>
       </w:r>
       <w:r>
-        <w:t>感染可合理地关联于系统性炎症信号、LPS和牙龈蛋白酶暴露、囊泡介导的成分运输、BBB扰动及小胶质细胞激活[3–7]。候选流程进一步提出：口腔微生物肽是否可能构成一类尚少研究、并具有BBB、神经毒性、金属/氧化还原或AChE相关预测特征的分子。然而，本研究结果均未证明候选在来源参与者中表达、从口腔生物膜释放、进入循环、跨越BBB、影响神经系统或具有AD特异性。尤其重要的是，汇总来源不能证明任何候选由</w:t>
-      </w:r>
-      <w:r>
-        <w:rPr>
-          <w:i/>
-        </w:rPr>
-        <w:t>P. gingivalis</w:t>
-      </w:r>
-      <w:r>
-        <w:t>编码；该菌在本文中是机制研究动机，而不是已确定的序列来源。</w:t>
+        <w:t>。只有建立从序列到组装、样本、临床标签、分类学、表达、循环、BBB转运和靶点作用的候选层面链路，才能进一步检验疾病主张。</w:t>
       </w:r>
     </w:p>
     <w:p>
@@ -2594,15 +2768,7 @@
         <w:pStyle w:val="Normal"/>
       </w:pPr>
       <w:r>
-        <w:t>经核验的登录号关系也改变了输入数据的表述方式。PRJNA678453是11名健康对照、11名牙周炎患者和66份标本的原始队列；PRJEB65451则是衍生TPA组装资源。参与者、临床标本、配对DNA/RNA测量和组装分析属于不同统计单位，不能混用。由于缺少参与者—序列映射，两组近似的汇总保留率不能支持疾病富集结论。</w:t>
-      </w:r>
-    </w:p>
-    <w:p>
-      <w:pPr>
-        <w:pStyle w:val="Normal"/>
-      </w:pPr>
-      <w:r>
-        <w:t>本研究存在数项决定性局限。第一，逐行模型输出和精确服务器版本缺失，阈值及计数只能在汇总层面审计。第二，8条与12条的成员关系仍未解决。第三，对接记录缺少复现及检查构象所需材料。第四，基于异质数据集训练的预测器可能不适用于极短的微生物组来源肽；多个模型结果一致也不等同于实验独立性。合理的下一步是恢复候选来源链，使用固定版本重新运行预测和对接，继而检验合成质量、稳定性、细胞毒性、BBB转运、金属相互作用、AChE活性以及神经元或胶质细胞表型，之后再讨论疾病机制。</w:t>
+        <w:t>当前优先事项是恢复漏斗逐行成员，确定严格8/12子集，使用固定版本重跑预测和对接，并在合成后验证肽身份与稳定性。随后应在适当对照下评价BBB转运、细胞毒性、Cu/Fe/Zn相互作用、金属依赖氧化还原效应、AChE/BChE功能、直接结合和Aβ表型。缺少逐行映射、原始对接材料、完整MD输入及实验测量，是本研究的决定性局限。</w:t>
       </w:r>
     </w:p>
     <w:p>
@@ -2619,7 +2785,7 @@
         <w:pStyle w:val="Normal"/>
       </w:pPr>
       <w:r>
-        <w:t>汇总证据支持形成一个透明的待验证候选清单，但不支持从牙周炎或</w:t>
+        <w:t>汇总数据支持一条透明计算漏斗，终点为12条主集合和8条严格子集计数。另一张12条肽的表格提供序列组成和AChE评分排序，但无法逐行连接到这些终点，也未独立产生对接或MD结果。该清单适用于分阶段验证，但不能证明</w:t>
       </w:r>
       <w:r>
         <w:rPr>
@@ -2628,7 +2794,7 @@
         <w:t>P. gingivalis</w:t>
       </w:r>
       <w:r>
-        <w:t>到AD的因果链。核正后的来源为：PRJNA678453是包含22名参与者、66份口腔标本的来源队列；PRJEB65451是其衍生的EBI-EMG/MGnify TPA组装项目。12条外部序列及其来源报告AChE分数仍与成员未知的最终8条集合分离。恢复逐行来源并完成独立计算和实验验证，是进行机制解释的前提。</w:t>
+        <w:t>来源、疾病特异性、脑暴露、靶点结合、生物活性或因果关系。</w:t>
       </w:r>
     </w:p>
     <w:p>
@@ -2665,7 +2831,7 @@
           <w:sz w:val="18"/>
           <w:szCs w:val="18"/>
         </w:rPr>
-        <w:t>. 2021;397:1577–1590. doi:10.1016/S0140-6736(20)32205-4.</w:t>
+        <w:t>. 2021;397(10284):1577–1590. doi:10.1016/S0140-6736(20)32205-4.</w:t>
       </w:r>
     </w:p>
     <w:p>
@@ -2678,7 +2844,7 @@
           <w:sz w:val="18"/>
           <w:szCs w:val="18"/>
         </w:rPr>
-        <w:t xml:space="preserve">2. Selkoe DJ. Treatments for Alzheimer’s disease emerge. </w:t>
+        <w:t xml:space="preserve">2. Selkoe DJ, Hardy J. The amyloid hypothesis of Alzheimer’s disease at 25 years. </w:t>
       </w:r>
       <w:r>
         <w:rPr>
@@ -2686,14 +2852,14 @@
           <w:sz w:val="18"/>
           <w:szCs w:val="18"/>
         </w:rPr>
-        <w:t>Nature</w:t>
-      </w:r>
-      <w:r>
-        <w:rPr>
-          <w:sz w:val="18"/>
-          <w:szCs w:val="18"/>
-        </w:rPr>
-        <w:t>. 2023;616:33–34. doi:10.1038/s41586-023-05769-3.</w:t>
+        <w:t>EMBO Mol Med</w:t>
+      </w:r>
+      <w:r>
+        <w:rPr>
+          <w:sz w:val="18"/>
+          <w:szCs w:val="18"/>
+        </w:rPr>
+        <w:t>. 2016;8(6):595–608. doi:10.15252/emmm.201606210.</w:t>
       </w:r>
     </w:p>
     <w:p>
@@ -2721,7 +2887,7 @@
           <w:sz w:val="18"/>
           <w:szCs w:val="18"/>
         </w:rPr>
-        <w:t>. 2025;98:220–227. doi:10.1111/prd.12631.</w:t>
+        <w:t>. 2025;98(1):220–227. doi:10.1111/prd.12631.</w:t>
       </w:r>
     </w:p>
     <w:p>
@@ -2734,7 +2900,7 @@
           <w:sz w:val="18"/>
           <w:szCs w:val="18"/>
         </w:rPr>
-        <w:t xml:space="preserve">4. Liu S, Butler CA, Ayton S, Reynolds EC, Dashper SG. </w:t>
+        <w:t xml:space="preserve">4. Guo Y, Nguyen KA, Potempa J. Dichotomy of gingipains action as virulence factors. </w:t>
       </w:r>
       <w:r>
         <w:rPr>
@@ -2742,29 +2908,14 @@
           <w:sz w:val="18"/>
           <w:szCs w:val="18"/>
         </w:rPr>
-        <w:t>Porphyromonas gingivalis</w:t>
-      </w:r>
-      <w:r>
-        <w:rPr>
-          <w:sz w:val="18"/>
-          <w:szCs w:val="18"/>
-        </w:rPr>
-        <w:t xml:space="preserve"> and the pathogenesis of Alzheimer’s disease. </w:t>
-      </w:r>
-      <w:r>
-        <w:rPr>
-          <w:i/>
-          <w:sz w:val="18"/>
-          <w:szCs w:val="18"/>
-        </w:rPr>
-        <w:t>Crit Rev Microbiol</w:t>
-      </w:r>
-      <w:r>
-        <w:rPr>
-          <w:sz w:val="18"/>
-          <w:szCs w:val="18"/>
-        </w:rPr>
-        <w:t>. 2024;50:127–137. doi:10.1080/1040841X.2022.2163613.</w:t>
+        <w:t>Periodontol 2000</w:t>
+      </w:r>
+      <w:r>
+        <w:rPr>
+          <w:sz w:val="18"/>
+          <w:szCs w:val="18"/>
+        </w:rPr>
+        <w:t>. 2010;54(1):15–44. doi:10.1111/j.1600-0757.2010.00377.x.</w:t>
       </w:r>
     </w:p>
     <w:p>
@@ -2792,7 +2943,7 @@
           <w:sz w:val="18"/>
           <w:szCs w:val="18"/>
         </w:rPr>
-        <w:t xml:space="preserve"> in Alzheimer’s disease brains: evidence for disease causation and treatment with small-molecule inhibitors. </w:t>
+        <w:t xml:space="preserve"> in Alzheimer’s disease brains. </w:t>
       </w:r>
       <w:r>
         <w:rPr>
@@ -2807,7 +2958,7 @@
           <w:sz w:val="18"/>
           <w:szCs w:val="18"/>
         </w:rPr>
-        <w:t>. 2019;5:eaau3333. doi:10.1126/sciadv.aau3333.</w:t>
+        <w:t>. 2019;5(1):eaau3333. doi:10.1126/sciadv.aau3333.</w:t>
       </w:r>
     </w:p>
     <w:p>
@@ -2835,7 +2986,7 @@
           <w:sz w:val="18"/>
           <w:szCs w:val="18"/>
         </w:rPr>
-        <w:t>. 2018;13:e0204941. doi:10.1371/journal.pone.0204941.</w:t>
+        <w:t>. 2018;13(10):e0204941. doi:10.1371/journal.pone.0204941.</w:t>
       </w:r>
     </w:p>
     <w:p>
@@ -2848,7 +2999,7 @@
           <w:sz w:val="18"/>
           <w:szCs w:val="18"/>
         </w:rPr>
-        <w:t xml:space="preserve">7. Gong T, Chen Q, Mao H, et al. Outer membrane vesicles of </w:t>
+        <w:t xml:space="preserve">7. Nara PL, Sindelar D, Penn MS, et al. </w:t>
       </w:r>
       <w:r>
         <w:rPr>
@@ -2863,7 +3014,7 @@
           <w:sz w:val="18"/>
           <w:szCs w:val="18"/>
         </w:rPr>
-        <w:t xml:space="preserve"> trigger NLRP3 inflammasome and induce neuroinflammation, tau phosphorylation, and memory dysfunction in mice. </w:t>
+        <w:t xml:space="preserve"> outer membrane vesicles as the major driver of and explanation for neuropathogenesis. </w:t>
       </w:r>
       <w:r>
         <w:rPr>
@@ -2871,14 +3022,14 @@
           <w:sz w:val="18"/>
           <w:szCs w:val="18"/>
         </w:rPr>
-        <w:t>Front Cell Infect Microbiol</w:t>
-      </w:r>
-      <w:r>
-        <w:rPr>
-          <w:sz w:val="18"/>
-          <w:szCs w:val="18"/>
-        </w:rPr>
-        <w:t>. 2022;12:925435. doi:10.3389/fcimb.2022.925435.</w:t>
+        <w:t>J Alzheimers Dis</w:t>
+      </w:r>
+      <w:r>
+        <w:rPr>
+          <w:sz w:val="18"/>
+          <w:szCs w:val="18"/>
+        </w:rPr>
+        <w:t>. 2021;82(4):1417–1450. doi:10.3233/JAD-210448.</w:t>
       </w:r>
     </w:p>
     <w:p>
@@ -2906,7 +3057,7 @@
           <w:sz w:val="18"/>
           <w:szCs w:val="18"/>
         </w:rPr>
-        <w:t>. 2024;14:e3486. doi:10.1002/brb3.3486.</w:t>
+        <w:t>. 2024;14(4):e3486. doi:10.1002/brb3.3486.</w:t>
       </w:r>
     </w:p>
     <w:p>
@@ -2934,7 +3085,7 @@
           <w:sz w:val="18"/>
           <w:szCs w:val="18"/>
         </w:rPr>
-        <w:t>. 2019;178:1245–1259.e14. doi:10.1016/j.cell.2019.07.016.</w:t>
+        <w:t>. 2019;178(5):1245–1259.e14. doi:10.1016/j.cell.2019.07.016.</w:t>
       </w:r>
     </w:p>
     <w:p>
@@ -2955,14 +3106,14 @@
           <w:sz w:val="18"/>
           <w:szCs w:val="18"/>
         </w:rPr>
-        <w:t>Nat Microbiol</w:t>
-      </w:r>
-      <w:r>
-        <w:rPr>
-          <w:sz w:val="18"/>
-          <w:szCs w:val="18"/>
-        </w:rPr>
-        <w:t>. 2021;6:564–574. doi:10.1038/s41564-021-00891-0.</w:t>
+        <w:t>Cell Host Microbe</w:t>
+      </w:r>
+      <w:r>
+        <w:rPr>
+          <w:sz w:val="18"/>
+          <w:szCs w:val="18"/>
+        </w:rPr>
+        <w:t>. 2021;29(1):121–131.e4. doi:10.1016/j.chom.2020.11.002.</w:t>
       </w:r>
     </w:p>
     <w:p>
@@ -2983,7 +3134,7 @@
           <w:sz w:val="18"/>
           <w:szCs w:val="18"/>
         </w:rPr>
-        <w:t>NPJ Biofilms Microbiomes</w:t>
+        <w:t>npj Biofilms Microbiomes</w:t>
       </w:r>
       <w:r>
         <w:rPr>
@@ -3003,7 +3154,7 @@
           <w:sz w:val="18"/>
           <w:szCs w:val="18"/>
         </w:rPr>
-        <w:t xml:space="preserve">12. Du Z, Ding X, Xu Y, Li W. UniDL4BioPep: a universal deep learning architecture for binary classification in peptide bioactivity. </w:t>
+        <w:t xml:space="preserve">12. Du Z, Ding X, Xu Y, Li Y. UniDL4BioPep: a universal deep learning architecture for binary classification in peptide bioactivity. </w:t>
       </w:r>
       <w:r>
         <w:rPr>
@@ -3018,7 +3169,7 @@
           <w:sz w:val="18"/>
           <w:szCs w:val="18"/>
         </w:rPr>
-        <w:t>. 2023;24:bbad135. doi:10.1093/bib/bbad135.</w:t>
+        <w:t>. 2023;24(3):bbad135. doi:10.1093/bib/bbad135.</w:t>
       </w:r>
     </w:p>
     <w:p>
@@ -3046,7 +3197,7 @@
           <w:sz w:val="18"/>
           <w:szCs w:val="18"/>
         </w:rPr>
-        <w:t>. 2025;34:e70200. doi:10.1002/pro.70200.</w:t>
+        <w:t>. 2025;34(8):e70200. doi:10.1002/pro.70200.</w:t>
       </w:r>
     </w:p>
     <w:p>
@@ -3059,7 +3210,7 @@
           <w:sz w:val="18"/>
           <w:szCs w:val="18"/>
         </w:rPr>
-        <w:t xml:space="preserve">14. Valasatava Y, Rosato A, Banci L, Andreini C. mebipred: identifying metal-binding potential in protein sequence. </w:t>
+        <w:t xml:space="preserve">14. Aptekmann AA, Buongiorno J, Giovannelli D, et al. mebipred: identifying metal-binding potential in protein sequence. </w:t>
       </w:r>
       <w:r>
         <w:rPr>
@@ -3074,7 +3225,7 @@
           <w:sz w:val="18"/>
           <w:szCs w:val="18"/>
         </w:rPr>
-        <w:t>. 2022;38:3532–3540. doi:10.1093/bioinformatics/btac358.</w:t>
+        <w:t>. 2022;38(14):3532–3540. doi:10.1093/bioinformatics/btac358.</w:t>
       </w:r>
     </w:p>
     <w:p>
@@ -3115,7 +3266,7 @@
           <w:sz w:val="18"/>
           <w:szCs w:val="18"/>
         </w:rPr>
-        <w:t xml:space="preserve">16. Inestrosa NC, Alvarez A, Pérez CA, et al. Acetylcholinesterase accelerates assembly of amyloid-β-peptides into Alzheimer’s fibrils. </w:t>
+        <w:t xml:space="preserve">16. Abraham MJ, Murtola T, Schulz R, et al. GROMACS: high performance molecular simulations through multi-level parallelism from laptops to supercomputers. </w:t>
       </w:r>
       <w:r>
         <w:rPr>
@@ -3123,14 +3274,14 @@
           <w:sz w:val="18"/>
           <w:szCs w:val="18"/>
         </w:rPr>
-        <w:t>Neuron</w:t>
-      </w:r>
-      <w:r>
-        <w:rPr>
-          <w:sz w:val="18"/>
-          <w:szCs w:val="18"/>
-        </w:rPr>
-        <w:t>. 1996;16:881–891. doi:10.1016/S0896-6273(00)80108-7.</w:t>
+        <w:t>SoftwareX</w:t>
+      </w:r>
+      <w:r>
+        <w:rPr>
+          <w:sz w:val="18"/>
+          <w:szCs w:val="18"/>
+        </w:rPr>
+        <w:t>. 2015;1–2:19–25. doi:10.1016/j.softx.2015.06.001.</w:t>
       </w:r>
     </w:p>
     <w:p>
@@ -3143,7 +3294,7 @@
           <w:sz w:val="18"/>
           <w:szCs w:val="18"/>
         </w:rPr>
-        <w:t xml:space="preserve">17. Cheung J, Rudolph MJ, Burshteyn F, et al. Structures of human acetylcholinesterase in complex with pharmacologically important ligands. </w:t>
+        <w:t xml:space="preserve">17. Lindorff-Larsen K, Piana S, Palmo K, et al. Improved side-chain torsion potentials for the Amber ff99SB protein force field. </w:t>
       </w:r>
       <w:r>
         <w:rPr>
@@ -3151,14 +3302,14 @@
           <w:sz w:val="18"/>
           <w:szCs w:val="18"/>
         </w:rPr>
-        <w:t>J Med Chem</w:t>
-      </w:r>
-      <w:r>
-        <w:rPr>
-          <w:sz w:val="18"/>
-          <w:szCs w:val="18"/>
-        </w:rPr>
-        <w:t>. 2012;55:10282–10286. doi:10.1021/jm300871x.</w:t>
+        <w:t>Proteins</w:t>
+      </w:r>
+      <w:r>
+        <w:rPr>
+          <w:sz w:val="18"/>
+          <w:szCs w:val="18"/>
+        </w:rPr>
+        <w:t>. 2010;78(8):1950–1958. doi:10.1002/prot.22711.</w:t>
       </w:r>
     </w:p>
     <w:p>
@@ -3171,7 +3322,7 @@
           <w:sz w:val="18"/>
           <w:szCs w:val="18"/>
         </w:rPr>
-        <w:t xml:space="preserve">18. Trott O, Olson AJ. AutoDock Vina: improving the speed and accuracy of docking. </w:t>
+        <w:t xml:space="preserve">18. Inestrosa NC, Alvarez A, Pérez CA, et al. Acetylcholinesterase accelerates assembly of amyloid-β-peptides into Alzheimer’s fibrils. </w:t>
       </w:r>
       <w:r>
         <w:rPr>
@@ -3179,14 +3330,14 @@
           <w:sz w:val="18"/>
           <w:szCs w:val="18"/>
         </w:rPr>
-        <w:t>J Comput Chem</w:t>
-      </w:r>
-      <w:r>
-        <w:rPr>
-          <w:sz w:val="18"/>
-          <w:szCs w:val="18"/>
-        </w:rPr>
-        <w:t>. 2010;31:455–461. doi:10.1002/jcc.21334.</w:t>
+        <w:t>Neuron</w:t>
+      </w:r>
+      <w:r>
+        <w:rPr>
+          <w:sz w:val="18"/>
+          <w:szCs w:val="18"/>
+        </w:rPr>
+        <w:t>. 1996;16(4):881–891. doi:10.1016/s0896-6273(00)80108-7.</w:t>
       </w:r>
     </w:p>
     <w:p>
@@ -3199,7 +3350,7 @@
           <w:sz w:val="18"/>
           <w:szCs w:val="18"/>
         </w:rPr>
-        <w:t xml:space="preserve">19. Eberhardt J, Santos-Martins D, Tillack AF, Forli S. AutoDock Vina 1.2.0: new docking methods, expanded force field, and Python bindings. </w:t>
+        <w:t xml:space="preserve">19. Cheung J, Rudolph MJ, Burshteyn F, et al. Structures of human acetylcholinesterase in complex with pharmacologically important ligands. </w:t>
       </w:r>
       <w:r>
         <w:rPr>
@@ -3207,14 +3358,14 @@
           <w:sz w:val="18"/>
           <w:szCs w:val="18"/>
         </w:rPr>
-        <w:t>J Chem Inf Model</w:t>
-      </w:r>
-      <w:r>
-        <w:rPr>
-          <w:sz w:val="18"/>
-          <w:szCs w:val="18"/>
-        </w:rPr>
-        <w:t>. 2021;61:3891–3898. doi:10.1021/acs.jcim.1c00203.</w:t>
+        <w:t>J Med Chem</w:t>
+      </w:r>
+      <w:r>
+        <w:rPr>
+          <w:sz w:val="18"/>
+          <w:szCs w:val="18"/>
+        </w:rPr>
+        <w:t>. 2012;55(23):10282–10286. doi:10.1021/jm300871x.</w:t>
       </w:r>
     </w:p>
     <w:p>
@@ -3227,7 +3378,7 @@
           <w:sz w:val="18"/>
           <w:szCs w:val="18"/>
         </w:rPr>
-        <w:t xml:space="preserve">20. London N, Raveh B, Schueler-Furman O. Druggable protein–protein interactions—from hot spots to hot segments. </w:t>
+        <w:t xml:space="preserve">20. Trott O, Olson AJ. AutoDock Vina: improving the speed and accuracy of docking with a new scoring function. </w:t>
       </w:r>
       <w:r>
         <w:rPr>
@@ -3235,14 +3386,70 @@
           <w:sz w:val="18"/>
           <w:szCs w:val="18"/>
         </w:rPr>
-        <w:t>Curr Opin Chem Biol</w:t>
-      </w:r>
-      <w:r>
-        <w:rPr>
-          <w:sz w:val="18"/>
-          <w:szCs w:val="18"/>
-        </w:rPr>
-        <w:t>. 2013;17:952–959. doi:10.1016/j.cbpa.2013.10.011.</w:t>
+        <w:t>J Comput Chem</w:t>
+      </w:r>
+      <w:r>
+        <w:rPr>
+          <w:sz w:val="18"/>
+          <w:szCs w:val="18"/>
+        </w:rPr>
+        <w:t>. 2010;31(2):455–461. doi:10.1002/jcc.21334.</w:t>
+      </w:r>
+    </w:p>
+    <w:p>
+      <w:pPr>
+        <w:pStyle w:val="Reference"/>
+        <w:ind w:left="360" w:hanging="360"/>
+      </w:pPr>
+      <w:r>
+        <w:rPr>
+          <w:sz w:val="18"/>
+          <w:szCs w:val="18"/>
+        </w:rPr>
+        <w:t xml:space="preserve">21. Eberhardt J, Santos-Martins D, Tillack AF, Forli S. AutoDock Vina 1.2.0: new docking methods, expanded force field, and Python bindings. </w:t>
+      </w:r>
+      <w:r>
+        <w:rPr>
+          <w:i/>
+          <w:sz w:val="18"/>
+          <w:szCs w:val="18"/>
+        </w:rPr>
+        <w:t>J Chem Inf Model</w:t>
+      </w:r>
+      <w:r>
+        <w:rPr>
+          <w:sz w:val="18"/>
+          <w:szCs w:val="18"/>
+        </w:rPr>
+        <w:t>. 2021;61(8):3891–3898. doi:10.1021/acs.jcim.1c00203.</w:t>
+      </w:r>
+    </w:p>
+    <w:p>
+      <w:pPr>
+        <w:pStyle w:val="Reference"/>
+        <w:ind w:left="360" w:hanging="360"/>
+      </w:pPr>
+      <w:r>
+        <w:rPr>
+          <w:sz w:val="18"/>
+          <w:szCs w:val="18"/>
+        </w:rPr>
+        <w:t xml:space="preserve">22. London N, Raveh B, Cohen E, et al. Rosetta FlexPepDock web server—high resolution modeling of peptide–protein interactions. </w:t>
+      </w:r>
+      <w:r>
+        <w:rPr>
+          <w:i/>
+          <w:sz w:val="18"/>
+          <w:szCs w:val="18"/>
+        </w:rPr>
+        <w:t>Nucleic Acids Res</w:t>
+      </w:r>
+      <w:r>
+        <w:rPr>
+          <w:sz w:val="18"/>
+          <w:szCs w:val="18"/>
+        </w:rPr>
+        <w:t>. 2011;39:W249–W253. doi:10.1093/nar/gkr326.</w:t>
       </w:r>
     </w:p>
     <w:sectPr>
@@ -3433,16 +3640,16 @@
       <w:szCs w:val="17"/>
     </w:rPr>
   </w:style>
-  <w:style w:type="table" w:styleId="TableGrid">
-    <w:name w:val="Table Grid"/>
+  <w:style w:type="table" w:styleId="ThreeLineTable">
+    <w:name w:val="Three-Line Table"/>
     <w:tblPr>
       <w:tblBorders>
-        <w:top w:val="single" w:sz="4" w:color="9AA6B2"/>
-        <w:left w:val="single" w:sz="4" w:color="9AA6B2"/>
-        <w:bottom w:val="single" w:sz="4" w:color="9AA6B2"/>
-        <w:right w:val="single" w:sz="4" w:color="9AA6B2"/>
-        <w:insideH w:val="single" w:sz="4" w:color="9AA6B2"/>
-        <w:insideV w:val="single" w:sz="4" w:color="9AA6B2"/>
+        <w:top w:val="single" w:sz="12" w:color="000000"/>
+        <w:left w:val="nil"/>
+        <w:bottom w:val="single" w:sz="12" w:color="000000"/>
+        <w:right w:val="nil"/>
+        <w:insideH w:val="nil"/>
+        <w:insideV w:val="nil"/>
       </w:tblBorders>
     </w:tblPr>
   </w:style>

</xml_diff>

<commit_message>
release: align manuscripts and expand concise variants for v3.7.0
Co-authored-by: arena-agent <297053741+arena-agent@users.noreply.github.com>
</commit_message>
<xml_diff>
--- a/projects/porphyromonas-ad-mechanism-manuscript/manuscript/concise/Chinese.docx
+++ b/projects/porphyromonas-ad-mechanism-manuscript/manuscript/concise/Chinese.docx
@@ -16,7 +16,69 @@
         <w:pStyle w:val="Normal"/>
       </w:pPr>
       <w:r>
-        <w:t>牙周炎相关口腔菌群失调被认为可能影响阿尔茨海默病（AD）相关炎症，但具体分子链路仍不确定。本研究对口腔小开放阅读框（smORF）汇总数据进行纯计算二次分析，以优选可供验证的微肽。筛选级联整合ESM-2嵌入与任务特异性卷积网络、ESM2-t30神经毒性模型、两级神经网络金属结合预测器和多任务抗氧化卷积网络。序列证据过滤从11,269,961条和11,721,988条smORF起始库中分别保留31,510条和33,786条候选。在牙周炎标记分支中，3,518条候选达到BBB高分；NTxPred2评价3,299条并将923条判为阳性，后续筛选依次保留111、15、12和8条候选。另一张表包含12条7–9 aa序列，其AChE Vina均值范围为−9.60至−8.25 kcal/mol。序列组成和评分排序可以核对，但12条序列与汇总终点的关系、对接执行和分子动力学结果均不可获得。因此，本研究形成的是供独立重现和实验检验的计算候选清单，而不是</w:t>
+        <w:rPr>
+          <w:b/>
+        </w:rPr>
+        <w:t>背景：</w:t>
+      </w:r>
+      <w:r>
+        <w:t xml:space="preserve"> 牙周炎相关口腔菌群失调可能参与阿尔茨海默病（AD）相关炎症，但尚未建立明确的分子连接。微生物组小开放阅读框（smORF）构成规模庞大的候选肽空间，可用于计算优选。</w:t>
+      </w:r>
+    </w:p>
+    <w:p>
+      <w:pPr>
+        <w:pStyle w:val="Normal"/>
+      </w:pPr>
+      <w:r>
+        <w:rPr>
+          <w:b/>
+        </w:rPr>
+        <w:t>目的：</w:t>
+      </w:r>
+      <w:r>
+        <w:t xml:space="preserve"> 重建口腔smORF汇总筛选级联，并形成可供机制随访的适量肽候选集。</w:t>
+      </w:r>
+    </w:p>
+    <w:p>
+      <w:pPr>
+        <w:pStyle w:val="Normal"/>
+      </w:pPr>
+      <w:r>
+        <w:rPr>
+          <w:b/>
+        </w:rPr>
+        <w:t>方法：</w:t>
+      </w:r>
+      <w:r>
+        <w:t xml:space="preserve"> 本研究为纯计算二次分析，整合序列/蛋白质组过滤、ESM-2嵌入与任务特异性卷积网络、ESM2-t30神经毒性模型、两级神经网络金属结合预测器、多任务抗氧化卷积网络、序列组成分析及独立乙酰胆碱酯酶（AChE）对接汇总。</w:t>
+      </w:r>
+    </w:p>
+    <w:p>
+      <w:pPr>
+        <w:pStyle w:val="Normal"/>
+      </w:pPr>
+      <w:r>
+        <w:rPr>
+          <w:b/>
+        </w:rPr>
+        <w:t>结果：</w:t>
+      </w:r>
+      <w:r>
+        <w:t xml:space="preserve"> 从11,269,961条和11,721,988条smORF起始库中分别保留31,510条和33,786条候选。牙周炎标记分支中3,518条候选达到BBB高分；NTxPred2评价3,299条，其中923条为模型阳性；后续筛选依次保留111、15、12和8条候选。另一张表包含12条互不重复的7–9 aa序列，其AChE Vina均值范围为−9.60至−8.25 kcal/mol。序列组成和评分排序可以复核，但逐行对应关系和对接执行仍未解决。</w:t>
+      </w:r>
+    </w:p>
+    <w:p>
+      <w:pPr>
+        <w:pStyle w:val="Normal"/>
+      </w:pPr>
+      <w:r>
+        <w:rPr>
+          <w:b/>
+        </w:rPr>
+        <w:t>结论：</w:t>
+      </w:r>
+      <w:r>
+        <w:t xml:space="preserve"> 本研究形成边界明确的候选清单，可用于独立验证，但不能据此证明</w:t>
       </w:r>
       <w:r>
         <w:rPr>
@@ -25,7 +87,7 @@
         <w:t>Porphyromonas gingivalis</w:t>
       </w:r>
       <w:r>
-        <w:t>来源、脑暴露、AChE结合或AD机制的证据。</w:t>
+        <w:t>来源、脑暴露、AChE结合或AD机制。预设的100 ns GROMACS扩展将在分析和质量控制完成后补充轨迹指标。</w:t>
       </w:r>
     </w:p>
     <w:p>
@@ -39,7 +101,7 @@
         <w:t>关键词：</w:t>
       </w:r>
       <w:r>
-        <w:t xml:space="preserve"> 阿尔茨海默病；牙龈卟啉单胞菌；牙周炎；口腔微肽；smORF；深度学习；乙酰胆碱酯酶</w:t>
+        <w:t xml:space="preserve"> 阿尔茨海默病；牙龈卟啉单胞菌；牙周炎；口腔微肽；smORF；深度学习；乙酰胆碱酯酶；分子动力学</w:t>
       </w:r>
     </w:p>
     <w:p>
@@ -56,18 +118,56 @@
         <w:pStyle w:val="Normal"/>
       </w:pPr>
       <w:r>
-        <w:t>阿尔茨海默病（AD）的发生发展涉及淀粉样蛋白、tau、突触、免疫和血管过程的相互作用，而非单一分子通路</w:t>
+        <w:t>阿尔茨海默病（AD）是一种进行性神经退行性疾病，其病理涉及淀粉样蛋白β（Aβ）、tau、突触、免疫、血管和代谢异常的相互作用</w:t>
       </w:r>
       <w:r>
         <w:t>[1]</w:t>
       </w:r>
       <w:r>
-        <w:t>。淀粉样蛋白仍具有重要生物学意义，但其与疾病进展的关系必须在这一更广泛网络中解释</w:t>
+        <w:t>。淀粉样蛋白仍是疾病生物学的核心组成，但其负荷本身不能解释AD在时间过程和临床表现上的异质性</w:t>
       </w:r>
       <w:r>
         <w:t>[2]</w:t>
       </w:r>
       <w:r>
+        <w:t>。因此，外周炎症状态更适合被理解为多层次疾病过程中的潜在修饰因素，而不是单一充分病因。</w:t>
+      </w:r>
+    </w:p>
+    <w:p>
+      <w:pPr>
+        <w:pStyle w:val="Normal"/>
+      </w:pPr>
+      <w:r>
+        <w:t>牙周炎是由失调性多微生物生物膜与易感宿主反应共同驱动的慢性炎症性疾病。它可能造成持续炎症负担和微生物产物的间歇性系统暴露，由此推动口腔—脑轴研究</w:t>
+      </w:r>
+      <w:r>
+        <w:t>[3]</w:t>
+      </w:r>
+      <w:r>
+        <w:t>。在该生态系统中，牙龈卟啉单胞菌（</w:t>
+      </w:r>
+      <w:r>
+        <w:rPr>
+          <w:i/>
+        </w:rPr>
+        <w:t>Porphyromonas gingivalis</w:t>
+      </w:r>
+      <w:r>
+        <w:t>）是研究较充分的革兰阴性厌氧条件致病菌。牙龈蛋白酶、免疫调节、组织降解、营养获取和群落协作使该菌即使在丰度不占优势时也可能重塑牙周生态位</w:t>
+      </w:r>
+      <w:r>
+        <w:t>[4]</w:t>
+      </w:r>
+      <w:r>
+        <w:t>。这些特征提供机制背景，但不能把缺少来源链的群落肽直接归属于</w:t>
+      </w:r>
+      <w:r>
+        <w:rPr>
+          <w:i/>
+        </w:rPr>
+        <w:t>P. gingivalis</w:t>
+      </w:r>
+      <w:r>
         <w:t>。</w:t>
       </w:r>
     </w:p>
@@ -76,61 +176,40 @@
         <w:pStyle w:val="Normal"/>
       </w:pPr>
       <w:r>
-        <w:t>牙周炎是一种与菌群失调相关的炎症性疾病，可能增加全身炎症负担，并推动了口腔—脑轴研究</w:t>
-      </w:r>
-      <w:r>
-        <w:t>[3]</w:t>
-      </w:r>
-      <w:r>
-        <w:t>。在牙周生物膜中，牙龈卟啉单胞菌（</w:t>
+        <w:t>若干研究支持继续探索，同时也显示出现有证据缺口。AD相关死后组织中曾检出</w:t>
       </w:r>
       <w:r>
         <w:rPr>
           <w:i/>
         </w:rPr>
-        <w:t>Porphyromonas gingivalis</w:t>
-      </w:r>
-      <w:r>
-        <w:t>）是一种可参与蛋白水解、免疫调节、组织破坏和群落重塑的条件致病菌</w:t>
-      </w:r>
-      <w:r>
-        <w:t>[4]</w:t>
-      </w:r>
-      <w:r>
-        <w:t>。死后组织研究曾在AD脑组织中报告</w:t>
-      </w:r>
-      <w:r>
-        <w:rPr>
-          <w:i/>
-        </w:rPr>
         <w:t>P. gingivalis</w:t>
       </w:r>
       <w:r>
-        <w:t>相关信号，但不能据此确定方向或因果关系</w:t>
+        <w:t>相关DNA或蛋白信号，但疾病组织中的检出不能确定暴露方向、时间或因果作用</w:t>
       </w:r>
       <w:r>
         <w:t>[5]</w:t>
       </w:r>
       <w:r>
-        <w:t>。小鼠反复口腔暴露可引起神经炎症和淀粉样蛋白相关改变，支持实验合理性，但不能直接外推到人类</w:t>
+        <w:t>。小鼠反复口腔暴露可产生神经炎症、神经退行性和Aβ相关改变，说明特定模型下具有生物学合理性，但不能直接外推至人类</w:t>
       </w:r>
       <w:r>
         <w:t>[6]</w:t>
       </w:r>
       <w:r>
-        <w:t>。囊泡也被提出可运输浓缩微生物货物，但其与人类自然脑暴露的关系仍未解决</w:t>
+        <w:t>。外膜囊泡可能运输浓缩的细菌货物并触发宿主细胞信号，但其在人类自然暴露中的生物分布和有效剂量仍不确定</w:t>
       </w:r>
       <w:r>
         <w:t>[7]</w:t>
       </w:r>
       <w:r>
-        <w:t>。一项孟德尔随机化分析未确认牙周病对AD的遗传因果效应，为强因果表述提供了重要限制</w:t>
+        <w:t>。相反，孟德尔随机化分析未确认牙周病对AD的遗传因果效应，为强因果表述提供了必要限制</w:t>
       </w:r>
       <w:r>
         <w:t>[8]</w:t>
       </w:r>
       <w:r>
-        <w:t>。</w:t>
+        <w:t>。这些结果能够提出分子研究问题，但尚未形成确定的因果通路。</w:t>
       </w:r>
     </w:p>
     <w:p>
@@ -138,19 +217,19 @@
         <w:pStyle w:val="Normal"/>
       </w:pPr>
       <w:r>
-        <w:t>微生物组编码的微肽可能是一类尚未充分研究的分子。人类相关微生物组含有大量保守小基因</w:t>
+        <w:t>微生物组编码的小蛋白和微肽可能构成尚未充分研究的分子中介。人类微生物组大规模分析发现许多保守的小基因家族，其中多数缺少已知结构域或功能</w:t>
       </w:r>
       <w:r>
         <w:t>[9]</w:t>
       </w:r>
       <w:r>
-        <w:t>，专用注释方法能够提高常规流程容易遗漏的smORF检出率</w:t>
+        <w:t>。专用smORF注释通过整合编码特征等信息提高检出灵敏度，而不是沿用常规蛋白长度阈值</w:t>
       </w:r>
       <w:r>
         <w:t>[10]</w:t>
       </w:r>
       <w:r>
-        <w:t>。然而，预测序列不一定被翻译、从生物膜释放、在循环中保持稳定、跨越血脑屏障（BBB）或在神经组织中发挥作用。</w:t>
+        <w:t>。然而，预测smORF不一定被转录或翻译；检出的肽也不一定从生物膜释放、在血液中稳定、跨越血脑屏障（BBB）或在神经组织中发挥作用。</w:t>
       </w:r>
     </w:p>
     <w:p>
@@ -158,16 +237,7 @@
         <w:pStyle w:val="Normal"/>
       </w:pPr>
       <w:r>
-        <w:t>因此，相关机制仍不清楚。本研究旨在采用现代序列模型缩小口腔smORF汇总候选空间，表征现有12条肽，并明确检验AChE、金属/氧化还原、BBB和神经毒性假设所需的后续工作。分析保持探索性，不把任何候选归属于</w:t>
-      </w:r>
-      <w:r>
-        <w:rPr>
-          <w:i/>
-        </w:rPr>
-        <w:t>P. gingivalis</w:t>
-      </w:r>
-      <w:r>
-        <w:t>，也不把模型评分视为生物学确认。</w:t>
+        <w:t>因此，相关分子机制仍不清楚。本研究定位于早期计算优选，而不是机制检验。我们重建汇总候选漏斗，按照实际算法描述各模型架构，表征一份12条序列清单，并限定现有AChE对接评分表的解释范围。研究目标是在不夸大模型输出的前提下缩小候选空间，并形成从序列追溯、独立计算、分子动力学（MD）到实验验证的科学顺序。</w:t>
       </w:r>
     </w:p>
     <w:p>
@@ -185,7 +255,7 @@
         <w:keepNext/>
       </w:pPr>
       <w:r>
-        <w:t>研究设计与数据范围</w:t>
+        <w:t>研究设计与数据来源</w:t>
       </w:r>
     </w:p>
     <w:p>
@@ -193,7 +263,7 @@
         <w:pStyle w:val="Normal"/>
       </w:pPr>
       <w:r>
-        <w:t>本研究为纯计算二次分析，使用汇总筛选计数、一张12条序列表和一张AChE对接评分表。本文未开展参与者招募、标本采集、湿实验、新组学处理、预测器再训练、对接重跑或完整MD分析。完整漏斗的逐行序列、受试者/样本映射、登录号与分组对应关系、分类学信息、肽谱匹配、完整模型输出及对接输入均不可获得。</w:t>
+        <w:t>本研究为纯计算二次分析，使用汇总筛选计数、模型汇总、一张12条序列表及相应AChE对接评分表。本文未开展参与者招募、标本采集、湿实验、新组学处理、预测器再训练或对接重跑；MD轨迹分析作为预设扩展正在进行。所提供的健康与牙周炎标签仅作为分支标签保留，不视为已经核实的候选层面疾病归属。</w:t>
       </w:r>
     </w:p>
     <w:p>
@@ -201,13 +271,21 @@
         <w:pStyle w:val="Normal"/>
       </w:pPr>
       <w:r>
-        <w:t>PRJNA678453被视为配对口腔宏基因组和宏转录组数据的来源项目</w:t>
+        <w:t>我们核查公共登录号背景，以区分来源项目与衍生组装。PRJNA678453是配对口腔宏基因组和宏转录组测量的来源项目</w:t>
       </w:r>
       <w:r>
         <w:t>[11]</w:t>
       </w:r>
       <w:r>
-        <w:t>。PRJEB65451并非独立临床队列，而是由PRJNA678453衍生、使用metaSPAdes v3.15.3组装并由EBI-EMG/MGnify代理的第三方注释宏基因组组装项目。由于缺少一致的映射和bin层面清单，本文不报告具体参与者、标本、组装分析或宏基因组组装基因组总数。</w:t>
+        <w:t>。PRJEB65451并非独立临床队列，而是由PRJNA678453衍生、使用metaSPAdes v3.15.3组装并由EBI-EMG/MGnify代理的第三方注释宏基因组组装项目。由于现有材料不含一致的登录号—分组表、样本—组装映射和bin层面清单，本文省略具体参与者、标本、组装分析和宏基因组组装基因组总数。</w:t>
+      </w:r>
+    </w:p>
+    <w:p>
+      <w:pPr>
+        <w:pStyle w:val="Normal"/>
+      </w:pPr>
+      <w:r>
+        <w:t>现有数据不含完整漏斗的候选核苷酸行、完整肽序列行、基因组坐标、样本映射、分类学归属、肽谱匹配、完整预测器输出或原始发现管线。因此，无法估计参与者层面患病率，不能进行分类学归属和疾病富集检验，也不能重建所有模型阶段之间的精确候选交接。</w:t>
       </w:r>
     </w:p>
     <w:p>
@@ -216,7 +294,7 @@
         <w:keepNext/>
       </w:pPr>
       <w:r>
-        <w:t>候选构建与模型级联</w:t>
+        <w:t>smORF候选定义与序列证据过滤</w:t>
       </w:r>
     </w:p>
     <w:p>
@@ -224,7 +302,7 @@
         <w:pStyle w:val="Normal"/>
       </w:pPr>
       <w:r>
-        <w:t>所提供分析保留编码4–50 aa肽的smORF。健康标记和牙周炎标记起始库分别含11,269,961条和11,721,988条候选。与指定口腔序列和蛋白质组资源精确匹配并去冗余后，分别保留31,510条和33,786条候选。资源匹配被解释为序列支持信息，而不是分析临床分组中真实表达的证明。</w:t>
+        <w:t>所提供分析保留编码4–50 aa肽的翻译smORF。健康标记和牙周炎标记起始库分别包含11,269,961条和11,721,988条候选。候选序列与指定口腔序列和蛋白质组资源进行精确匹配并去冗余，最终保留31,510条健康标记候选和33,786条牙周炎标记候选。精确匹配仅解释为序列存在或曾在相关资源中被观察的支持信息，而不是分析疾病标记分支中真实表达的证明。</w:t>
       </w:r>
     </w:p>
     <w:p>
@@ -232,7 +310,24 @@
         <w:pStyle w:val="Normal"/>
       </w:pPr>
       <w:r>
-        <w:t>UniDL4BioPep采用预训练ESM-2模型</w:t>
+        <w:t>过滤后候选分为短肽（5–30 aa）和长肽（31–50 aa）分支。健康标记分支含30,557条短肽和953条长肽；牙周炎标记分支含32,754条短肽和1,032条长肽。虽然初始定义包括4 aa肽，但下游分箱从5 aa开始，因此无法根据汇总表确定4 aa序列的去向。</w:t>
+      </w:r>
+    </w:p>
+    <w:p>
+      <w:pPr>
+        <w:pStyle w:val="Heading3"/>
+        <w:keepNext/>
+      </w:pPr>
+      <w:r>
+        <w:t>深度学习引导的多模型优选</w:t>
+      </w:r>
+    </w:p>
+    <w:p>
+      <w:pPr>
+        <w:pStyle w:val="Normal"/>
+      </w:pPr>
+      <w:r>
+        <w:t>第一层功能优选采用UniDL4BioPep。该架构使用预训练ESM-2模型</w:t>
       </w:r>
       <w:r>
         <w:rPr>
@@ -242,19 +337,27 @@
         <w:t>esm2_t6_8M_UR50D</w:t>
       </w:r>
       <w:r>
-        <w:t>编码肽序列，产生320维上下文嵌入，再输入六层任务特异性卷积神经网络</w:t>
+        <w:t>把每条肽编码为320维上下文表示，随后输入用于二分类肽活性任务的六层任务特异性卷积神经网络</w:t>
       </w:r>
       <w:r>
         <w:t>[12]</w:t>
       </w:r>
       <w:r>
-        <w:t>。应用阈值为≥0.80，包括BBB优选。NTxPred2随后在文献规定的7–50 aa范围内评价候选，其方法是在神经毒性肽序列上微调ESM2-t30蛋白质语言模型</w:t>
+        <w:t>。包括BBB任务在内均使用≥0.80阈值。由于该极短微生物组肽域缺少校准和实验转运信息，本文把输出称为“BBB高分”，而不是BBB可透过。</w:t>
+      </w:r>
+    </w:p>
+    <w:p>
+      <w:pPr>
+        <w:pStyle w:val="Normal"/>
+      </w:pPr>
+      <w:r>
+        <w:t>牙周炎标记BBB高分集合随后进入NTxPred2肽模式。该模型在神经毒性肽序列上微调ESM2-t30蛋白质语言模型</w:t>
       </w:r>
       <w:r>
         <w:t>[13]</w:t>
       </w:r>
       <w:r>
-        <w:t>。短于7 aa的序列记为模型覆盖范围之外，而不是阴性。</w:t>
+        <w:t>。仅将处于文献规定7–50 aa输入范围的肽视为已评估；更短候选记为超出模型覆盖，而不是阴性。</w:t>
       </w:r>
     </w:p>
     <w:p>
@@ -262,19 +365,27 @@
         <w:pStyle w:val="Normal"/>
       </w:pPr>
       <w:r>
-        <w:t>Mebipred把氨基酸组成、理化描述符和金属结合5-mer频率整合到两级人工神经网络框架中，包括一般和离子特异性分类器</w:t>
+        <w:t>Mebipred评价Cu、Fe和Zn相关结合潜力。与ESM模型不同，mebipred把氨基酸组成、理化描述符和金属结合5-mer频率整合到两级人工神经网络框架中：一般金属结合网络之后连接离子特异性分类器</w:t>
       </w:r>
       <w:r>
         <w:t>[14]</w:t>
       </w:r>
       <w:r>
-        <w:t>，应用阈值为0.50。AnOxPePred使用包含一维卷积、平均池化和256单元全连接层的多任务深度卷积神经网络，产生自由基清除（FRS）和螯合（CHEL）评分</w:t>
+        <w:t>，判定阈值为0.50。</w:t>
+      </w:r>
+    </w:p>
+    <w:p>
+      <w:pPr>
+        <w:pStyle w:val="Normal"/>
+      </w:pPr>
+      <w:r>
+        <w:t>抗氧化相关性质采用多任务深度卷积神经网络AnOxPePred评价。经one-hot编码的肽序列依次通过一维卷积、平均池化和256单元全连接层，产生自由基清除（FRS）和螯合（CHEL）输出</w:t>
       </w:r>
       <w:r>
         <w:t>[15]</w:t>
       </w:r>
       <w:r>
-        <w:t>。分析终点为CHEL≥0.25、CHEL≥0.25且FRS&lt;0.50，以及CHEL≥0.25且FRS&lt;0.45。本研究未重新训练模型，多模型串行一致不视为独立验证。</w:t>
+        <w:t>。保留三个操作终点：CHEL≥0.25；CHEL≥0.25且FRS&lt;0.50；CHEL≥0.25且FRS&lt;0.45。由于多个模型重复利用序列组成且训练终点异质，串行模型一致仅作为计算分流，不视为相互独立的生物学确认。</w:t>
       </w:r>
     </w:p>
     <w:p>
@@ -283,7 +394,7 @@
         <w:keepNext/>
       </w:pPr>
       <w:r>
-        <w:t>序列、对接与前瞻性MD分析</w:t>
+        <w:t>序列表征与对接评分分析</w:t>
       </w:r>
     </w:p>
     <w:p>
@@ -291,7 +402,7 @@
         <w:pStyle w:val="Normal"/>
       </w:pPr>
       <w:r>
-        <w:t>对于另一张12条序列表，我们直接依据字符串重算长度，以及组氨酸、半胱氨酸、Arg+Lys和Phe+Tyr+Trp数量。现有对接汇总描述了人AChE PDB 4EY6的AutoDock Vina 1.2.5评分。本研究仅对均值和标准差进行描述性分析。由于缺少制备结构、PDBQT输入、质子化和电荷设置、精确搜索坐标、运行定义、原始分数、日志、构象和相互作用表，未重跑对接，也不把Vina评分解释为亲和力或自由能。</w:t>
+        <w:t>另一张表包含12条被描述为CHEL/FRS主集合的肽序列。因缺少稳定标识符和序列层面CHEL/FRS输出，无法确认其是否对应汇总终点。我们直接依据字符串重算长度，以及组氨酸、半胱氨酸、碱性残基（Arg+Lys）和芳香残基（Phe+Tyr+Trp）数量，并检查序列唯一性及标准氨基酸组成。</w:t>
       </w:r>
     </w:p>
     <w:p>
@@ -299,19 +410,31 @@
         <w:pStyle w:val="Normal"/>
       </w:pPr>
       <w:r>
-        <w:t>前瞻性100 ns方案用于游离AChE及标记为ALLLHRC、FLLHTTR和YLSLLQR的复合物。计划使用GROMACS</w:t>
+        <w:t>选择AChE作为结构背景，是因为其外周区域与加速Aβ组装有关</w:t>
       </w:r>
       <w:r>
         <w:t>[16]</w:t>
       </w:r>
       <w:r>
-        <w:t>、Amber99SB-ILDN</w:t>
+        <w:t>。PDB 4EY6提供具有配体结合信息的实验测定人AChE结构</w:t>
       </w:r>
       <w:r>
         <w:t>[17]</w:t>
       </w:r>
       <w:r>
-        <w:t>、TIP3P水和0.15 mol/L NaCl，依次开展约束NVT、约束NPT和无约束NPT平衡，随后在300 K、1 bar条件下以2 fs步长进行100 ns生产模拟。计划分析RMSD/RMSF、回转半径、溶剂可及表面积、氢键、残基接触、二级结构、径向分布函数和桥连水。由于起始复合物和完整轨迹不可获得，本文不分析任何MD结果。</w:t>
+        <w:t>。现有对接表描述12条肽的AutoDock Vina 1.2.5评分。Vina适用于初步筛选，但评分受受体制备、配体质子化、初始构象、搜索空间位置、exhaustiveness和随机采样影响</w:t>
+      </w:r>
+      <w:r>
+        <w:t>[18]</w:t>
+      </w:r>
+      <w:r>
+        <w:t>。较新Vina实现扩展了方法，但不能消除这些依赖</w:t>
+      </w:r>
+      <w:r>
+        <w:t>[19]</w:t>
+      </w:r>
+      <w:r>
+        <w:t>。因此，本文仅对均值和标准差进行描述性分析，不把评分换算为亲和力或自由能。制备结构、精确网格中心、运行定义、原始分数、日志、构象和相互作用表均不可获得。</w:t>
       </w:r>
     </w:p>
     <w:p>
@@ -320,6 +443,43 @@
         <w:keepNext/>
       </w:pPr>
       <w:r>
+        <w:t>正在进行的分子动力学扩展</w:t>
+      </w:r>
+    </w:p>
+    <w:p>
+      <w:pPr>
+        <w:pStyle w:val="Normal"/>
+      </w:pPr>
+      <w:r>
+        <w:t>预设的100 ns MD扩展包括游离人AChE以及标记为ALLLHRC、FLLHTTR和YLSLLQR的AChE复合物。计划使用GROMACS</w:t>
+      </w:r>
+      <w:r>
+        <w:t>[20]</w:t>
+      </w:r>
+      <w:r>
+        <w:t>、Amber99SB-ILDN力场</w:t>
+      </w:r>
+      <w:r>
+        <w:t>[21]</w:t>
+      </w:r>
+      <w:r>
+        <w:t>、TIP3P水模型、溶质至盒边界1.0 nm的三斜周期盒，并在中和后加入0.15 mol/L NaCl。能量最小化包括2,000步最速下降及重原子位置约束。平衡过程包括1.0 ns约束NVT升温（10至300 K）、1.0 ns约束NPT平衡和300 K、1 bar条件下1.0 ns无约束NPT平衡。</w:t>
+      </w:r>
+    </w:p>
+    <w:p>
+      <w:pPr>
+        <w:pStyle w:val="Normal"/>
+      </w:pPr>
+      <w:r>
+        <w:t>生产阶段设定为100 ns，步长2 fs；含氢键采用LINCS约束，静电相互作用采用粒子网格Ewald法，温度耦合采用velocity-rescale方法，压力耦合采用Berendsen方法。坐标每20 ps保存一次，即每条轨迹计划得到5,000帧。预设输出包括复合物、AChE和肽层面的RMSD/RMSF、回转半径、溶剂可及表面积、二级结构、径向分布函数、氢键、残基接触及桥连水。轨迹处理与质量控制正在进行；稳定性、收敛性和接触结果将在预设分析完成后补充。</w:t>
+      </w:r>
+    </w:p>
+    <w:p>
+      <w:pPr>
+        <w:pStyle w:val="Heading3"/>
+        <w:keepNext/>
+      </w:pPr>
+      <w:r>
         <w:t>统计分析</w:t>
       </w:r>
     </w:p>
@@ -328,7 +488,7 @@
         <w:pStyle w:val="Normal"/>
       </w:pPr>
       <w:r>
-        <w:t>所有分析均为描述性分析。保留率以前一有明确记录的阶段为分母。候选序列是嵌套于样本、组装、基因组和同源序列组的计算单位，而非独立生物学重复。因此，未开展健康与牙周炎的汇总假设检验，也未计算置信区间和效应量。</w:t>
+        <w:t>当前分析均为描述性分析。保留率使用前一有明确记录的阶段或另行说明的分母。候选序列是嵌套于样本、组装、基因组和同源序列组的计算单位，不是独立生物学重复。因此，汇总肽计数不用于健康与牙周炎假设检验、置信区间或效应量估计。分支求和、分子≤分母约束、NTxPred2已评估/未评估分区、下游单调性、序列唯一性、组成及对接评分顺序均采用确定性方式核对。</w:t>
       </w:r>
     </w:p>
     <w:p>
@@ -346,7 +506,7 @@
         <w:keepNext/>
       </w:pPr>
       <w:r>
-        <w:t>汇总优选漏斗</w:t>
+        <w:t>序列证据过滤与BBB高分输出</w:t>
       </w:r>
     </w:p>
     <w:p>
@@ -354,7 +514,40 @@
         <w:pStyle w:val="Normal"/>
       </w:pPr>
       <w:r>
-        <w:t>序列证据过滤分别保留31,510/11,269,961条健康标记候选（0.2796%）和33,786/11,721,988条牙周炎标记候选（0.2882%）。牙周炎标记分支含3,518条BBB高分输出。NTxPred2评价3,299条，其中923条为模型阳性；另有219条低于规定长度范围。后续筛选得到111条金属结合阳性候选、15条CHEL≥0.25候选、12条CHEL≥0.25且FRS&lt;0.50候选，以及8条CHEL≥0.25且FRS&lt;0.45候选（表1）。由于缺少NTxPred2至mebipred的逐行交接，111/923不被视为已验证转换率。</w:t>
+        <w:t>序列证据过滤分别保留31,510/11,269,961条健康标记候选（0.2796%）和33,786/11,721,988条牙周炎标记候选（0.2882%）。健康标记分支中，3,359/30,557条短肽（10.99%）和40/953条长肽（4.20%）为BBB高分。牙周炎标记分支中，3,446/32,754条短肽（10.52%）和72/1,032条长肽（6.98%）为BBB高分，总计3,518条；其中短肽占97.95%。</w:t>
+      </w:r>
+    </w:p>
+    <w:p>
+      <w:pPr>
+        <w:pStyle w:val="Normal"/>
+      </w:pPr>
+      <w:r>
+        <w:t>所提供牙周炎标记长度汇总包括5–7 aa 547条、8–15 aa 2,893条、16–30 aa 6条以及31–50 aa 72条。因此，优选集合以短序列为主。由于缺少逐行身份，无法评价序列重叠、分类学分布或参与者层面患病率。</w:t>
+      </w:r>
+    </w:p>
+    <w:p>
+      <w:pPr>
+        <w:pStyle w:val="Normal"/>
+      </w:pPr>
+      <w:r>
+        <w:t>广义抗菌输出接近饱和：健康标记短肽中30,537/30,557条（99.93%）、牙周炎标记短肽中32,721/32,754条（99.90%）超过共同0.80阈值。这种近乎普遍的阳性不太可能代表具有实验活性的口腔抗菌肽比例，更可能提示序列域偏移、校准限制或该标签不适合采用共同阈值。</w:t>
+      </w:r>
+    </w:p>
+    <w:p>
+      <w:pPr>
+        <w:pStyle w:val="Heading3"/>
+        <w:keepNext/>
+      </w:pPr>
+      <w:r>
+        <w:t>串行模型优选</w:t>
+      </w:r>
+    </w:p>
+    <w:p>
+      <w:pPr>
+        <w:pStyle w:val="Normal"/>
+      </w:pPr>
+      <w:r>
+        <w:t>NTxPred2评价3,299/3,518条牙周炎标记BBB高分候选（93.77%）；219/3,518条（6.23%）超出规定长度范围。在已评估候选中，923/3,299条（27.98%）为模型阳性。后续汇总筛选依次保留111条mebipred阳性、15条CHEL≥0.25、12条CHEL≥0.25且FRS&lt;0.50，以及8条CHEL≥0.25且FRS&lt;0.45候选（表1）。收紧FRS阈值后保留主集合的8/12（66.67%）。由于缺少候选层面交接数据，111/923不解释为已验证转换率。</w:t>
       </w:r>
     </w:p>
     <w:p>
@@ -409,12 +602,12 @@
           <w:p>
             <w:pPr>
               <w:pStyle w:val="TableText"/>
-              <w:spacing w:before="0" w:after="0" w:line="220" w:lineRule="auto"/>
-            </w:pPr>
-            <w:r>
-              <w:rPr>
-                <w:sz w:val="17"/>
-                <w:szCs w:val="17"/>
+              <w:spacing w:before="0" w:after="0" w:line="240" w:lineRule="auto"/>
+            </w:pPr>
+            <w:r>
+              <w:rPr>
+                <w:sz w:val="20"/>
+                <w:szCs w:val="20"/>
               </w:rPr>
               <w:t>阶段</w:t>
             </w:r>
@@ -431,12 +624,12 @@
           <w:p>
             <w:pPr>
               <w:pStyle w:val="TableText"/>
-              <w:spacing w:before="0" w:after="0" w:line="220" w:lineRule="auto"/>
-            </w:pPr>
-            <w:r>
-              <w:rPr>
-                <w:sz w:val="17"/>
-                <w:szCs w:val="17"/>
+              <w:spacing w:before="0" w:after="0" w:line="240" w:lineRule="auto"/>
+            </w:pPr>
+            <w:r>
+              <w:rPr>
+                <w:sz w:val="20"/>
+                <w:szCs w:val="20"/>
               </w:rPr>
               <w:t>操作规则</w:t>
             </w:r>
@@ -453,12 +646,12 @@
           <w:p>
             <w:pPr>
               <w:pStyle w:val="TableText"/>
-              <w:spacing w:before="0" w:after="0" w:line="220" w:lineRule="auto"/>
-            </w:pPr>
-            <w:r>
-              <w:rPr>
-                <w:sz w:val="17"/>
-                <w:szCs w:val="17"/>
+              <w:spacing w:before="0" w:after="0" w:line="240" w:lineRule="auto"/>
+            </w:pPr>
+            <w:r>
+              <w:rPr>
+                <w:sz w:val="20"/>
+                <w:szCs w:val="20"/>
               </w:rPr>
               <w:t>n</w:t>
             </w:r>
@@ -475,12 +668,12 @@
           <w:p>
             <w:pPr>
               <w:pStyle w:val="TableText"/>
-              <w:spacing w:before="0" w:after="0" w:line="220" w:lineRule="auto"/>
-            </w:pPr>
-            <w:r>
-              <w:rPr>
-                <w:sz w:val="17"/>
-                <w:szCs w:val="17"/>
+              <w:spacing w:before="0" w:after="0" w:line="240" w:lineRule="auto"/>
+            </w:pPr>
+            <w:r>
+              <w:rPr>
+                <w:sz w:val="20"/>
+                <w:szCs w:val="20"/>
               </w:rPr>
               <w:t>分母或限制</w:t>
             </w:r>
@@ -496,12 +689,12 @@
           <w:p>
             <w:pPr>
               <w:pStyle w:val="TableText"/>
-              <w:spacing w:before="0" w:after="0" w:line="220" w:lineRule="auto"/>
-            </w:pPr>
-            <w:r>
-              <w:rPr>
-                <w:sz w:val="17"/>
-                <w:szCs w:val="17"/>
+              <w:spacing w:before="0" w:after="0" w:line="240" w:lineRule="auto"/>
+            </w:pPr>
+            <w:r>
+              <w:rPr>
+                <w:sz w:val="20"/>
+                <w:szCs w:val="20"/>
               </w:rPr>
               <w:t>健康标记smORF</w:t>
             </w:r>
@@ -515,12 +708,12 @@
           <w:p>
             <w:pPr>
               <w:pStyle w:val="TableText"/>
-              <w:spacing w:before="0" w:after="0" w:line="220" w:lineRule="auto"/>
-            </w:pPr>
-            <w:r>
-              <w:rPr>
-                <w:sz w:val="17"/>
-                <w:szCs w:val="17"/>
+              <w:spacing w:before="0" w:after="0" w:line="240" w:lineRule="auto"/>
+            </w:pPr>
+            <w:r>
+              <w:rPr>
+                <w:sz w:val="20"/>
+                <w:szCs w:val="20"/>
               </w:rPr>
               <w:t>4–50 aa</w:t>
             </w:r>
@@ -534,12 +727,12 @@
           <w:p>
             <w:pPr>
               <w:pStyle w:val="TableText"/>
-              <w:spacing w:before="0" w:after="0" w:line="220" w:lineRule="auto"/>
-            </w:pPr>
-            <w:r>
-              <w:rPr>
-                <w:sz w:val="17"/>
-                <w:szCs w:val="17"/>
+              <w:spacing w:before="0" w:after="0" w:line="240" w:lineRule="auto"/>
+            </w:pPr>
+            <w:r>
+              <w:rPr>
+                <w:sz w:val="20"/>
+                <w:szCs w:val="20"/>
               </w:rPr>
               <w:t>11,269,961</w:t>
             </w:r>
@@ -553,12 +746,12 @@
           <w:p>
             <w:pPr>
               <w:pStyle w:val="TableText"/>
-              <w:spacing w:before="0" w:after="0" w:line="220" w:lineRule="auto"/>
-            </w:pPr>
-            <w:r>
-              <w:rPr>
-                <w:sz w:val="17"/>
-                <w:szCs w:val="17"/>
+              <w:spacing w:before="0" w:after="0" w:line="240" w:lineRule="auto"/>
+            </w:pPr>
+            <w:r>
+              <w:rPr>
+                <w:sz w:val="20"/>
+                <w:szCs w:val="20"/>
               </w:rPr>
               <w:t>起始库</w:t>
             </w:r>
@@ -574,12 +767,12 @@
           <w:p>
             <w:pPr>
               <w:pStyle w:val="TableText"/>
-              <w:spacing w:before="0" w:after="0" w:line="220" w:lineRule="auto"/>
-            </w:pPr>
-            <w:r>
-              <w:rPr>
-                <w:sz w:val="17"/>
-                <w:szCs w:val="17"/>
+              <w:spacing w:before="0" w:after="0" w:line="240" w:lineRule="auto"/>
+            </w:pPr>
+            <w:r>
+              <w:rPr>
+                <w:sz w:val="20"/>
+                <w:szCs w:val="20"/>
               </w:rPr>
               <w:t>牙周炎标记smORF</w:t>
             </w:r>
@@ -593,12 +786,12 @@
           <w:p>
             <w:pPr>
               <w:pStyle w:val="TableText"/>
-              <w:spacing w:before="0" w:after="0" w:line="220" w:lineRule="auto"/>
-            </w:pPr>
-            <w:r>
-              <w:rPr>
-                <w:sz w:val="17"/>
-                <w:szCs w:val="17"/>
+              <w:spacing w:before="0" w:after="0" w:line="240" w:lineRule="auto"/>
+            </w:pPr>
+            <w:r>
+              <w:rPr>
+                <w:sz w:val="20"/>
+                <w:szCs w:val="20"/>
               </w:rPr>
               <w:t>4–50 aa</w:t>
             </w:r>
@@ -612,12 +805,12 @@
           <w:p>
             <w:pPr>
               <w:pStyle w:val="TableText"/>
-              <w:spacing w:before="0" w:after="0" w:line="220" w:lineRule="auto"/>
-            </w:pPr>
-            <w:r>
-              <w:rPr>
-                <w:sz w:val="17"/>
-                <w:szCs w:val="17"/>
+              <w:spacing w:before="0" w:after="0" w:line="240" w:lineRule="auto"/>
+            </w:pPr>
+            <w:r>
+              <w:rPr>
+                <w:sz w:val="20"/>
+                <w:szCs w:val="20"/>
               </w:rPr>
               <w:t>11,721,988</w:t>
             </w:r>
@@ -631,12 +824,12 @@
           <w:p>
             <w:pPr>
               <w:pStyle w:val="TableText"/>
-              <w:spacing w:before="0" w:after="0" w:line="220" w:lineRule="auto"/>
-            </w:pPr>
-            <w:r>
-              <w:rPr>
-                <w:sz w:val="17"/>
-                <w:szCs w:val="17"/>
+              <w:spacing w:before="0" w:after="0" w:line="240" w:lineRule="auto"/>
+            </w:pPr>
+            <w:r>
+              <w:rPr>
+                <w:sz w:val="20"/>
+                <w:szCs w:val="20"/>
               </w:rPr>
               <w:t>起始库</w:t>
             </w:r>
@@ -652,12 +845,12 @@
           <w:p>
             <w:pPr>
               <w:pStyle w:val="TableText"/>
-              <w:spacing w:before="0" w:after="0" w:line="220" w:lineRule="auto"/>
-            </w:pPr>
-            <w:r>
-              <w:rPr>
-                <w:sz w:val="17"/>
-                <w:szCs w:val="17"/>
+              <w:spacing w:before="0" w:after="0" w:line="240" w:lineRule="auto"/>
+            </w:pPr>
+            <w:r>
+              <w:rPr>
+                <w:sz w:val="20"/>
+                <w:szCs w:val="20"/>
               </w:rPr>
               <w:t>证据过滤后健康标记候选</w:t>
             </w:r>
@@ -671,12 +864,12 @@
           <w:p>
             <w:pPr>
               <w:pStyle w:val="TableText"/>
-              <w:spacing w:before="0" w:after="0" w:line="220" w:lineRule="auto"/>
-            </w:pPr>
-            <w:r>
-              <w:rPr>
-                <w:sz w:val="17"/>
-                <w:szCs w:val="17"/>
+              <w:spacing w:before="0" w:after="0" w:line="240" w:lineRule="auto"/>
+            </w:pPr>
+            <w:r>
+              <w:rPr>
+                <w:sz w:val="20"/>
+                <w:szCs w:val="20"/>
               </w:rPr>
               <w:t>精确匹配与去冗余</w:t>
             </w:r>
@@ -690,12 +883,12 @@
           <w:p>
             <w:pPr>
               <w:pStyle w:val="TableText"/>
-              <w:spacing w:before="0" w:after="0" w:line="220" w:lineRule="auto"/>
-            </w:pPr>
-            <w:r>
-              <w:rPr>
-                <w:sz w:val="17"/>
-                <w:szCs w:val="17"/>
+              <w:spacing w:before="0" w:after="0" w:line="240" w:lineRule="auto"/>
+            </w:pPr>
+            <w:r>
+              <w:rPr>
+                <w:sz w:val="20"/>
+                <w:szCs w:val="20"/>
               </w:rPr>
               <w:t>31,510</w:t>
             </w:r>
@@ -709,12 +902,12 @@
           <w:p>
             <w:pPr>
               <w:pStyle w:val="TableText"/>
-              <w:spacing w:before="0" w:after="0" w:line="220" w:lineRule="auto"/>
-            </w:pPr>
-            <w:r>
-              <w:rPr>
-                <w:sz w:val="17"/>
-                <w:szCs w:val="17"/>
+              <w:spacing w:before="0" w:after="0" w:line="240" w:lineRule="auto"/>
+            </w:pPr>
+            <w:r>
+              <w:rPr>
+                <w:sz w:val="20"/>
+                <w:szCs w:val="20"/>
               </w:rPr>
               <w:t>11,269,961</w:t>
             </w:r>
@@ -730,12 +923,12 @@
           <w:p>
             <w:pPr>
               <w:pStyle w:val="TableText"/>
-              <w:spacing w:before="0" w:after="0" w:line="220" w:lineRule="auto"/>
-            </w:pPr>
-            <w:r>
-              <w:rPr>
-                <w:sz w:val="17"/>
-                <w:szCs w:val="17"/>
+              <w:spacing w:before="0" w:after="0" w:line="240" w:lineRule="auto"/>
+            </w:pPr>
+            <w:r>
+              <w:rPr>
+                <w:sz w:val="20"/>
+                <w:szCs w:val="20"/>
               </w:rPr>
               <w:t>证据过滤后牙周炎标记候选</w:t>
             </w:r>
@@ -749,12 +942,12 @@
           <w:p>
             <w:pPr>
               <w:pStyle w:val="TableText"/>
-              <w:spacing w:before="0" w:after="0" w:line="220" w:lineRule="auto"/>
-            </w:pPr>
-            <w:r>
-              <w:rPr>
-                <w:sz w:val="17"/>
-                <w:szCs w:val="17"/>
+              <w:spacing w:before="0" w:after="0" w:line="240" w:lineRule="auto"/>
+            </w:pPr>
+            <w:r>
+              <w:rPr>
+                <w:sz w:val="20"/>
+                <w:szCs w:val="20"/>
               </w:rPr>
               <w:t>精确匹配与去冗余</w:t>
             </w:r>
@@ -768,12 +961,12 @@
           <w:p>
             <w:pPr>
               <w:pStyle w:val="TableText"/>
-              <w:spacing w:before="0" w:after="0" w:line="220" w:lineRule="auto"/>
-            </w:pPr>
-            <w:r>
-              <w:rPr>
-                <w:sz w:val="17"/>
-                <w:szCs w:val="17"/>
+              <w:spacing w:before="0" w:after="0" w:line="240" w:lineRule="auto"/>
+            </w:pPr>
+            <w:r>
+              <w:rPr>
+                <w:sz w:val="20"/>
+                <w:szCs w:val="20"/>
               </w:rPr>
               <w:t>33,786</w:t>
             </w:r>
@@ -787,12 +980,12 @@
           <w:p>
             <w:pPr>
               <w:pStyle w:val="TableText"/>
-              <w:spacing w:before="0" w:after="0" w:line="220" w:lineRule="auto"/>
-            </w:pPr>
-            <w:r>
-              <w:rPr>
-                <w:sz w:val="17"/>
-                <w:szCs w:val="17"/>
+              <w:spacing w:before="0" w:after="0" w:line="240" w:lineRule="auto"/>
+            </w:pPr>
+            <w:r>
+              <w:rPr>
+                <w:sz w:val="20"/>
+                <w:szCs w:val="20"/>
               </w:rPr>
               <w:t>11,721,988</w:t>
             </w:r>
@@ -808,71 +1001,71 @@
           <w:p>
             <w:pPr>
               <w:pStyle w:val="TableText"/>
-              <w:spacing w:before="0" w:after="0" w:line="220" w:lineRule="auto"/>
-            </w:pPr>
-            <w:r>
-              <w:rPr>
-                <w:sz w:val="17"/>
-                <w:szCs w:val="17"/>
-              </w:rPr>
-              <w:t>BBB高分</w:t>
-            </w:r>
-          </w:p>
-        </w:tc>
-        <w:tc>
-          <w:tcPr>
-            <w:tcW w:w="2340" w:type="dxa"/>
-            <w:vAlign w:val="center"/>
-          </w:tcPr>
-          <w:p>
-            <w:pPr>
-              <w:pStyle w:val="TableText"/>
-              <w:spacing w:before="0" w:after="0" w:line="220" w:lineRule="auto"/>
-            </w:pPr>
-            <w:r>
-              <w:rPr>
-                <w:sz w:val="17"/>
-                <w:szCs w:val="17"/>
-              </w:rPr>
-              <w:t>UniDL4BioPep输出≥0.80</w:t>
-            </w:r>
-          </w:p>
-        </w:tc>
-        <w:tc>
-          <w:tcPr>
-            <w:tcW w:w="2340" w:type="dxa"/>
-            <w:vAlign w:val="center"/>
-          </w:tcPr>
-          <w:p>
-            <w:pPr>
-              <w:pStyle w:val="TableText"/>
-              <w:spacing w:before="0" w:after="0" w:line="220" w:lineRule="auto"/>
-            </w:pPr>
-            <w:r>
-              <w:rPr>
-                <w:sz w:val="17"/>
-                <w:szCs w:val="17"/>
-              </w:rPr>
-              <w:t>3,518</w:t>
-            </w:r>
-          </w:p>
-        </w:tc>
-        <w:tc>
-          <w:tcPr>
-            <w:tcW w:w="2340" w:type="dxa"/>
-            <w:vAlign w:val="center"/>
-          </w:tcPr>
-          <w:p>
-            <w:pPr>
-              <w:pStyle w:val="TableText"/>
-              <w:spacing w:before="0" w:after="0" w:line="220" w:lineRule="auto"/>
-            </w:pPr>
-            <w:r>
-              <w:rPr>
-                <w:sz w:val="17"/>
-                <w:szCs w:val="17"/>
-              </w:rPr>
-              <w:t>牙周炎标记分支</w:t>
+              <w:spacing w:before="0" w:after="0" w:line="240" w:lineRule="auto"/>
+            </w:pPr>
+            <w:r>
+              <w:rPr>
+                <w:sz w:val="20"/>
+                <w:szCs w:val="20"/>
+              </w:rPr>
+              <w:t>短肽BBB高分</w:t>
+            </w:r>
+          </w:p>
+        </w:tc>
+        <w:tc>
+          <w:tcPr>
+            <w:tcW w:w="2340" w:type="dxa"/>
+            <w:vAlign w:val="center"/>
+          </w:tcPr>
+          <w:p>
+            <w:pPr>
+              <w:pStyle w:val="TableText"/>
+              <w:spacing w:before="0" w:after="0" w:line="240" w:lineRule="auto"/>
+            </w:pPr>
+            <w:r>
+              <w:rPr>
+                <w:sz w:val="20"/>
+                <w:szCs w:val="20"/>
+              </w:rPr>
+              <w:t>UniDL4BioPep输出≥0.80；5–30 aa</w:t>
+            </w:r>
+          </w:p>
+        </w:tc>
+        <w:tc>
+          <w:tcPr>
+            <w:tcW w:w="2340" w:type="dxa"/>
+            <w:vAlign w:val="center"/>
+          </w:tcPr>
+          <w:p>
+            <w:pPr>
+              <w:pStyle w:val="TableText"/>
+              <w:spacing w:before="0" w:after="0" w:line="240" w:lineRule="auto"/>
+            </w:pPr>
+            <w:r>
+              <w:rPr>
+                <w:sz w:val="20"/>
+                <w:szCs w:val="20"/>
+              </w:rPr>
+              <w:t>3,446</w:t>
+            </w:r>
+          </w:p>
+        </w:tc>
+        <w:tc>
+          <w:tcPr>
+            <w:tcW w:w="2340" w:type="dxa"/>
+            <w:vAlign w:val="center"/>
+          </w:tcPr>
+          <w:p>
+            <w:pPr>
+              <w:pStyle w:val="TableText"/>
+              <w:spacing w:before="0" w:after="0" w:line="240" w:lineRule="auto"/>
+            </w:pPr>
+            <w:r>
+              <w:rPr>
+                <w:sz w:val="20"/>
+                <w:szCs w:val="20"/>
+              </w:rPr>
+              <w:t>32,754</w:t>
             </w:r>
           </w:p>
         </w:tc>
@@ -886,71 +1079,71 @@
           <w:p>
             <w:pPr>
               <w:pStyle w:val="TableText"/>
-              <w:spacing w:before="0" w:after="0" w:line="220" w:lineRule="auto"/>
-            </w:pPr>
-            <w:r>
-              <w:rPr>
-                <w:sz w:val="17"/>
-                <w:szCs w:val="17"/>
-              </w:rPr>
-              <w:t>NTxPred2已评估</w:t>
-            </w:r>
-          </w:p>
-        </w:tc>
-        <w:tc>
-          <w:tcPr>
-            <w:tcW w:w="2340" w:type="dxa"/>
-            <w:vAlign w:val="center"/>
-          </w:tcPr>
-          <w:p>
-            <w:pPr>
-              <w:pStyle w:val="TableText"/>
-              <w:spacing w:before="0" w:after="0" w:line="220" w:lineRule="auto"/>
-            </w:pPr>
-            <w:r>
-              <w:rPr>
-                <w:sz w:val="17"/>
-                <w:szCs w:val="17"/>
-              </w:rPr>
-              <w:t>7–50 aa</w:t>
-            </w:r>
-          </w:p>
-        </w:tc>
-        <w:tc>
-          <w:tcPr>
-            <w:tcW w:w="2340" w:type="dxa"/>
-            <w:vAlign w:val="center"/>
-          </w:tcPr>
-          <w:p>
-            <w:pPr>
-              <w:pStyle w:val="TableText"/>
-              <w:spacing w:before="0" w:after="0" w:line="220" w:lineRule="auto"/>
-            </w:pPr>
-            <w:r>
-              <w:rPr>
-                <w:sz w:val="17"/>
-                <w:szCs w:val="17"/>
-              </w:rPr>
-              <w:t>3,299</w:t>
-            </w:r>
-          </w:p>
-        </w:tc>
-        <w:tc>
-          <w:tcPr>
-            <w:tcW w:w="2340" w:type="dxa"/>
-            <w:vAlign w:val="center"/>
-          </w:tcPr>
-          <w:p>
-            <w:pPr>
-              <w:pStyle w:val="TableText"/>
-              <w:spacing w:before="0" w:after="0" w:line="220" w:lineRule="auto"/>
-            </w:pPr>
-            <w:r>
-              <w:rPr>
-                <w:sz w:val="17"/>
-                <w:szCs w:val="17"/>
-              </w:rPr>
-              <w:t>3,518</w:t>
+              <w:spacing w:before="0" w:after="0" w:line="240" w:lineRule="auto"/>
+            </w:pPr>
+            <w:r>
+              <w:rPr>
+                <w:sz w:val="20"/>
+                <w:szCs w:val="20"/>
+              </w:rPr>
+              <w:t>长肽BBB高分</w:t>
+            </w:r>
+          </w:p>
+        </w:tc>
+        <w:tc>
+          <w:tcPr>
+            <w:tcW w:w="2340" w:type="dxa"/>
+            <w:vAlign w:val="center"/>
+          </w:tcPr>
+          <w:p>
+            <w:pPr>
+              <w:pStyle w:val="TableText"/>
+              <w:spacing w:before="0" w:after="0" w:line="240" w:lineRule="auto"/>
+            </w:pPr>
+            <w:r>
+              <w:rPr>
+                <w:sz w:val="20"/>
+                <w:szCs w:val="20"/>
+              </w:rPr>
+              <w:t>UniDL4BioPep输出≥0.80；31–50 aa</w:t>
+            </w:r>
+          </w:p>
+        </w:tc>
+        <w:tc>
+          <w:tcPr>
+            <w:tcW w:w="2340" w:type="dxa"/>
+            <w:vAlign w:val="center"/>
+          </w:tcPr>
+          <w:p>
+            <w:pPr>
+              <w:pStyle w:val="TableText"/>
+              <w:spacing w:before="0" w:after="0" w:line="240" w:lineRule="auto"/>
+            </w:pPr>
+            <w:r>
+              <w:rPr>
+                <w:sz w:val="20"/>
+                <w:szCs w:val="20"/>
+              </w:rPr>
+              <w:t>72</w:t>
+            </w:r>
+          </w:p>
+        </w:tc>
+        <w:tc>
+          <w:tcPr>
+            <w:tcW w:w="2340" w:type="dxa"/>
+            <w:vAlign w:val="center"/>
+          </w:tcPr>
+          <w:p>
+            <w:pPr>
+              <w:pStyle w:val="TableText"/>
+              <w:spacing w:before="0" w:after="0" w:line="240" w:lineRule="auto"/>
+            </w:pPr>
+            <w:r>
+              <w:rPr>
+                <w:sz w:val="20"/>
+                <w:szCs w:val="20"/>
+              </w:rPr>
+              <w:t>1,032</w:t>
             </w:r>
           </w:p>
         </w:tc>
@@ -964,71 +1157,71 @@
           <w:p>
             <w:pPr>
               <w:pStyle w:val="TableText"/>
-              <w:spacing w:before="0" w:after="0" w:line="220" w:lineRule="auto"/>
-            </w:pPr>
-            <w:r>
-              <w:rPr>
-                <w:sz w:val="17"/>
-                <w:szCs w:val="17"/>
-              </w:rPr>
-              <w:t>NTxPred2阳性</w:t>
-            </w:r>
-          </w:p>
-        </w:tc>
-        <w:tc>
-          <w:tcPr>
-            <w:tcW w:w="2340" w:type="dxa"/>
-            <w:vAlign w:val="center"/>
-          </w:tcPr>
-          <w:p>
-            <w:pPr>
-              <w:pStyle w:val="TableText"/>
-              <w:spacing w:before="0" w:after="0" w:line="220" w:lineRule="auto"/>
-            </w:pPr>
-            <w:r>
-              <w:rPr>
-                <w:sz w:val="17"/>
-                <w:szCs w:val="17"/>
-              </w:rPr>
-              <w:t>模型阳性标签</w:t>
-            </w:r>
-          </w:p>
-        </w:tc>
-        <w:tc>
-          <w:tcPr>
-            <w:tcW w:w="2340" w:type="dxa"/>
-            <w:vAlign w:val="center"/>
-          </w:tcPr>
-          <w:p>
-            <w:pPr>
-              <w:pStyle w:val="TableText"/>
-              <w:spacing w:before="0" w:after="0" w:line="220" w:lineRule="auto"/>
-            </w:pPr>
-            <w:r>
-              <w:rPr>
-                <w:sz w:val="17"/>
-                <w:szCs w:val="17"/>
-              </w:rPr>
-              <w:t>923</w:t>
-            </w:r>
-          </w:p>
-        </w:tc>
-        <w:tc>
-          <w:tcPr>
-            <w:tcW w:w="2340" w:type="dxa"/>
-            <w:vAlign w:val="center"/>
-          </w:tcPr>
-          <w:p>
-            <w:pPr>
-              <w:pStyle w:val="TableText"/>
-              <w:spacing w:before="0" w:after="0" w:line="220" w:lineRule="auto"/>
-            </w:pPr>
-            <w:r>
-              <w:rPr>
-                <w:sz w:val="17"/>
-                <w:szCs w:val="17"/>
-              </w:rPr>
-              <w:t>3,299</w:t>
+              <w:spacing w:before="0" w:after="0" w:line="240" w:lineRule="auto"/>
+            </w:pPr>
+            <w:r>
+              <w:rPr>
+                <w:sz w:val="20"/>
+                <w:szCs w:val="20"/>
+              </w:rPr>
+              <w:t>BBB高分总计</w:t>
+            </w:r>
+          </w:p>
+        </w:tc>
+        <w:tc>
+          <w:tcPr>
+            <w:tcW w:w="2340" w:type="dxa"/>
+            <w:vAlign w:val="center"/>
+          </w:tcPr>
+          <w:p>
+            <w:pPr>
+              <w:pStyle w:val="TableText"/>
+              <w:spacing w:before="0" w:after="0" w:line="240" w:lineRule="auto"/>
+            </w:pPr>
+            <w:r>
+              <w:rPr>
+                <w:sz w:val="20"/>
+                <w:szCs w:val="20"/>
+              </w:rPr>
+              <w:t>短肽+长肽</w:t>
+            </w:r>
+          </w:p>
+        </w:tc>
+        <w:tc>
+          <w:tcPr>
+            <w:tcW w:w="2340" w:type="dxa"/>
+            <w:vAlign w:val="center"/>
+          </w:tcPr>
+          <w:p>
+            <w:pPr>
+              <w:pStyle w:val="TableText"/>
+              <w:spacing w:before="0" w:after="0" w:line="240" w:lineRule="auto"/>
+            </w:pPr>
+            <w:r>
+              <w:rPr>
+                <w:sz w:val="20"/>
+                <w:szCs w:val="20"/>
+              </w:rPr>
+              <w:t>3,518</w:t>
+            </w:r>
+          </w:p>
+        </w:tc>
+        <w:tc>
+          <w:tcPr>
+            <w:tcW w:w="2340" w:type="dxa"/>
+            <w:vAlign w:val="center"/>
+          </w:tcPr>
+          <w:p>
+            <w:pPr>
+              <w:pStyle w:val="TableText"/>
+              <w:spacing w:before="0" w:after="0" w:line="240" w:lineRule="auto"/>
+            </w:pPr>
+            <w:r>
+              <w:rPr>
+                <w:sz w:val="20"/>
+                <w:szCs w:val="20"/>
+              </w:rPr>
+              <w:t>算术和</w:t>
             </w:r>
           </w:p>
         </w:tc>
@@ -1042,71 +1235,71 @@
           <w:p>
             <w:pPr>
               <w:pStyle w:val="TableText"/>
-              <w:spacing w:before="0" w:after="0" w:line="220" w:lineRule="auto"/>
-            </w:pPr>
-            <w:r>
-              <w:rPr>
-                <w:sz w:val="17"/>
-                <w:szCs w:val="17"/>
-              </w:rPr>
-              <w:t>金属结合阳性</w:t>
-            </w:r>
-          </w:p>
-        </w:tc>
-        <w:tc>
-          <w:tcPr>
-            <w:tcW w:w="2340" w:type="dxa"/>
-            <w:vAlign w:val="center"/>
-          </w:tcPr>
-          <w:p>
-            <w:pPr>
-              <w:pStyle w:val="TableText"/>
-              <w:spacing w:before="0" w:after="0" w:line="220" w:lineRule="auto"/>
-            </w:pPr>
-            <w:r>
-              <w:rPr>
-                <w:sz w:val="17"/>
-                <w:szCs w:val="17"/>
-              </w:rPr>
-              <w:t>Mebipred输出≥0.50</w:t>
-            </w:r>
-          </w:p>
-        </w:tc>
-        <w:tc>
-          <w:tcPr>
-            <w:tcW w:w="2340" w:type="dxa"/>
-            <w:vAlign w:val="center"/>
-          </w:tcPr>
-          <w:p>
-            <w:pPr>
-              <w:pStyle w:val="TableText"/>
-              <w:spacing w:before="0" w:after="0" w:line="220" w:lineRule="auto"/>
-            </w:pPr>
-            <w:r>
-              <w:rPr>
-                <w:sz w:val="17"/>
-                <w:szCs w:val="17"/>
-              </w:rPr>
-              <w:t>111</w:t>
-            </w:r>
-          </w:p>
-        </w:tc>
-        <w:tc>
-          <w:tcPr>
-            <w:tcW w:w="2340" w:type="dxa"/>
-            <w:vAlign w:val="center"/>
-          </w:tcPr>
-          <w:p>
-            <w:pPr>
-              <w:pStyle w:val="TableText"/>
-              <w:spacing w:before="0" w:after="0" w:line="220" w:lineRule="auto"/>
-            </w:pPr>
-            <w:r>
-              <w:rPr>
-                <w:sz w:val="17"/>
-                <w:szCs w:val="17"/>
-              </w:rPr>
-              <w:t>逐行交接不可获得</w:t>
+              <w:spacing w:before="0" w:after="0" w:line="240" w:lineRule="auto"/>
+            </w:pPr>
+            <w:r>
+              <w:rPr>
+                <w:sz w:val="20"/>
+                <w:szCs w:val="20"/>
+              </w:rPr>
+              <w:t>NTxPred2已评估</w:t>
+            </w:r>
+          </w:p>
+        </w:tc>
+        <w:tc>
+          <w:tcPr>
+            <w:tcW w:w="2340" w:type="dxa"/>
+            <w:vAlign w:val="center"/>
+          </w:tcPr>
+          <w:p>
+            <w:pPr>
+              <w:pStyle w:val="TableText"/>
+              <w:spacing w:before="0" w:after="0" w:line="240" w:lineRule="auto"/>
+            </w:pPr>
+            <w:r>
+              <w:rPr>
+                <w:sz w:val="20"/>
+                <w:szCs w:val="20"/>
+              </w:rPr>
+              <w:t>7–50 aa</w:t>
+            </w:r>
+          </w:p>
+        </w:tc>
+        <w:tc>
+          <w:tcPr>
+            <w:tcW w:w="2340" w:type="dxa"/>
+            <w:vAlign w:val="center"/>
+          </w:tcPr>
+          <w:p>
+            <w:pPr>
+              <w:pStyle w:val="TableText"/>
+              <w:spacing w:before="0" w:after="0" w:line="240" w:lineRule="auto"/>
+            </w:pPr>
+            <w:r>
+              <w:rPr>
+                <w:sz w:val="20"/>
+                <w:szCs w:val="20"/>
+              </w:rPr>
+              <w:t>3,299</w:t>
+            </w:r>
+          </w:p>
+        </w:tc>
+        <w:tc>
+          <w:tcPr>
+            <w:tcW w:w="2340" w:type="dxa"/>
+            <w:vAlign w:val="center"/>
+          </w:tcPr>
+          <w:p>
+            <w:pPr>
+              <w:pStyle w:val="TableText"/>
+              <w:spacing w:before="0" w:after="0" w:line="240" w:lineRule="auto"/>
+            </w:pPr>
+            <w:r>
+              <w:rPr>
+                <w:sz w:val="20"/>
+                <w:szCs w:val="20"/>
+              </w:rPr>
+              <w:t>3,518</w:t>
             </w:r>
           </w:p>
         </w:tc>
@@ -1120,71 +1313,71 @@
           <w:p>
             <w:pPr>
               <w:pStyle w:val="TableText"/>
-              <w:spacing w:before="0" w:after="0" w:line="220" w:lineRule="auto"/>
-            </w:pPr>
-            <w:r>
-              <w:rPr>
-                <w:sz w:val="17"/>
-                <w:szCs w:val="17"/>
-              </w:rPr>
-              <w:t>CHEL优先</w:t>
-            </w:r>
-          </w:p>
-        </w:tc>
-        <w:tc>
-          <w:tcPr>
-            <w:tcW w:w="2340" w:type="dxa"/>
-            <w:vAlign w:val="center"/>
-          </w:tcPr>
-          <w:p>
-            <w:pPr>
-              <w:pStyle w:val="TableText"/>
-              <w:spacing w:before="0" w:after="0" w:line="220" w:lineRule="auto"/>
-            </w:pPr>
-            <w:r>
-              <w:rPr>
-                <w:sz w:val="17"/>
-                <w:szCs w:val="17"/>
-              </w:rPr>
-              <w:t>CHEL≥0.25</w:t>
-            </w:r>
-          </w:p>
-        </w:tc>
-        <w:tc>
-          <w:tcPr>
-            <w:tcW w:w="2340" w:type="dxa"/>
-            <w:vAlign w:val="center"/>
-          </w:tcPr>
-          <w:p>
-            <w:pPr>
-              <w:pStyle w:val="TableText"/>
-              <w:spacing w:before="0" w:after="0" w:line="220" w:lineRule="auto"/>
-            </w:pPr>
-            <w:r>
-              <w:rPr>
-                <w:sz w:val="17"/>
-                <w:szCs w:val="17"/>
-              </w:rPr>
-              <w:t>15</w:t>
-            </w:r>
-          </w:p>
-        </w:tc>
-        <w:tc>
-          <w:tcPr>
-            <w:tcW w:w="2340" w:type="dxa"/>
-            <w:vAlign w:val="center"/>
-          </w:tcPr>
-          <w:p>
-            <w:pPr>
-              <w:pStyle w:val="TableText"/>
-              <w:spacing w:before="0" w:after="0" w:line="220" w:lineRule="auto"/>
-            </w:pPr>
-            <w:r>
-              <w:rPr>
-                <w:sz w:val="17"/>
-                <w:szCs w:val="17"/>
-              </w:rPr>
-              <w:t>111</w:t>
+              <w:spacing w:before="0" w:after="0" w:line="240" w:lineRule="auto"/>
+            </w:pPr>
+            <w:r>
+              <w:rPr>
+                <w:sz w:val="20"/>
+                <w:szCs w:val="20"/>
+              </w:rPr>
+              <w:t>NTxPred2阳性</w:t>
+            </w:r>
+          </w:p>
+        </w:tc>
+        <w:tc>
+          <w:tcPr>
+            <w:tcW w:w="2340" w:type="dxa"/>
+            <w:vAlign w:val="center"/>
+          </w:tcPr>
+          <w:p>
+            <w:pPr>
+              <w:pStyle w:val="TableText"/>
+              <w:spacing w:before="0" w:after="0" w:line="240" w:lineRule="auto"/>
+            </w:pPr>
+            <w:r>
+              <w:rPr>
+                <w:sz w:val="20"/>
+                <w:szCs w:val="20"/>
+              </w:rPr>
+              <w:t>模型阳性标签</w:t>
+            </w:r>
+          </w:p>
+        </w:tc>
+        <w:tc>
+          <w:tcPr>
+            <w:tcW w:w="2340" w:type="dxa"/>
+            <w:vAlign w:val="center"/>
+          </w:tcPr>
+          <w:p>
+            <w:pPr>
+              <w:pStyle w:val="TableText"/>
+              <w:spacing w:before="0" w:after="0" w:line="240" w:lineRule="auto"/>
+            </w:pPr>
+            <w:r>
+              <w:rPr>
+                <w:sz w:val="20"/>
+                <w:szCs w:val="20"/>
+              </w:rPr>
+              <w:t>923</w:t>
+            </w:r>
+          </w:p>
+        </w:tc>
+        <w:tc>
+          <w:tcPr>
+            <w:tcW w:w="2340" w:type="dxa"/>
+            <w:vAlign w:val="center"/>
+          </w:tcPr>
+          <w:p>
+            <w:pPr>
+              <w:pStyle w:val="TableText"/>
+              <w:spacing w:before="0" w:after="0" w:line="240" w:lineRule="auto"/>
+            </w:pPr>
+            <w:r>
+              <w:rPr>
+                <w:sz w:val="20"/>
+                <w:szCs w:val="20"/>
+              </w:rPr>
+              <w:t>3,299</w:t>
             </w:r>
           </w:p>
         </w:tc>
@@ -1198,71 +1391,71 @@
           <w:p>
             <w:pPr>
               <w:pStyle w:val="TableText"/>
-              <w:spacing w:before="0" w:after="0" w:line="220" w:lineRule="auto"/>
-            </w:pPr>
-            <w:r>
-              <w:rPr>
-                <w:sz w:val="17"/>
-                <w:szCs w:val="17"/>
-              </w:rPr>
-              <w:t>主集合</w:t>
-            </w:r>
-          </w:p>
-        </w:tc>
-        <w:tc>
-          <w:tcPr>
-            <w:tcW w:w="2340" w:type="dxa"/>
-            <w:vAlign w:val="center"/>
-          </w:tcPr>
-          <w:p>
-            <w:pPr>
-              <w:pStyle w:val="TableText"/>
-              <w:spacing w:before="0" w:after="0" w:line="220" w:lineRule="auto"/>
-            </w:pPr>
-            <w:r>
-              <w:rPr>
-                <w:sz w:val="17"/>
-                <w:szCs w:val="17"/>
-              </w:rPr>
-              <w:t>CHEL≥0.25且FRS&lt;0.50</w:t>
-            </w:r>
-          </w:p>
-        </w:tc>
-        <w:tc>
-          <w:tcPr>
-            <w:tcW w:w="2340" w:type="dxa"/>
-            <w:vAlign w:val="center"/>
-          </w:tcPr>
-          <w:p>
-            <w:pPr>
-              <w:pStyle w:val="TableText"/>
-              <w:spacing w:before="0" w:after="0" w:line="220" w:lineRule="auto"/>
-            </w:pPr>
-            <w:r>
-              <w:rPr>
-                <w:sz w:val="17"/>
-                <w:szCs w:val="17"/>
-              </w:rPr>
-              <w:t>12</w:t>
-            </w:r>
-          </w:p>
-        </w:tc>
-        <w:tc>
-          <w:tcPr>
-            <w:tcW w:w="2340" w:type="dxa"/>
-            <w:vAlign w:val="center"/>
-          </w:tcPr>
-          <w:p>
-            <w:pPr>
-              <w:pStyle w:val="TableText"/>
-              <w:spacing w:before="0" w:after="0" w:line="220" w:lineRule="auto"/>
-            </w:pPr>
-            <w:r>
-              <w:rPr>
-                <w:sz w:val="17"/>
-                <w:szCs w:val="17"/>
+              <w:spacing w:before="0" w:after="0" w:line="240" w:lineRule="auto"/>
+            </w:pPr>
+            <w:r>
+              <w:rPr>
+                <w:sz w:val="20"/>
+                <w:szCs w:val="20"/>
+              </w:rPr>
+              <w:t>金属结合阳性</w:t>
+            </w:r>
+          </w:p>
+        </w:tc>
+        <w:tc>
+          <w:tcPr>
+            <w:tcW w:w="2340" w:type="dxa"/>
+            <w:vAlign w:val="center"/>
+          </w:tcPr>
+          <w:p>
+            <w:pPr>
+              <w:pStyle w:val="TableText"/>
+              <w:spacing w:before="0" w:after="0" w:line="240" w:lineRule="auto"/>
+            </w:pPr>
+            <w:r>
+              <w:rPr>
+                <w:sz w:val="20"/>
+                <w:szCs w:val="20"/>
+              </w:rPr>
+              <w:t>Mebipred输出≥0.50</w:t>
+            </w:r>
+          </w:p>
+        </w:tc>
+        <w:tc>
+          <w:tcPr>
+            <w:tcW w:w="2340" w:type="dxa"/>
+            <w:vAlign w:val="center"/>
+          </w:tcPr>
+          <w:p>
+            <w:pPr>
+              <w:pStyle w:val="TableText"/>
+              <w:spacing w:before="0" w:after="0" w:line="240" w:lineRule="auto"/>
+            </w:pPr>
+            <w:r>
+              <w:rPr>
+                <w:sz w:val="20"/>
+                <w:szCs w:val="20"/>
               </w:rPr>
               <w:t>111</w:t>
+            </w:r>
+          </w:p>
+        </w:tc>
+        <w:tc>
+          <w:tcPr>
+            <w:tcW w:w="2340" w:type="dxa"/>
+            <w:vAlign w:val="center"/>
+          </w:tcPr>
+          <w:p>
+            <w:pPr>
+              <w:pStyle w:val="TableText"/>
+              <w:spacing w:before="0" w:after="0" w:line="240" w:lineRule="auto"/>
+            </w:pPr>
+            <w:r>
+              <w:rPr>
+                <w:sz w:val="20"/>
+                <w:szCs w:val="20"/>
+              </w:rPr>
+              <w:t>逐行交接不可获得</w:t>
             </w:r>
           </w:p>
         </w:tc>
@@ -1276,12 +1469,168 @@
           <w:p>
             <w:pPr>
               <w:pStyle w:val="TableText"/>
-              <w:spacing w:before="0" w:after="0" w:line="220" w:lineRule="auto"/>
-            </w:pPr>
-            <w:r>
-              <w:rPr>
-                <w:sz w:val="17"/>
-                <w:szCs w:val="17"/>
+              <w:spacing w:before="0" w:after="0" w:line="240" w:lineRule="auto"/>
+            </w:pPr>
+            <w:r>
+              <w:rPr>
+                <w:sz w:val="20"/>
+                <w:szCs w:val="20"/>
+              </w:rPr>
+              <w:t>CHEL优先</w:t>
+            </w:r>
+          </w:p>
+        </w:tc>
+        <w:tc>
+          <w:tcPr>
+            <w:tcW w:w="2340" w:type="dxa"/>
+            <w:vAlign w:val="center"/>
+          </w:tcPr>
+          <w:p>
+            <w:pPr>
+              <w:pStyle w:val="TableText"/>
+              <w:spacing w:before="0" w:after="0" w:line="240" w:lineRule="auto"/>
+            </w:pPr>
+            <w:r>
+              <w:rPr>
+                <w:sz w:val="20"/>
+                <w:szCs w:val="20"/>
+              </w:rPr>
+              <w:t>CHEL≥0.25</w:t>
+            </w:r>
+          </w:p>
+        </w:tc>
+        <w:tc>
+          <w:tcPr>
+            <w:tcW w:w="2340" w:type="dxa"/>
+            <w:vAlign w:val="center"/>
+          </w:tcPr>
+          <w:p>
+            <w:pPr>
+              <w:pStyle w:val="TableText"/>
+              <w:spacing w:before="0" w:after="0" w:line="240" w:lineRule="auto"/>
+            </w:pPr>
+            <w:r>
+              <w:rPr>
+                <w:sz w:val="20"/>
+                <w:szCs w:val="20"/>
+              </w:rPr>
+              <w:t>15</w:t>
+            </w:r>
+          </w:p>
+        </w:tc>
+        <w:tc>
+          <w:tcPr>
+            <w:tcW w:w="2340" w:type="dxa"/>
+            <w:vAlign w:val="center"/>
+          </w:tcPr>
+          <w:p>
+            <w:pPr>
+              <w:pStyle w:val="TableText"/>
+              <w:spacing w:before="0" w:after="0" w:line="240" w:lineRule="auto"/>
+            </w:pPr>
+            <w:r>
+              <w:rPr>
+                <w:sz w:val="20"/>
+                <w:szCs w:val="20"/>
+              </w:rPr>
+              <w:t>111</w:t>
+            </w:r>
+          </w:p>
+        </w:tc>
+      </w:tr>
+      <w:tr>
+        <w:tc>
+          <w:tcPr>
+            <w:tcW w:w="2340" w:type="dxa"/>
+            <w:vAlign w:val="center"/>
+          </w:tcPr>
+          <w:p>
+            <w:pPr>
+              <w:pStyle w:val="TableText"/>
+              <w:spacing w:before="0" w:after="0" w:line="240" w:lineRule="auto"/>
+            </w:pPr>
+            <w:r>
+              <w:rPr>
+                <w:sz w:val="20"/>
+                <w:szCs w:val="20"/>
+              </w:rPr>
+              <w:t>主集合</w:t>
+            </w:r>
+          </w:p>
+        </w:tc>
+        <w:tc>
+          <w:tcPr>
+            <w:tcW w:w="2340" w:type="dxa"/>
+            <w:vAlign w:val="center"/>
+          </w:tcPr>
+          <w:p>
+            <w:pPr>
+              <w:pStyle w:val="TableText"/>
+              <w:spacing w:before="0" w:after="0" w:line="240" w:lineRule="auto"/>
+            </w:pPr>
+            <w:r>
+              <w:rPr>
+                <w:sz w:val="20"/>
+                <w:szCs w:val="20"/>
+              </w:rPr>
+              <w:t>CHEL≥0.25且FRS&lt;0.50</w:t>
+            </w:r>
+          </w:p>
+        </w:tc>
+        <w:tc>
+          <w:tcPr>
+            <w:tcW w:w="2340" w:type="dxa"/>
+            <w:vAlign w:val="center"/>
+          </w:tcPr>
+          <w:p>
+            <w:pPr>
+              <w:pStyle w:val="TableText"/>
+              <w:spacing w:before="0" w:after="0" w:line="240" w:lineRule="auto"/>
+            </w:pPr>
+            <w:r>
+              <w:rPr>
+                <w:sz w:val="20"/>
+                <w:szCs w:val="20"/>
+              </w:rPr>
+              <w:t>12</w:t>
+            </w:r>
+          </w:p>
+        </w:tc>
+        <w:tc>
+          <w:tcPr>
+            <w:tcW w:w="2340" w:type="dxa"/>
+            <w:vAlign w:val="center"/>
+          </w:tcPr>
+          <w:p>
+            <w:pPr>
+              <w:pStyle w:val="TableText"/>
+              <w:spacing w:before="0" w:after="0" w:line="240" w:lineRule="auto"/>
+            </w:pPr>
+            <w:r>
+              <w:rPr>
+                <w:sz w:val="20"/>
+                <w:szCs w:val="20"/>
+              </w:rPr>
+              <w:t>111</w:t>
+            </w:r>
+          </w:p>
+        </w:tc>
+      </w:tr>
+      <w:tr>
+        <w:tc>
+          <w:tcPr>
+            <w:tcW w:w="2340" w:type="dxa"/>
+            <w:vAlign w:val="center"/>
+          </w:tcPr>
+          <w:p>
+            <w:pPr>
+              <w:pStyle w:val="TableText"/>
+              <w:spacing w:before="0" w:after="0" w:line="240" w:lineRule="auto"/>
+            </w:pPr>
+            <w:r>
+              <w:rPr>
+                <w:sz w:val="20"/>
+                <w:szCs w:val="20"/>
               </w:rPr>
               <w:t>严格子集</w:t>
             </w:r>
@@ -1295,12 +1644,12 @@
           <w:p>
             <w:pPr>
               <w:pStyle w:val="TableText"/>
-              <w:spacing w:before="0" w:after="0" w:line="220" w:lineRule="auto"/>
-            </w:pPr>
-            <w:r>
-              <w:rPr>
-                <w:sz w:val="17"/>
-                <w:szCs w:val="17"/>
+              <w:spacing w:before="0" w:after="0" w:line="240" w:lineRule="auto"/>
+            </w:pPr>
+            <w:r>
+              <w:rPr>
+                <w:sz w:val="20"/>
+                <w:szCs w:val="20"/>
               </w:rPr>
               <w:t>CHEL≥0.25且FRS&lt;0.45</w:t>
             </w:r>
@@ -1314,12 +1663,12 @@
           <w:p>
             <w:pPr>
               <w:pStyle w:val="TableText"/>
-              <w:spacing w:before="0" w:after="0" w:line="220" w:lineRule="auto"/>
-            </w:pPr>
-            <w:r>
-              <w:rPr>
-                <w:sz w:val="17"/>
-                <w:szCs w:val="17"/>
+              <w:spacing w:before="0" w:after="0" w:line="240" w:lineRule="auto"/>
+            </w:pPr>
+            <w:r>
+              <w:rPr>
+                <w:sz w:val="20"/>
+                <w:szCs w:val="20"/>
               </w:rPr>
               <w:t>8</w:t>
             </w:r>
@@ -1333,14 +1682,14 @@
           <w:p>
             <w:pPr>
               <w:pStyle w:val="TableText"/>
-              <w:spacing w:before="0" w:after="0" w:line="220" w:lineRule="auto"/>
-            </w:pPr>
-            <w:r>
-              <w:rPr>
-                <w:sz w:val="17"/>
-                <w:szCs w:val="17"/>
-              </w:rPr>
-              <w:t>成员未知</w:t>
+              <w:spacing w:before="0" w:after="0" w:line="240" w:lineRule="auto"/>
+            </w:pPr>
+            <w:r>
+              <w:rPr>
+                <w:sz w:val="20"/>
+                <w:szCs w:val="20"/>
+              </w:rPr>
+              <w:t>序列成员未知</w:t>
             </w:r>
           </w:p>
         </w:tc>
@@ -1357,7 +1706,7 @@
         <w:keepNext/>
       </w:pPr>
       <w:r>
-        <w:t>12条序列表与对接评分</w:t>
+        <w:t>12条序列与对接评分排序</w:t>
       </w:r>
     </w:p>
     <w:p>
@@ -1365,7 +1714,15 @@
         <w:pStyle w:val="Normal"/>
       </w:pPr>
       <w:r>
-        <w:t>另一张表包含12条互不重复的7–9 aa肽。其中11条含组氨酸，6条含半胱氨酸，每条均含Arg或Lys。Vina均值范围为−9.60至−8.25 kcal/mol（表2）。在现有评分表内，FLLHTTR排名第一，HVLLLRQCA排名最后。序列组成可以重算，但无法建立对接执行及这些序列与汇总12条或8条集合之间的关系。</w:t>
+        <w:t>另一张表包含12条互不重复、仅由标准氨基酸组成的肽，长度为7–9个残基。其中11条含组氨酸，6条含半胱氨酸，每条均至少含一个Arg或Lys。这些性质可提出合成和配位假设，但不能证明金属结合、BBB转运、毒性、分类学归属或与汇总终点的对应关系。</w:t>
+      </w:r>
+    </w:p>
+    <w:p>
+      <w:pPr>
+        <w:pStyle w:val="Normal"/>
+      </w:pPr>
+      <w:r>
+        <w:t>Vina均值范围为−9.60至−8.25 kcal/mol，标准差范围为0.04至0.12（表2）。FLLHTTR、YLSLLQR和ALLLHRC的均值最低，HLPLLHRCC和HVLLLRQCA的均值最高。1.35 kcal/mol的跨度仅描述该评分表。标准差的逐次运行分母不可获得；在缺少构象时也无法评价残基层面相互作用。</w:t>
       </w:r>
     </w:p>
     <w:p>
@@ -1421,12 +1778,12 @@
           <w:p>
             <w:pPr>
               <w:pStyle w:val="TableText"/>
-              <w:spacing w:before="0" w:after="0" w:line="220" w:lineRule="auto"/>
-            </w:pPr>
-            <w:r>
-              <w:rPr>
-                <w:sz w:val="17"/>
-                <w:szCs w:val="17"/>
+              <w:spacing w:before="0" w:after="0" w:line="240" w:lineRule="auto"/>
+            </w:pPr>
+            <w:r>
+              <w:rPr>
+                <w:sz w:val="20"/>
+                <w:szCs w:val="20"/>
               </w:rPr>
               <w:t>排名</w:t>
             </w:r>
@@ -1443,12 +1800,12 @@
           <w:p>
             <w:pPr>
               <w:pStyle w:val="TableText"/>
-              <w:spacing w:before="0" w:after="0" w:line="220" w:lineRule="auto"/>
-            </w:pPr>
-            <w:r>
-              <w:rPr>
-                <w:sz w:val="17"/>
-                <w:szCs w:val="17"/>
+              <w:spacing w:before="0" w:after="0" w:line="240" w:lineRule="auto"/>
+            </w:pPr>
+            <w:r>
+              <w:rPr>
+                <w:sz w:val="20"/>
+                <w:szCs w:val="20"/>
               </w:rPr>
               <w:t>序列</w:t>
             </w:r>
@@ -1465,12 +1822,12 @@
           <w:p>
             <w:pPr>
               <w:pStyle w:val="TableText"/>
-              <w:spacing w:before="0" w:after="0" w:line="220" w:lineRule="auto"/>
-            </w:pPr>
-            <w:r>
-              <w:rPr>
-                <w:sz w:val="17"/>
-                <w:szCs w:val="17"/>
+              <w:spacing w:before="0" w:after="0" w:line="240" w:lineRule="auto"/>
+            </w:pPr>
+            <w:r>
+              <w:rPr>
+                <w:sz w:val="20"/>
+                <w:szCs w:val="20"/>
               </w:rPr>
               <w:t>长度（aa）</w:t>
             </w:r>
@@ -1487,12 +1844,12 @@
           <w:p>
             <w:pPr>
               <w:pStyle w:val="TableText"/>
-              <w:spacing w:before="0" w:after="0" w:line="220" w:lineRule="auto"/>
-            </w:pPr>
-            <w:r>
-              <w:rPr>
-                <w:sz w:val="17"/>
-                <w:szCs w:val="17"/>
+              <w:spacing w:before="0" w:after="0" w:line="240" w:lineRule="auto"/>
+            </w:pPr>
+            <w:r>
+              <w:rPr>
+                <w:sz w:val="20"/>
+                <w:szCs w:val="20"/>
               </w:rPr>
               <w:t>平均评分（kcal/mol）</w:t>
             </w:r>
@@ -1509,12 +1866,12 @@
           <w:p>
             <w:pPr>
               <w:pStyle w:val="TableText"/>
-              <w:spacing w:before="0" w:after="0" w:line="220" w:lineRule="auto"/>
-            </w:pPr>
-            <w:r>
-              <w:rPr>
-                <w:sz w:val="17"/>
-                <w:szCs w:val="17"/>
+              <w:spacing w:before="0" w:after="0" w:line="240" w:lineRule="auto"/>
+            </w:pPr>
+            <w:r>
+              <w:rPr>
+                <w:sz w:val="20"/>
+                <w:szCs w:val="20"/>
               </w:rPr>
               <w:t>SD</w:t>
             </w:r>
@@ -1530,12 +1887,12 @@
           <w:p>
             <w:pPr>
               <w:pStyle w:val="TableText"/>
-              <w:spacing w:before="0" w:after="0" w:line="220" w:lineRule="auto"/>
-            </w:pPr>
-            <w:r>
-              <w:rPr>
-                <w:sz w:val="17"/>
-                <w:szCs w:val="17"/>
+              <w:spacing w:before="0" w:after="0" w:line="240" w:lineRule="auto"/>
+            </w:pPr>
+            <w:r>
+              <w:rPr>
+                <w:sz w:val="20"/>
+                <w:szCs w:val="20"/>
               </w:rPr>
               <w:t>1</w:t>
             </w:r>
@@ -1549,12 +1906,12 @@
           <w:p>
             <w:pPr>
               <w:pStyle w:val="TableText"/>
-              <w:spacing w:before="0" w:after="0" w:line="220" w:lineRule="auto"/>
-            </w:pPr>
-            <w:r>
-              <w:rPr>
-                <w:sz w:val="17"/>
-                <w:szCs w:val="17"/>
+              <w:spacing w:before="0" w:after="0" w:line="240" w:lineRule="auto"/>
+            </w:pPr>
+            <w:r>
+              <w:rPr>
+                <w:sz w:val="20"/>
+                <w:szCs w:val="20"/>
               </w:rPr>
               <w:t>FLLHTTR</w:t>
             </w:r>
@@ -1568,12 +1925,12 @@
           <w:p>
             <w:pPr>
               <w:pStyle w:val="TableText"/>
-              <w:spacing w:before="0" w:after="0" w:line="220" w:lineRule="auto"/>
-            </w:pPr>
-            <w:r>
-              <w:rPr>
-                <w:sz w:val="17"/>
-                <w:szCs w:val="17"/>
+              <w:spacing w:before="0" w:after="0" w:line="240" w:lineRule="auto"/>
+            </w:pPr>
+            <w:r>
+              <w:rPr>
+                <w:sz w:val="20"/>
+                <w:szCs w:val="20"/>
               </w:rPr>
               <w:t>7</w:t>
             </w:r>
@@ -1587,12 +1944,12 @@
           <w:p>
             <w:pPr>
               <w:pStyle w:val="TableText"/>
-              <w:spacing w:before="0" w:after="0" w:line="220" w:lineRule="auto"/>
-            </w:pPr>
-            <w:r>
-              <w:rPr>
-                <w:sz w:val="17"/>
-                <w:szCs w:val="17"/>
+              <w:spacing w:before="0" w:after="0" w:line="240" w:lineRule="auto"/>
+            </w:pPr>
+            <w:r>
+              <w:rPr>
+                <w:sz w:val="20"/>
+                <w:szCs w:val="20"/>
               </w:rPr>
               <w:t>−9.60</w:t>
             </w:r>
@@ -1606,12 +1963,12 @@
           <w:p>
             <w:pPr>
               <w:pStyle w:val="TableText"/>
-              <w:spacing w:before="0" w:after="0" w:line="220" w:lineRule="auto"/>
-            </w:pPr>
-            <w:r>
-              <w:rPr>
-                <w:sz w:val="17"/>
-                <w:szCs w:val="17"/>
+              <w:spacing w:before="0" w:after="0" w:line="240" w:lineRule="auto"/>
+            </w:pPr>
+            <w:r>
+              <w:rPr>
+                <w:sz w:val="20"/>
+                <w:szCs w:val="20"/>
               </w:rPr>
               <w:t>0.08</w:t>
             </w:r>
@@ -1627,12 +1984,12 @@
           <w:p>
             <w:pPr>
               <w:pStyle w:val="TableText"/>
-              <w:spacing w:before="0" w:after="0" w:line="220" w:lineRule="auto"/>
-            </w:pPr>
-            <w:r>
-              <w:rPr>
-                <w:sz w:val="17"/>
-                <w:szCs w:val="17"/>
+              <w:spacing w:before="0" w:after="0" w:line="240" w:lineRule="auto"/>
+            </w:pPr>
+            <w:r>
+              <w:rPr>
+                <w:sz w:val="20"/>
+                <w:szCs w:val="20"/>
               </w:rPr>
               <w:t>2</w:t>
             </w:r>
@@ -1646,12 +2003,12 @@
           <w:p>
             <w:pPr>
               <w:pStyle w:val="TableText"/>
-              <w:spacing w:before="0" w:after="0" w:line="220" w:lineRule="auto"/>
-            </w:pPr>
-            <w:r>
-              <w:rPr>
-                <w:sz w:val="17"/>
-                <w:szCs w:val="17"/>
+              <w:spacing w:before="0" w:after="0" w:line="240" w:lineRule="auto"/>
+            </w:pPr>
+            <w:r>
+              <w:rPr>
+                <w:sz w:val="20"/>
+                <w:szCs w:val="20"/>
               </w:rPr>
               <w:t>YLSLLQR</w:t>
             </w:r>
@@ -1665,12 +2022,12 @@
           <w:p>
             <w:pPr>
               <w:pStyle w:val="TableText"/>
-              <w:spacing w:before="0" w:after="0" w:line="220" w:lineRule="auto"/>
-            </w:pPr>
-            <w:r>
-              <w:rPr>
-                <w:sz w:val="17"/>
-                <w:szCs w:val="17"/>
+              <w:spacing w:before="0" w:after="0" w:line="240" w:lineRule="auto"/>
+            </w:pPr>
+            <w:r>
+              <w:rPr>
+                <w:sz w:val="20"/>
+                <w:szCs w:val="20"/>
               </w:rPr>
               <w:t>7</w:t>
             </w:r>
@@ -1684,12 +2041,12 @@
           <w:p>
             <w:pPr>
               <w:pStyle w:val="TableText"/>
-              <w:spacing w:before="0" w:after="0" w:line="220" w:lineRule="auto"/>
-            </w:pPr>
-            <w:r>
-              <w:rPr>
-                <w:sz w:val="17"/>
-                <w:szCs w:val="17"/>
+              <w:spacing w:before="0" w:after="0" w:line="240" w:lineRule="auto"/>
+            </w:pPr>
+            <w:r>
+              <w:rPr>
+                <w:sz w:val="20"/>
+                <w:szCs w:val="20"/>
               </w:rPr>
               <w:t>−9.49</w:t>
             </w:r>
@@ -1703,12 +2060,12 @@
           <w:p>
             <w:pPr>
               <w:pStyle w:val="TableText"/>
-              <w:spacing w:before="0" w:after="0" w:line="220" w:lineRule="auto"/>
-            </w:pPr>
-            <w:r>
-              <w:rPr>
-                <w:sz w:val="17"/>
-                <w:szCs w:val="17"/>
+              <w:spacing w:before="0" w:after="0" w:line="240" w:lineRule="auto"/>
+            </w:pPr>
+            <w:r>
+              <w:rPr>
+                <w:sz w:val="20"/>
+                <w:szCs w:val="20"/>
               </w:rPr>
               <w:t>0.05</w:t>
             </w:r>
@@ -1724,12 +2081,12 @@
           <w:p>
             <w:pPr>
               <w:pStyle w:val="TableText"/>
-              <w:spacing w:before="0" w:after="0" w:line="220" w:lineRule="auto"/>
-            </w:pPr>
-            <w:r>
-              <w:rPr>
-                <w:sz w:val="17"/>
-                <w:szCs w:val="17"/>
+              <w:spacing w:before="0" w:after="0" w:line="240" w:lineRule="auto"/>
+            </w:pPr>
+            <w:r>
+              <w:rPr>
+                <w:sz w:val="20"/>
+                <w:szCs w:val="20"/>
               </w:rPr>
               <w:t>3</w:t>
             </w:r>
@@ -1743,12 +2100,12 @@
           <w:p>
             <w:pPr>
               <w:pStyle w:val="TableText"/>
-              <w:spacing w:before="0" w:after="0" w:line="220" w:lineRule="auto"/>
-            </w:pPr>
-            <w:r>
-              <w:rPr>
-                <w:sz w:val="17"/>
-                <w:szCs w:val="17"/>
+              <w:spacing w:before="0" w:after="0" w:line="240" w:lineRule="auto"/>
+            </w:pPr>
+            <w:r>
+              <w:rPr>
+                <w:sz w:val="20"/>
+                <w:szCs w:val="20"/>
               </w:rPr>
               <w:t>ALLLHRC</w:t>
             </w:r>
@@ -1762,12 +2119,12 @@
           <w:p>
             <w:pPr>
               <w:pStyle w:val="TableText"/>
-              <w:spacing w:before="0" w:after="0" w:line="220" w:lineRule="auto"/>
-            </w:pPr>
-            <w:r>
-              <w:rPr>
-                <w:sz w:val="17"/>
-                <w:szCs w:val="17"/>
+              <w:spacing w:before="0" w:after="0" w:line="240" w:lineRule="auto"/>
+            </w:pPr>
+            <w:r>
+              <w:rPr>
+                <w:sz w:val="20"/>
+                <w:szCs w:val="20"/>
               </w:rPr>
               <w:t>7</w:t>
             </w:r>
@@ -1781,12 +2138,12 @@
           <w:p>
             <w:pPr>
               <w:pStyle w:val="TableText"/>
-              <w:spacing w:before="0" w:after="0" w:line="220" w:lineRule="auto"/>
-            </w:pPr>
-            <w:r>
-              <w:rPr>
-                <w:sz w:val="17"/>
-                <w:szCs w:val="17"/>
+              <w:spacing w:before="0" w:after="0" w:line="240" w:lineRule="auto"/>
+            </w:pPr>
+            <w:r>
+              <w:rPr>
+                <w:sz w:val="20"/>
+                <w:szCs w:val="20"/>
               </w:rPr>
               <w:t>−9.29</w:t>
             </w:r>
@@ -1800,12 +2157,12 @@
           <w:p>
             <w:pPr>
               <w:pStyle w:val="TableText"/>
-              <w:spacing w:before="0" w:after="0" w:line="220" w:lineRule="auto"/>
-            </w:pPr>
-            <w:r>
-              <w:rPr>
-                <w:sz w:val="17"/>
-                <w:szCs w:val="17"/>
+              <w:spacing w:before="0" w:after="0" w:line="240" w:lineRule="auto"/>
+            </w:pPr>
+            <w:r>
+              <w:rPr>
+                <w:sz w:val="20"/>
+                <w:szCs w:val="20"/>
               </w:rPr>
               <w:t>0.11</w:t>
             </w:r>
@@ -1821,12 +2178,12 @@
           <w:p>
             <w:pPr>
               <w:pStyle w:val="TableText"/>
-              <w:spacing w:before="0" w:after="0" w:line="220" w:lineRule="auto"/>
-            </w:pPr>
-            <w:r>
-              <w:rPr>
-                <w:sz w:val="17"/>
-                <w:szCs w:val="17"/>
+              <w:spacing w:before="0" w:after="0" w:line="240" w:lineRule="auto"/>
+            </w:pPr>
+            <w:r>
+              <w:rPr>
+                <w:sz w:val="20"/>
+                <w:szCs w:val="20"/>
               </w:rPr>
               <w:t>4</w:t>
             </w:r>
@@ -1840,12 +2197,12 @@
           <w:p>
             <w:pPr>
               <w:pStyle w:val="TableText"/>
-              <w:spacing w:before="0" w:after="0" w:line="220" w:lineRule="auto"/>
-            </w:pPr>
-            <w:r>
-              <w:rPr>
-                <w:sz w:val="17"/>
-                <w:szCs w:val="17"/>
+              <w:spacing w:before="0" w:after="0" w:line="240" w:lineRule="auto"/>
+            </w:pPr>
+            <w:r>
+              <w:rPr>
+                <w:sz w:val="20"/>
+                <w:szCs w:val="20"/>
               </w:rPr>
               <w:t>FCLHLQLR</w:t>
             </w:r>
@@ -1859,12 +2216,12 @@
           <w:p>
             <w:pPr>
               <w:pStyle w:val="TableText"/>
-              <w:spacing w:before="0" w:after="0" w:line="220" w:lineRule="auto"/>
-            </w:pPr>
-            <w:r>
-              <w:rPr>
-                <w:sz w:val="17"/>
-                <w:szCs w:val="17"/>
+              <w:spacing w:before="0" w:after="0" w:line="240" w:lineRule="auto"/>
+            </w:pPr>
+            <w:r>
+              <w:rPr>
+                <w:sz w:val="20"/>
+                <w:szCs w:val="20"/>
               </w:rPr>
               <w:t>8</w:t>
             </w:r>
@@ -1878,12 +2235,12 @@
           <w:p>
             <w:pPr>
               <w:pStyle w:val="TableText"/>
-              <w:spacing w:before="0" w:after="0" w:line="220" w:lineRule="auto"/>
-            </w:pPr>
-            <w:r>
-              <w:rPr>
-                <w:sz w:val="17"/>
-                <w:szCs w:val="17"/>
+              <w:spacing w:before="0" w:after="0" w:line="240" w:lineRule="auto"/>
+            </w:pPr>
+            <w:r>
+              <w:rPr>
+                <w:sz w:val="20"/>
+                <w:szCs w:val="20"/>
               </w:rPr>
               <w:t>−9.27</w:t>
             </w:r>
@@ -1897,12 +2254,12 @@
           <w:p>
             <w:pPr>
               <w:pStyle w:val="TableText"/>
-              <w:spacing w:before="0" w:after="0" w:line="220" w:lineRule="auto"/>
-            </w:pPr>
-            <w:r>
-              <w:rPr>
-                <w:sz w:val="17"/>
-                <w:szCs w:val="17"/>
+              <w:spacing w:before="0" w:after="0" w:line="240" w:lineRule="auto"/>
+            </w:pPr>
+            <w:r>
+              <w:rPr>
+                <w:sz w:val="20"/>
+                <w:szCs w:val="20"/>
               </w:rPr>
               <w:t>0.09</w:t>
             </w:r>
@@ -1918,12 +2275,12 @@
           <w:p>
             <w:pPr>
               <w:pStyle w:val="TableText"/>
-              <w:spacing w:before="0" w:after="0" w:line="220" w:lineRule="auto"/>
-            </w:pPr>
-            <w:r>
-              <w:rPr>
-                <w:sz w:val="17"/>
-                <w:szCs w:val="17"/>
+              <w:spacing w:before="0" w:after="0" w:line="240" w:lineRule="auto"/>
+            </w:pPr>
+            <w:r>
+              <w:rPr>
+                <w:sz w:val="20"/>
+                <w:szCs w:val="20"/>
               </w:rPr>
               <w:t>5</w:t>
             </w:r>
@@ -1937,12 +2294,12 @@
           <w:p>
             <w:pPr>
               <w:pStyle w:val="TableText"/>
-              <w:spacing w:before="0" w:after="0" w:line="220" w:lineRule="auto"/>
-            </w:pPr>
-            <w:r>
-              <w:rPr>
-                <w:sz w:val="17"/>
-                <w:szCs w:val="17"/>
+              <w:spacing w:before="0" w:after="0" w:line="240" w:lineRule="auto"/>
+            </w:pPr>
+            <w:r>
+              <w:rPr>
+                <w:sz w:val="20"/>
+                <w:szCs w:val="20"/>
               </w:rPr>
               <w:t>YHHLLCRR</w:t>
             </w:r>
@@ -1956,12 +2313,12 @@
           <w:p>
             <w:pPr>
               <w:pStyle w:val="TableText"/>
-              <w:spacing w:before="0" w:after="0" w:line="220" w:lineRule="auto"/>
-            </w:pPr>
-            <w:r>
-              <w:rPr>
-                <w:sz w:val="17"/>
-                <w:szCs w:val="17"/>
+              <w:spacing w:before="0" w:after="0" w:line="240" w:lineRule="auto"/>
+            </w:pPr>
+            <w:r>
+              <w:rPr>
+                <w:sz w:val="20"/>
+                <w:szCs w:val="20"/>
               </w:rPr>
               <w:t>8</w:t>
             </w:r>
@@ -1975,12 +2332,12 @@
           <w:p>
             <w:pPr>
               <w:pStyle w:val="TableText"/>
-              <w:spacing w:before="0" w:after="0" w:line="220" w:lineRule="auto"/>
-            </w:pPr>
-            <w:r>
-              <w:rPr>
-                <w:sz w:val="17"/>
-                <w:szCs w:val="17"/>
+              <w:spacing w:before="0" w:after="0" w:line="240" w:lineRule="auto"/>
+            </w:pPr>
+            <w:r>
+              <w:rPr>
+                <w:sz w:val="20"/>
+                <w:szCs w:val="20"/>
               </w:rPr>
               <w:t>−9.03</w:t>
             </w:r>
@@ -1994,12 +2351,12 @@
           <w:p>
             <w:pPr>
               <w:pStyle w:val="TableText"/>
-              <w:spacing w:before="0" w:after="0" w:line="220" w:lineRule="auto"/>
-            </w:pPr>
-            <w:r>
-              <w:rPr>
-                <w:sz w:val="17"/>
-                <w:szCs w:val="17"/>
+              <w:spacing w:before="0" w:after="0" w:line="240" w:lineRule="auto"/>
+            </w:pPr>
+            <w:r>
+              <w:rPr>
+                <w:sz w:val="20"/>
+                <w:szCs w:val="20"/>
               </w:rPr>
               <w:t>0.07</w:t>
             </w:r>
@@ -2015,12 +2372,12 @@
           <w:p>
             <w:pPr>
               <w:pStyle w:val="TableText"/>
-              <w:spacing w:before="0" w:after="0" w:line="220" w:lineRule="auto"/>
-            </w:pPr>
-            <w:r>
-              <w:rPr>
-                <w:sz w:val="17"/>
-                <w:szCs w:val="17"/>
+              <w:spacing w:before="0" w:after="0" w:line="240" w:lineRule="auto"/>
+            </w:pPr>
+            <w:r>
+              <w:rPr>
+                <w:sz w:val="20"/>
+                <w:szCs w:val="20"/>
               </w:rPr>
               <w:t>6</w:t>
             </w:r>
@@ -2034,12 +2391,12 @@
           <w:p>
             <w:pPr>
               <w:pStyle w:val="TableText"/>
-              <w:spacing w:before="0" w:after="0" w:line="220" w:lineRule="auto"/>
-            </w:pPr>
-            <w:r>
-              <w:rPr>
-                <w:sz w:val="17"/>
-                <w:szCs w:val="17"/>
+              <w:spacing w:before="0" w:after="0" w:line="240" w:lineRule="auto"/>
+            </w:pPr>
+            <w:r>
+              <w:rPr>
+                <w:sz w:val="20"/>
+                <w:szCs w:val="20"/>
               </w:rPr>
               <w:t>LLHLPKRTT</w:t>
             </w:r>
@@ -2053,12 +2410,12 @@
           <w:p>
             <w:pPr>
               <w:pStyle w:val="TableText"/>
-              <w:spacing w:before="0" w:after="0" w:line="220" w:lineRule="auto"/>
-            </w:pPr>
-            <w:r>
-              <w:rPr>
-                <w:sz w:val="17"/>
-                <w:szCs w:val="17"/>
+              <w:spacing w:before="0" w:after="0" w:line="240" w:lineRule="auto"/>
+            </w:pPr>
+            <w:r>
+              <w:rPr>
+                <w:sz w:val="20"/>
+                <w:szCs w:val="20"/>
               </w:rPr>
               <w:t>9</w:t>
             </w:r>
@@ -2072,12 +2429,12 @@
           <w:p>
             <w:pPr>
               <w:pStyle w:val="TableText"/>
-              <w:spacing w:before="0" w:after="0" w:line="220" w:lineRule="auto"/>
-            </w:pPr>
-            <w:r>
-              <w:rPr>
-                <w:sz w:val="17"/>
-                <w:szCs w:val="17"/>
+              <w:spacing w:before="0" w:after="0" w:line="240" w:lineRule="auto"/>
+            </w:pPr>
+            <w:r>
+              <w:rPr>
+                <w:sz w:val="20"/>
+                <w:szCs w:val="20"/>
               </w:rPr>
               <w:t>−9.01</w:t>
             </w:r>
@@ -2091,12 +2448,12 @@
           <w:p>
             <w:pPr>
               <w:pStyle w:val="TableText"/>
-              <w:spacing w:before="0" w:after="0" w:line="220" w:lineRule="auto"/>
-            </w:pPr>
-            <w:r>
-              <w:rPr>
-                <w:sz w:val="17"/>
-                <w:szCs w:val="17"/>
+              <w:spacing w:before="0" w:after="0" w:line="240" w:lineRule="auto"/>
+            </w:pPr>
+            <w:r>
+              <w:rPr>
+                <w:sz w:val="20"/>
+                <w:szCs w:val="20"/>
               </w:rPr>
               <w:t>0.06</w:t>
             </w:r>
@@ -2112,12 +2469,12 @@
           <w:p>
             <w:pPr>
               <w:pStyle w:val="TableText"/>
-              <w:spacing w:before="0" w:after="0" w:line="220" w:lineRule="auto"/>
-            </w:pPr>
-            <w:r>
-              <w:rPr>
-                <w:sz w:val="17"/>
-                <w:szCs w:val="17"/>
+              <w:spacing w:before="0" w:after="0" w:line="240" w:lineRule="auto"/>
+            </w:pPr>
+            <w:r>
+              <w:rPr>
+                <w:sz w:val="20"/>
+                <w:szCs w:val="20"/>
               </w:rPr>
               <w:t>7</w:t>
             </w:r>
@@ -2131,12 +2488,12 @@
           <w:p>
             <w:pPr>
               <w:pStyle w:val="TableText"/>
-              <w:spacing w:before="0" w:after="0" w:line="220" w:lineRule="auto"/>
-            </w:pPr>
-            <w:r>
-              <w:rPr>
-                <w:sz w:val="17"/>
-                <w:szCs w:val="17"/>
+              <w:spacing w:before="0" w:after="0" w:line="240" w:lineRule="auto"/>
+            </w:pPr>
+            <w:r>
+              <w:rPr>
+                <w:sz w:val="20"/>
+                <w:szCs w:val="20"/>
               </w:rPr>
               <w:t>LLHPLRL</w:t>
             </w:r>
@@ -2150,12 +2507,12 @@
           <w:p>
             <w:pPr>
               <w:pStyle w:val="TableText"/>
-              <w:spacing w:before="0" w:after="0" w:line="220" w:lineRule="auto"/>
-            </w:pPr>
-            <w:r>
-              <w:rPr>
-                <w:sz w:val="17"/>
-                <w:szCs w:val="17"/>
+              <w:spacing w:before="0" w:after="0" w:line="240" w:lineRule="auto"/>
+            </w:pPr>
+            <w:r>
+              <w:rPr>
+                <w:sz w:val="20"/>
+                <w:szCs w:val="20"/>
               </w:rPr>
               <w:t>7</w:t>
             </w:r>
@@ -2169,12 +2526,12 @@
           <w:p>
             <w:pPr>
               <w:pStyle w:val="TableText"/>
-              <w:spacing w:before="0" w:after="0" w:line="220" w:lineRule="auto"/>
-            </w:pPr>
-            <w:r>
-              <w:rPr>
-                <w:sz w:val="17"/>
-                <w:szCs w:val="17"/>
+              <w:spacing w:before="0" w:after="0" w:line="240" w:lineRule="auto"/>
+            </w:pPr>
+            <w:r>
+              <w:rPr>
+                <w:sz w:val="20"/>
+                <w:szCs w:val="20"/>
               </w:rPr>
               <w:t>−8.94</w:t>
             </w:r>
@@ -2188,12 +2545,12 @@
           <w:p>
             <w:pPr>
               <w:pStyle w:val="TableText"/>
-              <w:spacing w:before="0" w:after="0" w:line="220" w:lineRule="auto"/>
-            </w:pPr>
-            <w:r>
-              <w:rPr>
-                <w:sz w:val="17"/>
-                <w:szCs w:val="17"/>
+              <w:spacing w:before="0" w:after="0" w:line="240" w:lineRule="auto"/>
+            </w:pPr>
+            <w:r>
+              <w:rPr>
+                <w:sz w:val="20"/>
+                <w:szCs w:val="20"/>
               </w:rPr>
               <w:t>0.10</w:t>
             </w:r>
@@ -2209,12 +2566,12 @@
           <w:p>
             <w:pPr>
               <w:pStyle w:val="TableText"/>
-              <w:spacing w:before="0" w:after="0" w:line="220" w:lineRule="auto"/>
-            </w:pPr>
-            <w:r>
-              <w:rPr>
-                <w:sz w:val="17"/>
-                <w:szCs w:val="17"/>
+              <w:spacing w:before="0" w:after="0" w:line="240" w:lineRule="auto"/>
+            </w:pPr>
+            <w:r>
+              <w:rPr>
+                <w:sz w:val="20"/>
+                <w:szCs w:val="20"/>
               </w:rPr>
               <w:t>8</w:t>
             </w:r>
@@ -2228,12 +2585,12 @@
           <w:p>
             <w:pPr>
               <w:pStyle w:val="TableText"/>
-              <w:spacing w:before="0" w:after="0" w:line="220" w:lineRule="auto"/>
-            </w:pPr>
-            <w:r>
-              <w:rPr>
-                <w:sz w:val="17"/>
-                <w:szCs w:val="17"/>
+              <w:spacing w:before="0" w:after="0" w:line="240" w:lineRule="auto"/>
+            </w:pPr>
+            <w:r>
+              <w:rPr>
+                <w:sz w:val="20"/>
+                <w:szCs w:val="20"/>
               </w:rPr>
               <w:t>WLLVHLKK</w:t>
             </w:r>
@@ -2247,12 +2604,12 @@
           <w:p>
             <w:pPr>
               <w:pStyle w:val="TableText"/>
-              <w:spacing w:before="0" w:after="0" w:line="220" w:lineRule="auto"/>
-            </w:pPr>
-            <w:r>
-              <w:rPr>
-                <w:sz w:val="17"/>
-                <w:szCs w:val="17"/>
+              <w:spacing w:before="0" w:after="0" w:line="240" w:lineRule="auto"/>
+            </w:pPr>
+            <w:r>
+              <w:rPr>
+                <w:sz w:val="20"/>
+                <w:szCs w:val="20"/>
               </w:rPr>
               <w:t>8</w:t>
             </w:r>
@@ -2266,12 +2623,12 @@
           <w:p>
             <w:pPr>
               <w:pStyle w:val="TableText"/>
-              <w:spacing w:before="0" w:after="0" w:line="220" w:lineRule="auto"/>
-            </w:pPr>
-            <w:r>
-              <w:rPr>
-                <w:sz w:val="17"/>
-                <w:szCs w:val="17"/>
+              <w:spacing w:before="0" w:after="0" w:line="240" w:lineRule="auto"/>
+            </w:pPr>
+            <w:r>
+              <w:rPr>
+                <w:sz w:val="20"/>
+                <w:szCs w:val="20"/>
               </w:rPr>
               <w:t>−8.94</w:t>
             </w:r>
@@ -2285,12 +2642,12 @@
           <w:p>
             <w:pPr>
               <w:pStyle w:val="TableText"/>
-              <w:spacing w:before="0" w:after="0" w:line="220" w:lineRule="auto"/>
-            </w:pPr>
-            <w:r>
-              <w:rPr>
-                <w:sz w:val="17"/>
-                <w:szCs w:val="17"/>
+              <w:spacing w:before="0" w:after="0" w:line="240" w:lineRule="auto"/>
+            </w:pPr>
+            <w:r>
+              <w:rPr>
+                <w:sz w:val="20"/>
+                <w:szCs w:val="20"/>
               </w:rPr>
               <w:t>0.04</w:t>
             </w:r>
@@ -2306,12 +2663,12 @@
           <w:p>
             <w:pPr>
               <w:pStyle w:val="TableText"/>
-              <w:spacing w:before="0" w:after="0" w:line="220" w:lineRule="auto"/>
-            </w:pPr>
-            <w:r>
-              <w:rPr>
-                <w:sz w:val="17"/>
-                <w:szCs w:val="17"/>
+              <w:spacing w:before="0" w:after="0" w:line="240" w:lineRule="auto"/>
+            </w:pPr>
+            <w:r>
+              <w:rPr>
+                <w:sz w:val="20"/>
+                <w:szCs w:val="20"/>
               </w:rPr>
               <w:t>9</w:t>
             </w:r>
@@ -2325,12 +2682,12 @@
           <w:p>
             <w:pPr>
               <w:pStyle w:val="TableText"/>
-              <w:spacing w:before="0" w:after="0" w:line="220" w:lineRule="auto"/>
-            </w:pPr>
-            <w:r>
-              <w:rPr>
-                <w:sz w:val="17"/>
-                <w:szCs w:val="17"/>
+              <w:spacing w:before="0" w:after="0" w:line="240" w:lineRule="auto"/>
+            </w:pPr>
+            <w:r>
+              <w:rPr>
+                <w:sz w:val="20"/>
+                <w:szCs w:val="20"/>
               </w:rPr>
               <w:t>LLHPLRC</w:t>
             </w:r>
@@ -2344,12 +2701,12 @@
           <w:p>
             <w:pPr>
               <w:pStyle w:val="TableText"/>
-              <w:spacing w:before="0" w:after="0" w:line="220" w:lineRule="auto"/>
-            </w:pPr>
-            <w:r>
-              <w:rPr>
-                <w:sz w:val="17"/>
-                <w:szCs w:val="17"/>
+              <w:spacing w:before="0" w:after="0" w:line="240" w:lineRule="auto"/>
+            </w:pPr>
+            <w:r>
+              <w:rPr>
+                <w:sz w:val="20"/>
+                <w:szCs w:val="20"/>
               </w:rPr>
               <w:t>7</w:t>
             </w:r>
@@ -2363,12 +2720,12 @@
           <w:p>
             <w:pPr>
               <w:pStyle w:val="TableText"/>
-              <w:spacing w:before="0" w:after="0" w:line="220" w:lineRule="auto"/>
-            </w:pPr>
-            <w:r>
-              <w:rPr>
-                <w:sz w:val="17"/>
-                <w:szCs w:val="17"/>
+              <w:spacing w:before="0" w:after="0" w:line="240" w:lineRule="auto"/>
+            </w:pPr>
+            <w:r>
+              <w:rPr>
+                <w:sz w:val="20"/>
+                <w:szCs w:val="20"/>
               </w:rPr>
               <w:t>−8.91</w:t>
             </w:r>
@@ -2382,12 +2739,12 @@
           <w:p>
             <w:pPr>
               <w:pStyle w:val="TableText"/>
-              <w:spacing w:before="0" w:after="0" w:line="220" w:lineRule="auto"/>
-            </w:pPr>
-            <w:r>
-              <w:rPr>
-                <w:sz w:val="17"/>
-                <w:szCs w:val="17"/>
+              <w:spacing w:before="0" w:after="0" w:line="240" w:lineRule="auto"/>
+            </w:pPr>
+            <w:r>
+              <w:rPr>
+                <w:sz w:val="20"/>
+                <w:szCs w:val="20"/>
               </w:rPr>
               <w:t>0.08</w:t>
             </w:r>
@@ -2403,12 +2760,12 @@
           <w:p>
             <w:pPr>
               <w:pStyle w:val="TableText"/>
-              <w:spacing w:before="0" w:after="0" w:line="220" w:lineRule="auto"/>
-            </w:pPr>
-            <w:r>
-              <w:rPr>
-                <w:sz w:val="17"/>
-                <w:szCs w:val="17"/>
+              <w:spacing w:before="0" w:after="0" w:line="240" w:lineRule="auto"/>
+            </w:pPr>
+            <w:r>
+              <w:rPr>
+                <w:sz w:val="20"/>
+                <w:szCs w:val="20"/>
               </w:rPr>
               <w:t>10</w:t>
             </w:r>
@@ -2422,12 +2779,12 @@
           <w:p>
             <w:pPr>
               <w:pStyle w:val="TableText"/>
-              <w:spacing w:before="0" w:after="0" w:line="220" w:lineRule="auto"/>
-            </w:pPr>
-            <w:r>
-              <w:rPr>
-                <w:sz w:val="17"/>
-                <w:szCs w:val="17"/>
+              <w:spacing w:before="0" w:after="0" w:line="240" w:lineRule="auto"/>
+            </w:pPr>
+            <w:r>
+              <w:rPr>
+                <w:sz w:val="20"/>
+                <w:szCs w:val="20"/>
               </w:rPr>
               <w:t>HLLTLKKHV</w:t>
             </w:r>
@@ -2441,12 +2798,12 @@
           <w:p>
             <w:pPr>
               <w:pStyle w:val="TableText"/>
-              <w:spacing w:before="0" w:after="0" w:line="220" w:lineRule="auto"/>
-            </w:pPr>
-            <w:r>
-              <w:rPr>
-                <w:sz w:val="17"/>
-                <w:szCs w:val="17"/>
+              <w:spacing w:before="0" w:after="0" w:line="240" w:lineRule="auto"/>
+            </w:pPr>
+            <w:r>
+              <w:rPr>
+                <w:sz w:val="20"/>
+                <w:szCs w:val="20"/>
               </w:rPr>
               <w:t>9</w:t>
             </w:r>
@@ -2460,12 +2817,12 @@
           <w:p>
             <w:pPr>
               <w:pStyle w:val="TableText"/>
-              <w:spacing w:before="0" w:after="0" w:line="220" w:lineRule="auto"/>
-            </w:pPr>
-            <w:r>
-              <w:rPr>
-                <w:sz w:val="17"/>
-                <w:szCs w:val="17"/>
+              <w:spacing w:before="0" w:after="0" w:line="240" w:lineRule="auto"/>
+            </w:pPr>
+            <w:r>
+              <w:rPr>
+                <w:sz w:val="20"/>
+                <w:szCs w:val="20"/>
               </w:rPr>
               <w:t>−8.88</w:t>
             </w:r>
@@ -2479,12 +2836,12 @@
           <w:p>
             <w:pPr>
               <w:pStyle w:val="TableText"/>
-              <w:spacing w:before="0" w:after="0" w:line="220" w:lineRule="auto"/>
-            </w:pPr>
-            <w:r>
-              <w:rPr>
-                <w:sz w:val="17"/>
-                <w:szCs w:val="17"/>
+              <w:spacing w:before="0" w:after="0" w:line="240" w:lineRule="auto"/>
+            </w:pPr>
+            <w:r>
+              <w:rPr>
+                <w:sz w:val="20"/>
+                <w:szCs w:val="20"/>
               </w:rPr>
               <w:t>0.05</w:t>
             </w:r>
@@ -2500,12 +2857,12 @@
           <w:p>
             <w:pPr>
               <w:pStyle w:val="TableText"/>
-              <w:spacing w:before="0" w:after="0" w:line="220" w:lineRule="auto"/>
-            </w:pPr>
-            <w:r>
-              <w:rPr>
-                <w:sz w:val="17"/>
-                <w:szCs w:val="17"/>
+              <w:spacing w:before="0" w:after="0" w:line="240" w:lineRule="auto"/>
+            </w:pPr>
+            <w:r>
+              <w:rPr>
+                <w:sz w:val="20"/>
+                <w:szCs w:val="20"/>
               </w:rPr>
               <w:t>11</w:t>
             </w:r>
@@ -2519,12 +2876,12 @@
           <w:p>
             <w:pPr>
               <w:pStyle w:val="TableText"/>
-              <w:spacing w:before="0" w:after="0" w:line="220" w:lineRule="auto"/>
-            </w:pPr>
-            <w:r>
-              <w:rPr>
-                <w:sz w:val="17"/>
-                <w:szCs w:val="17"/>
+              <w:spacing w:before="0" w:after="0" w:line="240" w:lineRule="auto"/>
+            </w:pPr>
+            <w:r>
+              <w:rPr>
+                <w:sz w:val="20"/>
+                <w:szCs w:val="20"/>
               </w:rPr>
               <w:t>HLPLLHRCC</w:t>
             </w:r>
@@ -2538,12 +2895,12 @@
           <w:p>
             <w:pPr>
               <w:pStyle w:val="TableText"/>
-              <w:spacing w:before="0" w:after="0" w:line="220" w:lineRule="auto"/>
-            </w:pPr>
-            <w:r>
-              <w:rPr>
-                <w:sz w:val="17"/>
-                <w:szCs w:val="17"/>
+              <w:spacing w:before="0" w:after="0" w:line="240" w:lineRule="auto"/>
+            </w:pPr>
+            <w:r>
+              <w:rPr>
+                <w:sz w:val="20"/>
+                <w:szCs w:val="20"/>
               </w:rPr>
               <w:t>9</w:t>
             </w:r>
@@ -2557,12 +2914,12 @@
           <w:p>
             <w:pPr>
               <w:pStyle w:val="TableText"/>
-              <w:spacing w:before="0" w:after="0" w:line="220" w:lineRule="auto"/>
-            </w:pPr>
-            <w:r>
-              <w:rPr>
-                <w:sz w:val="17"/>
-                <w:szCs w:val="17"/>
+              <w:spacing w:before="0" w:after="0" w:line="240" w:lineRule="auto"/>
+            </w:pPr>
+            <w:r>
+              <w:rPr>
+                <w:sz w:val="20"/>
+                <w:szCs w:val="20"/>
               </w:rPr>
               <w:t>−8.35</w:t>
             </w:r>
@@ -2576,12 +2933,12 @@
           <w:p>
             <w:pPr>
               <w:pStyle w:val="TableText"/>
-              <w:spacing w:before="0" w:after="0" w:line="220" w:lineRule="auto"/>
-            </w:pPr>
-            <w:r>
-              <w:rPr>
-                <w:sz w:val="17"/>
-                <w:szCs w:val="17"/>
+              <w:spacing w:before="0" w:after="0" w:line="240" w:lineRule="auto"/>
+            </w:pPr>
+            <w:r>
+              <w:rPr>
+                <w:sz w:val="20"/>
+                <w:szCs w:val="20"/>
               </w:rPr>
               <w:t>0.12</w:t>
             </w:r>
@@ -2597,12 +2954,12 @@
           <w:p>
             <w:pPr>
               <w:pStyle w:val="TableText"/>
-              <w:spacing w:before="0" w:after="0" w:line="220" w:lineRule="auto"/>
-            </w:pPr>
-            <w:r>
-              <w:rPr>
-                <w:sz w:val="17"/>
-                <w:szCs w:val="17"/>
+              <w:spacing w:before="0" w:after="0" w:line="240" w:lineRule="auto"/>
+            </w:pPr>
+            <w:r>
+              <w:rPr>
+                <w:sz w:val="20"/>
+                <w:szCs w:val="20"/>
               </w:rPr>
               <w:t>12</w:t>
             </w:r>
@@ -2616,12 +2973,12 @@
           <w:p>
             <w:pPr>
               <w:pStyle w:val="TableText"/>
-              <w:spacing w:before="0" w:after="0" w:line="220" w:lineRule="auto"/>
-            </w:pPr>
-            <w:r>
-              <w:rPr>
-                <w:sz w:val="17"/>
-                <w:szCs w:val="17"/>
+              <w:spacing w:before="0" w:after="0" w:line="240" w:lineRule="auto"/>
+            </w:pPr>
+            <w:r>
+              <w:rPr>
+                <w:sz w:val="20"/>
+                <w:szCs w:val="20"/>
               </w:rPr>
               <w:t>HVLLLRQCA</w:t>
             </w:r>
@@ -2635,12 +2992,12 @@
           <w:p>
             <w:pPr>
               <w:pStyle w:val="TableText"/>
-              <w:spacing w:before="0" w:after="0" w:line="220" w:lineRule="auto"/>
-            </w:pPr>
-            <w:r>
-              <w:rPr>
-                <w:sz w:val="17"/>
-                <w:szCs w:val="17"/>
+              <w:spacing w:before="0" w:after="0" w:line="240" w:lineRule="auto"/>
+            </w:pPr>
+            <w:r>
+              <w:rPr>
+                <w:sz w:val="20"/>
+                <w:szCs w:val="20"/>
               </w:rPr>
               <w:t>9</w:t>
             </w:r>
@@ -2654,12 +3011,12 @@
           <w:p>
             <w:pPr>
               <w:pStyle w:val="TableText"/>
-              <w:spacing w:before="0" w:after="0" w:line="220" w:lineRule="auto"/>
-            </w:pPr>
-            <w:r>
-              <w:rPr>
-                <w:sz w:val="17"/>
-                <w:szCs w:val="17"/>
+              <w:spacing w:before="0" w:after="0" w:line="240" w:lineRule="auto"/>
+            </w:pPr>
+            <w:r>
+              <w:rPr>
+                <w:sz w:val="20"/>
+                <w:szCs w:val="20"/>
               </w:rPr>
               <w:t>−8.25</w:t>
             </w:r>
@@ -2673,12 +3030,12 @@
           <w:p>
             <w:pPr>
               <w:pStyle w:val="TableText"/>
-              <w:spacing w:before="0" w:after="0" w:line="220" w:lineRule="auto"/>
-            </w:pPr>
-            <w:r>
-              <w:rPr>
-                <w:sz w:val="17"/>
-                <w:szCs w:val="17"/>
+              <w:spacing w:before="0" w:after="0" w:line="240" w:lineRule="auto"/>
+            </w:pPr>
+            <w:r>
+              <w:rPr>
+                <w:sz w:val="20"/>
+                <w:szCs w:val="20"/>
               </w:rPr>
               <w:t>0.09</w:t>
             </w:r>
@@ -2702,10 +3059,28 @@
     </w:p>
     <w:p>
       <w:pPr>
+        <w:pStyle w:val="Heading3"/>
+        <w:keepNext/>
+      </w:pPr>
+      <w:r>
+        <w:t>主要发现</w:t>
+      </w:r>
+    </w:p>
+    <w:p>
+      <w:pPr>
         <w:pStyle w:val="Normal"/>
       </w:pPr>
       <w:r>
-        <w:t>本研究在保持“预测不等于机制”这一边界的同时形成紧凑验证集合。深度学习和神经网络模型使大规模搜索可行，但基于异质数据训练的输出可能不适用于极短微生物组肽。完整分析中几乎完全阳性的广义抗菌输出也说明，多个模型标签同时为阳性不能替代生物学重复。</w:t>
+        <w:t>本研究重建一条计算漏斗，把数百万条smORF候选缩减为12条主集合和8条严格子集的汇总终点，同时表征另一份12条明确序列并保留现有AChE对接表的评分顺序。主要科学贡献不是验证牙周炎—AD机制，而是形成边界清楚的候选集、明确模型适用性限制，并为恢复缺失的序列层面和实验依据提供有序路径。</w:t>
+      </w:r>
+    </w:p>
+    <w:p>
+      <w:pPr>
+        <w:pStyle w:val="Heading3"/>
+        <w:keepNext/>
+      </w:pPr>
+      <w:r>
+        <w:t>模型级联的解释</w:t>
       </w:r>
     </w:p>
     <w:p>
@@ -2713,37 +3088,38 @@
         <w:pStyle w:val="Normal"/>
       </w:pPr>
       <w:r>
-        <w:t>AChE外周区域可影响Aβ组装，因此可提供合理结构背景</w:t>
-      </w:r>
-      <w:r>
-        <w:t>[18]</w:t>
-      </w:r>
-      <w:r>
-        <w:t>；PDB 4EY6则提供实验测定的人源结构</w:t>
-      </w:r>
-      <w:r>
-        <w:t>[19]</w:t>
-      </w:r>
-      <w:r>
-        <w:t>。然而，Vina属于筛选方法，排序受受体与配体制备、搜索空间和采样影响</w:t>
-      </w:r>
-      <w:r>
-        <w:t>[20]</w:t>
-      </w:r>
-      <w:r>
-        <w:t>。较新Vina实现不能消除这些要求</w:t>
-      </w:r>
-      <w:r>
-        <w:t>[21]</w:t>
-      </w:r>
-      <w:r>
-        <w:t>，柔性肽对接还可能需要肽特异性精修</w:t>
+        <w:t>该级联整合现代神经网络架构，但不能视为多次独立确认。UniDL4BioPep和NTxPred2均使用蛋白质语言模型表示，而mebipred和AnOxPePred包含组成衍生信息，相关序列特征可能沿连续筛选传播。不同训练集在终点定义、序列长度、去冗余、类别平衡和阴性集构建上也存在差异。对于富亮氨酸、带正电且仅7–9 aa的微生物组肽，这些问题尤为重要，因为候选可能偏离训练分布。</w:t>
+      </w:r>
+    </w:p>
+    <w:p>
+      <w:pPr>
+        <w:pStyle w:val="Normal"/>
+      </w:pPr>
+      <w:r>
+        <w:t>接近饱和的抗菌输出提供内部校准警示。它不否定所有排序，但表明共同概率阈值在不同任务中可能具有完全不同的意义。因此，“BBB高分”“神经毒性阳性”“金属结合阳性”、CHEL和FRS都只是操作性模型标签，并不等同于转运、神经元损伤、结合常数、配位几何或氧化还原活性。</w:t>
+      </w:r>
+    </w:p>
+    <w:p>
+      <w:pPr>
+        <w:pStyle w:val="Heading3"/>
+        <w:keepNext/>
+      </w:pPr>
+      <w:r>
+        <w:t>AChE、金属与肽结构假设</w:t>
+      </w:r>
+    </w:p>
+    <w:p>
+      <w:pPr>
+        <w:pStyle w:val="Normal"/>
+      </w:pPr>
+      <w:r>
+        <w:t>AChE外周区域可影响Aβ组装，因此具有生物学相关性，但这一背景不能把对接评分转化为靶点结合。柔性肽具有多种可达构象，质子化、末端状态、受体柔性、初始结构和搜索设置均可能改变排序。独立重现应包含制备后的受体和配体文件、多种起始构象、明确随机种子、全部原始分数与构象，以及FlexPepDock等肽特异性柔性精修</w:t>
       </w:r>
       <w:r>
         <w:t>[22]</w:t>
       </w:r>
       <w:r>
-        <w:t>。缺少构象和运行定义时，评分范围不能证明AChE结合、位点偏好、抑制、选择性或Aβ调节。</w:t>
+        <w:t>。正在进行的MD扩展可从记录完整的起始复合物评价接触持续性和构象行为，而不能替代不确定的对接制备。</w:t>
       </w:r>
     </w:p>
     <w:p>
@@ -2751,7 +3127,24 @@
         <w:pStyle w:val="Normal"/>
       </w:pPr>
       <w:r>
-        <w:t>牙周研究背景同样需要严格限定。现有研究支持考察炎症、牙龈蛋白酶、感染和囊泡相关路径，但不能把群落来源肽归属于</w:t>
+        <w:t>组氨酸和半胱氨酸富集提供潜在金属配位基团，但序列组成不能确定亲和力、化学计量、离子选择性、配位几何、氧化态或氧化还原后果。直接测量应在受控pH和化学计量下比较Cu(II)、Fe(II/III)和Zn(II)，并包括光谱、热力学、活性氧及脂质过氧化终点。需要设置仅肽、仅金属、打乱序列、组成匹配及明确阳性和阴性对照。</w:t>
+      </w:r>
+    </w:p>
+    <w:p>
+      <w:pPr>
+        <w:pStyle w:val="Heading3"/>
+        <w:keepNext/>
+      </w:pPr>
+      <w:r>
+        <w:t>牙周与AD解释</w:t>
+      </w:r>
+    </w:p>
+    <w:p>
+      <w:pPr>
+        <w:pStyle w:val="Normal"/>
+      </w:pPr>
+      <w:r>
+        <w:t>牙周背景仍属于假设生成。人体关联可能受到年龄、吸烟、糖尿病、用药、衰弱、社会经济因素、口腔护理可及性和反向因果影响。</w:t>
       </w:r>
       <w:r>
         <w:rPr>
@@ -2760,7 +3153,16 @@
         <w:t>P. gingivalis</w:t>
       </w:r>
       <w:r>
-        <w:t>。只有建立从序列到组装、样本、临床标签、分类学、表达、循环、BBB转运和靶点作用的候选层面链路，才能进一步检验疾病主张。</w:t>
+        <w:t>实验系统在规定剂量和暴露路径下证明若干可能性，但不能转移到缺少追溯关系的群落肽。当前标签不能证明任何序列具有牙周炎特异性、由</w:t>
+      </w:r>
+      <w:r>
+        <w:rPr>
+          <w:i/>
+        </w:rPr>
+        <w:t>P. gingivalis</w:t>
+      </w:r>
+      <w:r>
+        <w:t>编码、在来源口腔群落中表达、进入循环或到达脑组织。</w:t>
       </w:r>
     </w:p>
     <w:p>
@@ -2768,7 +3170,40 @@
         <w:pStyle w:val="Normal"/>
       </w:pPr>
       <w:r>
-        <w:t>当前优先事项是恢复漏斗逐行成员，确定严格8/12子集，使用固定版本重跑预测和对接，并在合成后验证肽身份与稳定性。随后应在适当对照下评价BBB转运、细胞毒性、Cu/Fe/Zn相互作用、金属依赖氧化还原效应、AChE/BChE功能、直接结合和Aβ表型。缺少逐行映射、原始对接材料、完整MD输入及实验测量，是本研究的决定性局限。</w:t>
+        <w:t>可信的分子链需要序列到contig或组装的映射、样本和临床分组、分类学解析、队列匹配的转录或翻译证据、系统暴露、BBB转运以及可重复的靶点或细胞表型。每一步回答不同问题，不能通过累积更多计算评分来替代。</w:t>
+      </w:r>
+    </w:p>
+    <w:p>
+      <w:pPr>
+        <w:pStyle w:val="Heading3"/>
+        <w:keepNext/>
+      </w:pPr>
+      <w:r>
+        <w:t>验证优先级与局限</w:t>
+      </w:r>
+    </w:p>
+    <w:p>
+      <w:pPr>
+        <w:pStyle w:val="Normal"/>
+      </w:pPr>
+      <w:r>
+        <w:t>首要任务是恢复候选层面数据表，将序列、稳定标识符、基因组坐标、组装、样本、分组、分类学、肽谱证据、每个预测器评分与适用性标记、CHEL/FRS值、主/严格集合成员及对接配体身份连接起来。这将解决12条明确序列是否对应汇总终点，并确定严格8条子集。</w:t>
+      </w:r>
+    </w:p>
+    <w:p>
+      <w:pPr>
+        <w:pStyle w:val="Normal"/>
+      </w:pPr>
+      <w:r>
+        <w:t>固定版本计算重现后，合成肽应依次接受身份、纯度、溶解性、聚集和血清/蛋白酶稳定性检验。BBB转运与细胞毒性应分别采用浓度—反应设计和非神经元对照。随后在预设条件下评价金属化学、AChE/BChE活性、直接结合及Aβ聚集。正在进行的MD扩展将在质量控制后提供轨迹稳定性和接触指标；只有分子身份、暴露、可重复生化活性和生物学重复表型均成立时，才适合进入疾病模型。</w:t>
+      </w:r>
+    </w:p>
+    <w:p>
+      <w:pPr>
+        <w:pStyle w:val="Normal"/>
+      </w:pPr>
+      <w:r>
+        <w:t>决定性局限包括缺少漏斗逐行数据、12与8终点成员未解决、缺少原始对接输入和构象、MD轨迹分析仍在进行，以及缺少生物学测量。健康标记与牙周炎标记库相近的汇总保留率不能支持疾病富集，因为适当推断单位应是参与者或样本。这些限制将当前研究限定为计算优选与验证规划。</w:t>
       </w:r>
     </w:p>
     <w:p>
@@ -2785,7 +3220,7 @@
         <w:pStyle w:val="Normal"/>
       </w:pPr>
       <w:r>
-        <w:t>汇总数据支持一条透明计算漏斗，终点为12条主集合和8条严格子集计数。另一张12条肽的表格提供序列组成和AChE评分排序，但无法逐行连接到这些终点，也未独立产生对接或MD结果。该清单适用于分阶段验证，但不能证明</w:t>
+        <w:t>汇总数据支持一条透明计算漏斗，终点为12条主集合和8条严格子集计数。另一张12条肽的表格提供可复核的序列组成和AChE评分排序，但尚不能逐行连接到这些终点。扩展后的精简稿明确了实际神经网络架构、模型适用性限制、正在进行的100 ns MD扩展及顺序化实验要求。该候选清单适用于独立计算和实验验证，但不能证明</w:t>
       </w:r>
       <w:r>
         <w:rPr>
@@ -2813,23 +3248,23 @@
       </w:pPr>
       <w:r>
         <w:rPr>
-          <w:sz w:val="18"/>
-          <w:szCs w:val="18"/>
+          <w:sz w:val="24"/>
+          <w:szCs w:val="24"/>
         </w:rPr>
         <w:t xml:space="preserve">1. Scheltens P, De Strooper B, Kivipelto M, et al. Alzheimer’s disease. </w:t>
       </w:r>
       <w:r>
         <w:rPr>
           <w:i/>
-          <w:sz w:val="18"/>
-          <w:szCs w:val="18"/>
+          <w:sz w:val="24"/>
+          <w:szCs w:val="24"/>
         </w:rPr>
         <w:t>Lancet</w:t>
       </w:r>
       <w:r>
         <w:rPr>
-          <w:sz w:val="18"/>
-          <w:szCs w:val="18"/>
+          <w:sz w:val="24"/>
+          <w:szCs w:val="24"/>
         </w:rPr>
         <w:t>. 2021;397(10284):1577–1590. doi:10.1016/S0140-6736(20)32205-4.</w:t>
       </w:r>
@@ -2841,23 +3276,23 @@
       </w:pPr>
       <w:r>
         <w:rPr>
-          <w:sz w:val="18"/>
-          <w:szCs w:val="18"/>
+          <w:sz w:val="24"/>
+          <w:szCs w:val="24"/>
         </w:rPr>
         <w:t xml:space="preserve">2. Selkoe DJ, Hardy J. The amyloid hypothesis of Alzheimer’s disease at 25 years. </w:t>
       </w:r>
       <w:r>
         <w:rPr>
           <w:i/>
-          <w:sz w:val="18"/>
-          <w:szCs w:val="18"/>
+          <w:sz w:val="24"/>
+          <w:szCs w:val="24"/>
         </w:rPr>
         <w:t>EMBO Mol Med</w:t>
       </w:r>
       <w:r>
         <w:rPr>
-          <w:sz w:val="18"/>
-          <w:szCs w:val="18"/>
+          <w:sz w:val="24"/>
+          <w:szCs w:val="24"/>
         </w:rPr>
         <w:t>. 2016;8(6):595–608. doi:10.15252/emmm.201606210.</w:t>
       </w:r>
@@ -2869,23 +3304,23 @@
       </w:pPr>
       <w:r>
         <w:rPr>
-          <w:sz w:val="18"/>
-          <w:szCs w:val="18"/>
+          <w:sz w:val="24"/>
+          <w:szCs w:val="24"/>
         </w:rPr>
         <w:t xml:space="preserve">3. Chalmers JC, Hernandez-Kapila YL. The role of the oral microbiome, host response, and periodontal disease treatment in Alzheimer’s disease: a primer. </w:t>
       </w:r>
       <w:r>
         <w:rPr>
           <w:i/>
-          <w:sz w:val="18"/>
-          <w:szCs w:val="18"/>
+          <w:sz w:val="24"/>
+          <w:szCs w:val="24"/>
         </w:rPr>
         <w:t>Periodontol 2000</w:t>
       </w:r>
       <w:r>
         <w:rPr>
-          <w:sz w:val="18"/>
-          <w:szCs w:val="18"/>
+          <w:sz w:val="24"/>
+          <w:szCs w:val="24"/>
         </w:rPr>
         <w:t>. 2025;98(1):220–227. doi:10.1111/prd.12631.</w:t>
       </w:r>
@@ -2897,23 +3332,23 @@
       </w:pPr>
       <w:r>
         <w:rPr>
-          <w:sz w:val="18"/>
-          <w:szCs w:val="18"/>
+          <w:sz w:val="24"/>
+          <w:szCs w:val="24"/>
         </w:rPr>
         <w:t xml:space="preserve">4. Guo Y, Nguyen KA, Potempa J. Dichotomy of gingipains action as virulence factors. </w:t>
       </w:r>
       <w:r>
         <w:rPr>
           <w:i/>
-          <w:sz w:val="18"/>
-          <w:szCs w:val="18"/>
+          <w:sz w:val="24"/>
+          <w:szCs w:val="24"/>
         </w:rPr>
         <w:t>Periodontol 2000</w:t>
       </w:r>
       <w:r>
         <w:rPr>
-          <w:sz w:val="18"/>
-          <w:szCs w:val="18"/>
+          <w:sz w:val="24"/>
+          <w:szCs w:val="24"/>
         </w:rPr>
         <w:t>. 2010;54(1):15–44. doi:10.1111/j.1600-0757.2010.00377.x.</w:t>
       </w:r>
@@ -2925,38 +3360,38 @@
       </w:pPr>
       <w:r>
         <w:rPr>
-          <w:sz w:val="18"/>
-          <w:szCs w:val="18"/>
+          <w:sz w:val="24"/>
+          <w:szCs w:val="24"/>
         </w:rPr>
         <w:t xml:space="preserve">5. Dominy SS, Lynch C, Ermini F, et al. </w:t>
       </w:r>
       <w:r>
         <w:rPr>
           <w:i/>
-          <w:sz w:val="18"/>
-          <w:szCs w:val="18"/>
+          <w:sz w:val="24"/>
+          <w:szCs w:val="24"/>
         </w:rPr>
         <w:t>Porphyromonas gingivalis</w:t>
       </w:r>
       <w:r>
         <w:rPr>
-          <w:sz w:val="18"/>
-          <w:szCs w:val="18"/>
+          <w:sz w:val="24"/>
+          <w:szCs w:val="24"/>
         </w:rPr>
         <w:t xml:space="preserve"> in Alzheimer’s disease brains. </w:t>
       </w:r>
       <w:r>
         <w:rPr>
           <w:i/>
-          <w:sz w:val="18"/>
-          <w:szCs w:val="18"/>
+          <w:sz w:val="24"/>
+          <w:szCs w:val="24"/>
         </w:rPr>
         <w:t>Sci Adv</w:t>
       </w:r>
       <w:r>
         <w:rPr>
-          <w:sz w:val="18"/>
-          <w:szCs w:val="18"/>
+          <w:sz w:val="24"/>
+          <w:szCs w:val="24"/>
         </w:rPr>
         <w:t>. 2019;5(1):eaau3333. doi:10.1126/sciadv.aau3333.</w:t>
       </w:r>
@@ -2968,23 +3403,23 @@
       </w:pPr>
       <w:r>
         <w:rPr>
-          <w:sz w:val="18"/>
-          <w:szCs w:val="18"/>
+          <w:sz w:val="24"/>
+          <w:szCs w:val="24"/>
         </w:rPr>
         <w:t xml:space="preserve">6. Ilievski V, Zuchowska PK, Green SJ, et al. Chronic oral application of a periodontal pathogen results in brain inflammation, neurodegeneration and amyloid beta production in wild type mice. </w:t>
       </w:r>
       <w:r>
         <w:rPr>
           <w:i/>
-          <w:sz w:val="18"/>
-          <w:szCs w:val="18"/>
+          <w:sz w:val="24"/>
+          <w:szCs w:val="24"/>
         </w:rPr>
         <w:t>PLoS One</w:t>
       </w:r>
       <w:r>
         <w:rPr>
-          <w:sz w:val="18"/>
-          <w:szCs w:val="18"/>
+          <w:sz w:val="24"/>
+          <w:szCs w:val="24"/>
         </w:rPr>
         <w:t>. 2018;13(10):e0204941. doi:10.1371/journal.pone.0204941.</w:t>
       </w:r>
@@ -2996,38 +3431,38 @@
       </w:pPr>
       <w:r>
         <w:rPr>
-          <w:sz w:val="18"/>
-          <w:szCs w:val="18"/>
+          <w:sz w:val="24"/>
+          <w:szCs w:val="24"/>
         </w:rPr>
         <w:t xml:space="preserve">7. Nara PL, Sindelar D, Penn MS, et al. </w:t>
       </w:r>
       <w:r>
         <w:rPr>
           <w:i/>
-          <w:sz w:val="18"/>
-          <w:szCs w:val="18"/>
+          <w:sz w:val="24"/>
+          <w:szCs w:val="24"/>
         </w:rPr>
         <w:t>Porphyromonas gingivalis</w:t>
       </w:r>
       <w:r>
         <w:rPr>
-          <w:sz w:val="18"/>
-          <w:szCs w:val="18"/>
+          <w:sz w:val="24"/>
+          <w:szCs w:val="24"/>
         </w:rPr>
         <w:t xml:space="preserve"> outer membrane vesicles as the major driver of and explanation for neuropathogenesis. </w:t>
       </w:r>
       <w:r>
         <w:rPr>
           <w:i/>
-          <w:sz w:val="18"/>
-          <w:szCs w:val="18"/>
+          <w:sz w:val="24"/>
+          <w:szCs w:val="24"/>
         </w:rPr>
         <w:t>J Alzheimers Dis</w:t>
       </w:r>
       <w:r>
         <w:rPr>
-          <w:sz w:val="18"/>
-          <w:szCs w:val="18"/>
+          <w:sz w:val="24"/>
+          <w:szCs w:val="24"/>
         </w:rPr>
         <w:t>. 2021;82(4):1417–1450. doi:10.3233/JAD-210448.</w:t>
       </w:r>
@@ -3039,23 +3474,23 @@
       </w:pPr>
       <w:r>
         <w:rPr>
-          <w:sz w:val="18"/>
-          <w:szCs w:val="18"/>
+          <w:sz w:val="24"/>
+          <w:szCs w:val="24"/>
         </w:rPr>
         <w:t xml:space="preserve">8. Hu C, Li H, Huang L, et al. Periodontal disease and risk of Alzheimer’s disease: a two-sample Mendelian randomization. </w:t>
       </w:r>
       <w:r>
         <w:rPr>
           <w:i/>
-          <w:sz w:val="18"/>
-          <w:szCs w:val="18"/>
+          <w:sz w:val="24"/>
+          <w:szCs w:val="24"/>
         </w:rPr>
         <w:t>Brain Behav</w:t>
       </w:r>
       <w:r>
         <w:rPr>
-          <w:sz w:val="18"/>
-          <w:szCs w:val="18"/>
+          <w:sz w:val="24"/>
+          <w:szCs w:val="24"/>
         </w:rPr>
         <w:t>. 2024;14(4):e3486. doi:10.1002/brb3.3486.</w:t>
       </w:r>
@@ -3067,23 +3502,23 @@
       </w:pPr>
       <w:r>
         <w:rPr>
-          <w:sz w:val="18"/>
-          <w:szCs w:val="18"/>
+          <w:sz w:val="24"/>
+          <w:szCs w:val="24"/>
         </w:rPr>
         <w:t xml:space="preserve">9. Sberro H, Fremin BJ, Zlitni S, et al. Large-scale analyses of human microbiomes reveal thousands of small, novel genes. </w:t>
       </w:r>
       <w:r>
         <w:rPr>
           <w:i/>
-          <w:sz w:val="18"/>
-          <w:szCs w:val="18"/>
+          <w:sz w:val="24"/>
+          <w:szCs w:val="24"/>
         </w:rPr>
         <w:t>Cell</w:t>
       </w:r>
       <w:r>
         <w:rPr>
-          <w:sz w:val="18"/>
-          <w:szCs w:val="18"/>
+          <w:sz w:val="24"/>
+          <w:szCs w:val="24"/>
         </w:rPr>
         <w:t>. 2019;178(5):1245–1259.e14. doi:10.1016/j.cell.2019.07.016.</w:t>
       </w:r>
@@ -3095,23 +3530,23 @@
       </w:pPr>
       <w:r>
         <w:rPr>
-          <w:sz w:val="18"/>
-          <w:szCs w:val="18"/>
+          <w:sz w:val="24"/>
+          <w:szCs w:val="24"/>
         </w:rPr>
         <w:t xml:space="preserve">10. Durrant MG, Bhatt AS. Automated prediction and annotation of small open reading frames in microbial genomes. </w:t>
       </w:r>
       <w:r>
         <w:rPr>
           <w:i/>
-          <w:sz w:val="18"/>
-          <w:szCs w:val="18"/>
+          <w:sz w:val="24"/>
+          <w:szCs w:val="24"/>
         </w:rPr>
         <w:t>Cell Host Microbe</w:t>
       </w:r>
       <w:r>
         <w:rPr>
-          <w:sz w:val="18"/>
-          <w:szCs w:val="18"/>
+          <w:sz w:val="24"/>
+          <w:szCs w:val="24"/>
         </w:rPr>
         <w:t>. 2021;29(1):121–131.e4. doi:10.1016/j.chom.2020.11.002.</w:t>
       </w:r>
@@ -3123,23 +3558,23 @@
       </w:pPr>
       <w:r>
         <w:rPr>
-          <w:sz w:val="18"/>
-          <w:szCs w:val="18"/>
+          <w:sz w:val="24"/>
+          <w:szCs w:val="24"/>
         </w:rPr>
         <w:t xml:space="preserve">11. Belstrøm D, Constancias F, Drautz-Moses DI, et al. Periodontitis associates with species-specific gene expression of the oral microbiota. </w:t>
       </w:r>
       <w:r>
         <w:rPr>
           <w:i/>
-          <w:sz w:val="18"/>
-          <w:szCs w:val="18"/>
+          <w:sz w:val="24"/>
+          <w:szCs w:val="24"/>
         </w:rPr>
         <w:t>npj Biofilms Microbiomes</w:t>
       </w:r>
       <w:r>
         <w:rPr>
-          <w:sz w:val="18"/>
-          <w:szCs w:val="18"/>
+          <w:sz w:val="24"/>
+          <w:szCs w:val="24"/>
         </w:rPr>
         <w:t>. 2021;7:76. doi:10.1038/s41522-021-00247-y.</w:t>
       </w:r>
@@ -3151,23 +3586,23 @@
       </w:pPr>
       <w:r>
         <w:rPr>
-          <w:sz w:val="18"/>
-          <w:szCs w:val="18"/>
+          <w:sz w:val="24"/>
+          <w:szCs w:val="24"/>
         </w:rPr>
         <w:t xml:space="preserve">12. Du Z, Ding X, Xu Y, Li Y. UniDL4BioPep: a universal deep learning architecture for binary classification in peptide bioactivity. </w:t>
       </w:r>
       <w:r>
         <w:rPr>
           <w:i/>
-          <w:sz w:val="18"/>
-          <w:szCs w:val="18"/>
+          <w:sz w:val="24"/>
+          <w:szCs w:val="24"/>
         </w:rPr>
         <w:t>Brief Bioinform</w:t>
       </w:r>
       <w:r>
         <w:rPr>
-          <w:sz w:val="18"/>
-          <w:szCs w:val="18"/>
+          <w:sz w:val="24"/>
+          <w:szCs w:val="24"/>
         </w:rPr>
         <w:t>. 2023;24(3):bbad135. doi:10.1093/bib/bbad135.</w:t>
       </w:r>
@@ -3179,23 +3614,23 @@
       </w:pPr>
       <w:r>
         <w:rPr>
-          <w:sz w:val="18"/>
-          <w:szCs w:val="18"/>
+          <w:sz w:val="24"/>
+          <w:szCs w:val="24"/>
         </w:rPr>
         <w:t xml:space="preserve">13. Rathore AS, Jain S, Choudhury S, Raghava GPS. A large language model for predicting neurotoxic peptides and neurotoxins. </w:t>
       </w:r>
       <w:r>
         <w:rPr>
           <w:i/>
-          <w:sz w:val="18"/>
-          <w:szCs w:val="18"/>
+          <w:sz w:val="24"/>
+          <w:szCs w:val="24"/>
         </w:rPr>
         <w:t>Protein Sci</w:t>
       </w:r>
       <w:r>
         <w:rPr>
-          <w:sz w:val="18"/>
-          <w:szCs w:val="18"/>
+          <w:sz w:val="24"/>
+          <w:szCs w:val="24"/>
         </w:rPr>
         <w:t>. 2025;34(8):e70200. doi:10.1002/pro.70200.</w:t>
       </w:r>
@@ -3207,23 +3642,23 @@
       </w:pPr>
       <w:r>
         <w:rPr>
-          <w:sz w:val="18"/>
-          <w:szCs w:val="18"/>
+          <w:sz w:val="24"/>
+          <w:szCs w:val="24"/>
         </w:rPr>
         <w:t xml:space="preserve">14. Aptekmann AA, Buongiorno J, Giovannelli D, et al. mebipred: identifying metal-binding potential in protein sequence. </w:t>
       </w:r>
       <w:r>
         <w:rPr>
           <w:i/>
-          <w:sz w:val="18"/>
-          <w:szCs w:val="18"/>
+          <w:sz w:val="24"/>
+          <w:szCs w:val="24"/>
         </w:rPr>
         <w:t>Bioinformatics</w:t>
       </w:r>
       <w:r>
         <w:rPr>
-          <w:sz w:val="18"/>
-          <w:szCs w:val="18"/>
+          <w:sz w:val="24"/>
+          <w:szCs w:val="24"/>
         </w:rPr>
         <w:t>. 2022;38(14):3532–3540. doi:10.1093/bioinformatics/btac358.</w:t>
       </w:r>
@@ -3235,23 +3670,23 @@
       </w:pPr>
       <w:r>
         <w:rPr>
-          <w:sz w:val="18"/>
-          <w:szCs w:val="18"/>
+          <w:sz w:val="24"/>
+          <w:szCs w:val="24"/>
         </w:rPr>
         <w:t xml:space="preserve">15. Olsen TH, Yesiltas B, Marin FI, et al. AnOxPePred: using deep learning for the prediction of antioxidative properties of peptides. </w:t>
       </w:r>
       <w:r>
         <w:rPr>
           <w:i/>
-          <w:sz w:val="18"/>
-          <w:szCs w:val="18"/>
+          <w:sz w:val="24"/>
+          <w:szCs w:val="24"/>
         </w:rPr>
         <w:t>Sci Rep</w:t>
       </w:r>
       <w:r>
         <w:rPr>
-          <w:sz w:val="18"/>
-          <w:szCs w:val="18"/>
+          <w:sz w:val="24"/>
+          <w:szCs w:val="24"/>
         </w:rPr>
         <w:t>. 2020;10:21471. doi:10.1038/s41598-020-78319-w.</w:t>
       </w:r>
@@ -3263,25 +3698,25 @@
       </w:pPr>
       <w:r>
         <w:rPr>
-          <w:sz w:val="18"/>
-          <w:szCs w:val="18"/>
-        </w:rPr>
-        <w:t xml:space="preserve">16. Abraham MJ, Murtola T, Schulz R, et al. GROMACS: high performance molecular simulations through multi-level parallelism from laptops to supercomputers. </w:t>
+          <w:sz w:val="24"/>
+          <w:szCs w:val="24"/>
+        </w:rPr>
+        <w:t xml:space="preserve">16. Inestrosa NC, Alvarez A, Pérez CA, et al. Acetylcholinesterase accelerates assembly of amyloid-β-peptides into Alzheimer’s fibrils. </w:t>
       </w:r>
       <w:r>
         <w:rPr>
           <w:i/>
-          <w:sz w:val="18"/>
-          <w:szCs w:val="18"/>
-        </w:rPr>
-        <w:t>SoftwareX</w:t>
-      </w:r>
-      <w:r>
-        <w:rPr>
-          <w:sz w:val="18"/>
-          <w:szCs w:val="18"/>
-        </w:rPr>
-        <w:t>. 2015;1–2:19–25. doi:10.1016/j.softx.2015.06.001.</w:t>
+          <w:sz w:val="24"/>
+          <w:szCs w:val="24"/>
+        </w:rPr>
+        <w:t>Neuron</w:t>
+      </w:r>
+      <w:r>
+        <w:rPr>
+          <w:sz w:val="24"/>
+          <w:szCs w:val="24"/>
+        </w:rPr>
+        <w:t>. 1996;16(4):881–891. doi:10.1016/s0896-6273(00)80108-7.</w:t>
       </w:r>
     </w:p>
     <w:p>
@@ -3291,25 +3726,25 @@
       </w:pPr>
       <w:r>
         <w:rPr>
-          <w:sz w:val="18"/>
-          <w:szCs w:val="18"/>
-        </w:rPr>
-        <w:t xml:space="preserve">17. Lindorff-Larsen K, Piana S, Palmo K, et al. Improved side-chain torsion potentials for the Amber ff99SB protein force field. </w:t>
+          <w:sz w:val="24"/>
+          <w:szCs w:val="24"/>
+        </w:rPr>
+        <w:t xml:space="preserve">17. Cheung J, Rudolph MJ, Burshteyn F, et al. Structures of human acetylcholinesterase in complex with pharmacologically important ligands. </w:t>
       </w:r>
       <w:r>
         <w:rPr>
           <w:i/>
-          <w:sz w:val="18"/>
-          <w:szCs w:val="18"/>
-        </w:rPr>
-        <w:t>Proteins</w:t>
-      </w:r>
-      <w:r>
-        <w:rPr>
-          <w:sz w:val="18"/>
-          <w:szCs w:val="18"/>
-        </w:rPr>
-        <w:t>. 2010;78(8):1950–1958. doi:10.1002/prot.22711.</w:t>
+          <w:sz w:val="24"/>
+          <w:szCs w:val="24"/>
+        </w:rPr>
+        <w:t>J Med Chem</w:t>
+      </w:r>
+      <w:r>
+        <w:rPr>
+          <w:sz w:val="24"/>
+          <w:szCs w:val="24"/>
+        </w:rPr>
+        <w:t>. 2012;55(23):10282–10286. doi:10.1021/jm300871x.</w:t>
       </w:r>
     </w:p>
     <w:p>
@@ -3319,25 +3754,25 @@
       </w:pPr>
       <w:r>
         <w:rPr>
-          <w:sz w:val="18"/>
-          <w:szCs w:val="18"/>
-        </w:rPr>
-        <w:t xml:space="preserve">18. Inestrosa NC, Alvarez A, Pérez CA, et al. Acetylcholinesterase accelerates assembly of amyloid-β-peptides into Alzheimer’s fibrils. </w:t>
+          <w:sz w:val="24"/>
+          <w:szCs w:val="24"/>
+        </w:rPr>
+        <w:t xml:space="preserve">18. Trott O, Olson AJ. AutoDock Vina: improving the speed and accuracy of docking with a new scoring function. </w:t>
       </w:r>
       <w:r>
         <w:rPr>
           <w:i/>
-          <w:sz w:val="18"/>
-          <w:szCs w:val="18"/>
-        </w:rPr>
-        <w:t>Neuron</w:t>
-      </w:r>
-      <w:r>
-        <w:rPr>
-          <w:sz w:val="18"/>
-          <w:szCs w:val="18"/>
-        </w:rPr>
-        <w:t>. 1996;16(4):881–891. doi:10.1016/s0896-6273(00)80108-7.</w:t>
+          <w:sz w:val="24"/>
+          <w:szCs w:val="24"/>
+        </w:rPr>
+        <w:t>J Comput Chem</w:t>
+      </w:r>
+      <w:r>
+        <w:rPr>
+          <w:sz w:val="24"/>
+          <w:szCs w:val="24"/>
+        </w:rPr>
+        <w:t>. 2010;31(2):455–461. doi:10.1002/jcc.21334.</w:t>
       </w:r>
     </w:p>
     <w:p>
@@ -3347,25 +3782,25 @@
       </w:pPr>
       <w:r>
         <w:rPr>
-          <w:sz w:val="18"/>
-          <w:szCs w:val="18"/>
-        </w:rPr>
-        <w:t xml:space="preserve">19. Cheung J, Rudolph MJ, Burshteyn F, et al. Structures of human acetylcholinesterase in complex with pharmacologically important ligands. </w:t>
+          <w:sz w:val="24"/>
+          <w:szCs w:val="24"/>
+        </w:rPr>
+        <w:t xml:space="preserve">19. Eberhardt J, Santos-Martins D, Tillack AF, Forli S. AutoDock Vina 1.2.0: new docking methods, expanded force field, and Python bindings. </w:t>
       </w:r>
       <w:r>
         <w:rPr>
           <w:i/>
-          <w:sz w:val="18"/>
-          <w:szCs w:val="18"/>
-        </w:rPr>
-        <w:t>J Med Chem</w:t>
-      </w:r>
-      <w:r>
-        <w:rPr>
-          <w:sz w:val="18"/>
-          <w:szCs w:val="18"/>
-        </w:rPr>
-        <w:t>. 2012;55(23):10282–10286. doi:10.1021/jm300871x.</w:t>
+          <w:sz w:val="24"/>
+          <w:szCs w:val="24"/>
+        </w:rPr>
+        <w:t>J Chem Inf Model</w:t>
+      </w:r>
+      <w:r>
+        <w:rPr>
+          <w:sz w:val="24"/>
+          <w:szCs w:val="24"/>
+        </w:rPr>
+        <w:t>. 2021;61(8):3891–3898. doi:10.1021/acs.jcim.1c00203.</w:t>
       </w:r>
     </w:p>
     <w:p>
@@ -3375,25 +3810,25 @@
       </w:pPr>
       <w:r>
         <w:rPr>
-          <w:sz w:val="18"/>
-          <w:szCs w:val="18"/>
-        </w:rPr>
-        <w:t xml:space="preserve">20. Trott O, Olson AJ. AutoDock Vina: improving the speed and accuracy of docking with a new scoring function. </w:t>
+          <w:sz w:val="24"/>
+          <w:szCs w:val="24"/>
+        </w:rPr>
+        <w:t xml:space="preserve">20. Abraham MJ, Murtola T, Schulz R, et al. GROMACS: high performance molecular simulations through multi-level parallelism from laptops to supercomputers. </w:t>
       </w:r>
       <w:r>
         <w:rPr>
           <w:i/>
-          <w:sz w:val="18"/>
-          <w:szCs w:val="18"/>
-        </w:rPr>
-        <w:t>J Comput Chem</w:t>
-      </w:r>
-      <w:r>
-        <w:rPr>
-          <w:sz w:val="18"/>
-          <w:szCs w:val="18"/>
-        </w:rPr>
-        <w:t>. 2010;31(2):455–461. doi:10.1002/jcc.21334.</w:t>
+          <w:sz w:val="24"/>
+          <w:szCs w:val="24"/>
+        </w:rPr>
+        <w:t>SoftwareX</w:t>
+      </w:r>
+      <w:r>
+        <w:rPr>
+          <w:sz w:val="24"/>
+          <w:szCs w:val="24"/>
+        </w:rPr>
+        <w:t>. 2015;1–2:19–25. doi:10.1016/j.softx.2015.06.001.</w:t>
       </w:r>
     </w:p>
     <w:p>
@@ -3403,25 +3838,25 @@
       </w:pPr>
       <w:r>
         <w:rPr>
-          <w:sz w:val="18"/>
-          <w:szCs w:val="18"/>
-        </w:rPr>
-        <w:t xml:space="preserve">21. Eberhardt J, Santos-Martins D, Tillack AF, Forli S. AutoDock Vina 1.2.0: new docking methods, expanded force field, and Python bindings. </w:t>
+          <w:sz w:val="24"/>
+          <w:szCs w:val="24"/>
+        </w:rPr>
+        <w:t xml:space="preserve">21. Lindorff-Larsen K, Piana S, Palmo K, et al. Improved side-chain torsion potentials for the Amber ff99SB protein force field. </w:t>
       </w:r>
       <w:r>
         <w:rPr>
           <w:i/>
-          <w:sz w:val="18"/>
-          <w:szCs w:val="18"/>
-        </w:rPr>
-        <w:t>J Chem Inf Model</w:t>
-      </w:r>
-      <w:r>
-        <w:rPr>
-          <w:sz w:val="18"/>
-          <w:szCs w:val="18"/>
-        </w:rPr>
-        <w:t>. 2021;61(8):3891–3898. doi:10.1021/acs.jcim.1c00203.</w:t>
+          <w:sz w:val="24"/>
+          <w:szCs w:val="24"/>
+        </w:rPr>
+        <w:t>Proteins</w:t>
+      </w:r>
+      <w:r>
+        <w:rPr>
+          <w:sz w:val="24"/>
+          <w:szCs w:val="24"/>
+        </w:rPr>
+        <w:t>. 2010;78(8):1950–1958. doi:10.1002/prot.22711.</w:t>
       </w:r>
     </w:p>
     <w:p>
@@ -3431,32 +3866,32 @@
       </w:pPr>
       <w:r>
         <w:rPr>
-          <w:sz w:val="18"/>
-          <w:szCs w:val="18"/>
+          <w:sz w:val="24"/>
+          <w:szCs w:val="24"/>
         </w:rPr>
         <w:t xml:space="preserve">22. London N, Raveh B, Cohen E, et al. Rosetta FlexPepDock web server—high resolution modeling of peptide–protein interactions. </w:t>
       </w:r>
       <w:r>
         <w:rPr>
           <w:i/>
-          <w:sz w:val="18"/>
-          <w:szCs w:val="18"/>
+          <w:sz w:val="24"/>
+          <w:szCs w:val="24"/>
         </w:rPr>
         <w:t>Nucleic Acids Res</w:t>
       </w:r>
       <w:r>
         <w:rPr>
-          <w:sz w:val="18"/>
-          <w:szCs w:val="18"/>
+          <w:sz w:val="24"/>
+          <w:szCs w:val="24"/>
         </w:rPr>
         <w:t>. 2011;39:W249–W253. doi:10.1093/nar/gkr326.</w:t>
       </w:r>
     </w:p>
     <w:sectPr>
       <w:pgSz w:w="11906" w:h="16838"/>
-      <w:pgMar w:top="1134" w:right="1134" w:bottom="1134" w:left="1134" w:header="600" w:footer="600" w:gutter="0"/>
+      <w:pgMar w:top="1440" w:right="1440" w:bottom="1440" w:left="1440" w:header="600" w:footer="600" w:gutter="0"/>
       <w:cols w:space="720"/>
-      <w:docGrid w:linePitch="312"/>
+      <w:docGrid w:linePitch="480"/>
     </w:sectPr>
   </w:body>
 </w:document>
@@ -3468,15 +3903,16 @@
     <w:rPrDefault>
       <w:rPr>
         <w:rFonts w:ascii="Times New Roman" w:hAnsi="Times New Roman" w:eastAsia="宋体" w:cs="Times New Roman"/>
-        <w:sz w:val="22"/>
-        <w:szCs w:val="22"/>
+        <w:sz w:val="24"/>
+        <w:szCs w:val="24"/>
         <w:lang w:val="en-US" w:eastAsia="zh-CN"/>
       </w:rPr>
     </w:rPrDefault>
     <w:pPrDefault>
       <w:pPr>
-        <w:spacing w:after="120" w:line="276" w:lineRule="auto"/>
+        <w:spacing w:before="0" w:after="0" w:line="480" w:lineRule="auto"/>
         <w:jc w:val="both"/>
+        <w:widowControl/>
       </w:pPr>
     </w:pPrDefault>
   </w:docDefaults>
@@ -3484,8 +3920,14 @@
     <w:name w:val="Normal"/>
     <w:qFormat/>
     <w:pPr>
+      <w:spacing w:before="0" w:after="0" w:line="480" w:lineRule="auto"/>
+      <w:jc w:val="both"/>
       <w:widowControl/>
     </w:pPr>
+    <w:rPr>
+      <w:sz w:val="24"/>
+      <w:szCs w:val="24"/>
+    </w:rPr>
   </w:style>
   <w:style w:type="paragraph" w:styleId="Heading1">
     <w:name w:val="heading 1"/>
@@ -3495,16 +3937,16 @@
     <w:pPr>
       <w:keepNext/>
       <w:keepLines/>
-      <w:spacing w:before="240" w:after="180"/>
-      <w:jc w:val="center"/>
+      <w:spacing w:before="240" w:after="120"/>
+      <w:jc w:val="left"/>
       <w:outlineLvl w:val="0"/>
     </w:pPr>
     <w:rPr>
-      <w:rFonts w:ascii="Arial" w:hAnsi="Arial" w:eastAsia="黑体"/>
+      <w:rFonts w:ascii="Times New Roman" w:hAnsi="Times New Roman" w:eastAsia="黑体"/>
       <w:b/>
-      <w:color w:val="17365D"/>
-      <w:sz w:val="36"/>
-      <w:szCs w:val="36"/>
+      <w:color w:val="000000"/>
+      <w:sz w:val="30"/>
+      <w:szCs w:val="30"/>
     </w:rPr>
   </w:style>
   <w:style w:type="paragraph" w:styleId="Heading2">
@@ -3515,15 +3957,16 @@
     <w:pPr>
       <w:keepNext/>
       <w:keepLines/>
-      <w:spacing w:before="280" w:after="140"/>
+      <w:spacing w:before="240" w:after="120"/>
+      <w:jc w:val="left"/>
       <w:outlineLvl w:val="1"/>
     </w:pPr>
     <w:rPr>
-      <w:rFonts w:ascii="Arial" w:hAnsi="Arial" w:eastAsia="黑体"/>
+      <w:rFonts w:ascii="Times New Roman" w:hAnsi="Times New Roman" w:eastAsia="黑体"/>
       <w:b/>
-      <w:color w:val="17365D"/>
-      <w:sz w:val="30"/>
-      <w:szCs w:val="30"/>
+      <w:color w:val="000000"/>
+      <w:sz w:val="28"/>
+      <w:szCs w:val="28"/>
     </w:rPr>
   </w:style>
   <w:style w:type="paragraph" w:styleId="Heading3">
@@ -3533,15 +3976,17 @@
     <w:qFormat/>
     <w:pPr>
       <w:keepNext/>
-      <w:spacing w:before="220" w:after="100"/>
+      <w:keepLines/>
+      <w:spacing w:before="180" w:after="60"/>
       <w:outlineLvl w:val="2"/>
     </w:pPr>
     <w:rPr>
-      <w:rFonts w:ascii="Arial" w:hAnsi="Arial" w:eastAsia="黑体"/>
+      <w:rFonts w:ascii="Times New Roman" w:hAnsi="Times New Roman" w:eastAsia="黑体"/>
       <w:b/>
-      <w:color w:val="2F5597"/>
-      <w:sz w:val="26"/>
-      <w:szCs w:val="26"/>
+      <w:i/>
+      <w:color w:val="000000"/>
+      <w:sz w:val="24"/>
+      <w:szCs w:val="24"/>
     </w:rPr>
   </w:style>
   <w:style w:type="paragraph" w:styleId="Heading4">
@@ -3551,40 +3996,37 @@
     <w:qFormat/>
     <w:pPr>
       <w:keepNext/>
-      <w:spacing w:before="180" w:after="80"/>
+      <w:spacing w:before="120" w:after="0"/>
       <w:outlineLvl w:val="3"/>
     </w:pPr>
     <w:rPr>
-      <w:rFonts w:ascii="Arial" w:hAnsi="Arial" w:eastAsia="黑体"/>
-      <w:b/>
-      <w:color w:val="365F91"/>
-      <w:sz w:val="23"/>
-      <w:szCs w:val="23"/>
+      <w:i/>
+      <w:color w:val="000000"/>
+      <w:sz w:val="24"/>
+      <w:szCs w:val="24"/>
     </w:rPr>
   </w:style>
   <w:style w:type="paragraph" w:styleId="Note">
     <w:name w:val="Note"/>
     <w:basedOn w:val="Normal"/>
     <w:pPr>
-      <w:spacing w:after="80"/>
-      <w:jc w:val="left"/>
+      <w:spacing w:after="0" w:line="480" w:lineRule="auto"/>
     </w:pPr>
     <w:rPr>
-      <w:color w:val="5B6573"/>
       <w:i/>
-      <w:sz w:val="19"/>
-      <w:szCs w:val="19"/>
+      <w:sz w:val="24"/>
+      <w:szCs w:val="24"/>
     </w:rPr>
   </w:style>
   <w:style w:type="paragraph" w:styleId="Keywords">
     <w:name w:val="Keywords"/>
     <w:basedOn w:val="Normal"/>
     <w:pPr>
-      <w:spacing w:after="160"/>
+      <w:spacing w:after="120" w:line="480" w:lineRule="auto"/>
     </w:pPr>
     <w:rPr>
-      <w:sz w:val="20"/>
-      <w:szCs w:val="20"/>
+      <w:sz w:val="24"/>
+      <w:szCs w:val="24"/>
     </w:rPr>
   </w:style>
   <w:style w:type="paragraph" w:styleId="Caption">
@@ -3592,52 +4034,47 @@
     <w:basedOn w:val="Normal"/>
     <w:pPr>
       <w:keepNext/>
-      <w:spacing w:before="60" w:after="120"/>
+      <w:spacing w:before="120" w:after="60" w:line="240" w:lineRule="auto"/>
       <w:jc w:val="left"/>
     </w:pPr>
     <w:rPr>
-      <w:i/>
-      <w:sz w:val="18"/>
-      <w:szCs w:val="18"/>
+      <w:sz w:val="20"/>
+      <w:szCs w:val="20"/>
     </w:rPr>
   </w:style>
   <w:style w:type="paragraph" w:styleId="Figure">
     <w:name w:val="Figure"/>
     <w:basedOn w:val="Normal"/>
-    <w:pPr>
-      <w:spacing w:before="120" w:after="60"/>
-      <w:jc w:val="center"/>
-    </w:pPr>
   </w:style>
   <w:style w:type="paragraph" w:styleId="Reference">
     <w:name w:val="Reference"/>
     <w:basedOn w:val="Normal"/>
     <w:pPr>
-      <w:spacing w:after="60" w:line="220" w:lineRule="auto"/>
+      <w:spacing w:after="0" w:line="480" w:lineRule="auto"/>
       <w:jc w:val="left"/>
     </w:pPr>
     <w:rPr>
-      <w:sz w:val="18"/>
-      <w:szCs w:val="18"/>
+      <w:sz w:val="24"/>
+      <w:szCs w:val="24"/>
     </w:rPr>
   </w:style>
   <w:style w:type="paragraph" w:styleId="ListParagraph">
     <w:name w:val="List Paragraph"/>
     <w:basedOn w:val="Normal"/>
     <w:pPr>
-      <w:spacing w:after="60"/>
+      <w:spacing w:after="0" w:line="480" w:lineRule="auto"/>
     </w:pPr>
   </w:style>
   <w:style w:type="paragraph" w:styleId="TableText">
     <w:name w:val="Table Text"/>
     <w:basedOn w:val="Normal"/>
     <w:pPr>
-      <w:spacing w:after="0"/>
+      <w:spacing w:before="0" w:after="0" w:line="240" w:lineRule="auto"/>
       <w:jc w:val="left"/>
     </w:pPr>
     <w:rPr>
-      <w:sz w:val="17"/>
-      <w:szCs w:val="17"/>
+      <w:sz w:val="20"/>
+      <w:szCs w:val="20"/>
     </w:rPr>
   </w:style>
   <w:style w:type="table" w:styleId="ThreeLineTable">

</xml_diff>

<commit_message>
release: simplify manuscript structure for v3.8.0
Co-authored-by: arena-agent <297053741+arena-agent@users.noreply.github.com>
</commit_message>
<xml_diff>
--- a/projects/porphyromonas-ad-mechanism-manuscript/manuscript/concise/Chinese.docx
+++ b/projects/porphyromonas-ad-mechanism-manuscript/manuscript/concise/Chinese.docx
@@ -16,78 +16,7 @@
         <w:pStyle w:val="Normal"/>
       </w:pPr>
       <w:r>
-        <w:rPr>
-          <w:b/>
-        </w:rPr>
-        <w:t>背景：</w:t>
-      </w:r>
-      <w:r>
-        <w:t xml:space="preserve"> 牙周炎相关口腔菌群失调可能参与阿尔茨海默病（AD）相关炎症，但尚未建立明确的分子连接。微生物组小开放阅读框（smORF）构成规模庞大的候选肽空间，可用于计算优选。</w:t>
-      </w:r>
-    </w:p>
-    <w:p>
-      <w:pPr>
-        <w:pStyle w:val="Normal"/>
-      </w:pPr>
-      <w:r>
-        <w:rPr>
-          <w:b/>
-        </w:rPr>
-        <w:t>目的：</w:t>
-      </w:r>
-      <w:r>
-        <w:t xml:space="preserve"> 重建口腔smORF汇总筛选级联，并形成可供机制随访的适量肽候选集。</w:t>
-      </w:r>
-    </w:p>
-    <w:p>
-      <w:pPr>
-        <w:pStyle w:val="Normal"/>
-      </w:pPr>
-      <w:r>
-        <w:rPr>
-          <w:b/>
-        </w:rPr>
-        <w:t>方法：</w:t>
-      </w:r>
-      <w:r>
-        <w:t xml:space="preserve"> 本研究为纯计算二次分析，整合序列/蛋白质组过滤、ESM-2嵌入与任务特异性卷积网络、ESM2-t30神经毒性模型、两级神经网络金属结合预测器、多任务抗氧化卷积网络、序列组成分析及独立乙酰胆碱酯酶（AChE）对接汇总。</w:t>
-      </w:r>
-    </w:p>
-    <w:p>
-      <w:pPr>
-        <w:pStyle w:val="Normal"/>
-      </w:pPr>
-      <w:r>
-        <w:rPr>
-          <w:b/>
-        </w:rPr>
-        <w:t>结果：</w:t>
-      </w:r>
-      <w:r>
-        <w:t xml:space="preserve"> 从11,269,961条和11,721,988条smORF起始库中分别保留31,510条和33,786条候选。牙周炎标记分支中3,518条候选达到BBB高分；NTxPred2评价3,299条，其中923条为模型阳性；后续筛选依次保留111、15、12和8条候选。另一张表包含12条互不重复的7–9 aa序列，其AChE Vina均值范围为−9.60至−8.25 kcal/mol。序列组成和评分排序可以复核，但逐行对应关系和对接执行仍未解决。</w:t>
-      </w:r>
-    </w:p>
-    <w:p>
-      <w:pPr>
-        <w:pStyle w:val="Normal"/>
-      </w:pPr>
-      <w:r>
-        <w:rPr>
-          <w:b/>
-        </w:rPr>
-        <w:t>结论：</w:t>
-      </w:r>
-      <w:r>
-        <w:t xml:space="preserve"> 本研究形成边界明确的候选清单，可用于独立验证，但不能据此证明</w:t>
-      </w:r>
-      <w:r>
-        <w:rPr>
-          <w:i/>
-        </w:rPr>
-        <w:t>Porphyromonas gingivalis</w:t>
-      </w:r>
-      <w:r>
-        <w:t>来源、脑暴露、AChE结合或AD机制。预设的100 ns GROMACS扩展将在分析和质量控制完成后补充轨迹指标。</w:t>
+        <w:t>牙周炎相关口腔菌群失调可能参与阿尔茨海默病（AD）相关炎症，但尚未建立明确的分子连接。微生物组小开放阅读框（smORF）构成规模庞大的候选肽空间，可用于计算优选。本研究旨在重建口腔smORF汇总筛选级联，并形成可供机制随访的适量肽候选集。本研究为纯计算二次分析，整合序列/蛋白质组过滤、ESM-2嵌入与任务特异性卷积网络、ESM2-t30神经毒性模型、两级神经网络金属结合预测器、多任务抗氧化卷积网络、序列组成分析及独立乙酰胆碱酯酶（AChE）对接汇总。从11,269,961条和11,721,988条smORF起始库中分别保留31,510条和33,786条候选。牙周炎标记分支中3,518条候选达到BBB高分；NTxPred2评价3,299条，其中923条为模型阳性；后续筛选依次保留111、15、12和8条候选。另一张表包含12条互不重复的7–9 aa序列，其AChE Vina均值范围为−9.60至−8.25 kcal/mol。序列组成和评分排序可以复核，但逐行对应关系和对接执行仍未解决。</w:t>
       </w:r>
     </w:p>
     <w:p>
@@ -115,7 +44,7 @@
     </w:p>
     <w:p>
       <w:pPr>
-        <w:pStyle w:val="Normal"/>
+        <w:pStyle w:val="BodyText"/>
       </w:pPr>
       <w:r>
         <w:t>阿尔茨海默病（AD）是一种进行性神经退行性疾病，其病理涉及淀粉样蛋白β（Aβ）、tau、突触、免疫、血管和代谢异常的相互作用</w:t>
@@ -135,7 +64,7 @@
     </w:p>
     <w:p>
       <w:pPr>
-        <w:pStyle w:val="Normal"/>
+        <w:pStyle w:val="BodyText"/>
       </w:pPr>
       <w:r>
         <w:t>牙周炎是由失调性多微生物生物膜与易感宿主反应共同驱动的慢性炎症性疾病。它可能造成持续炎症负担和微生物产物的间歇性系统暴露，由此推动口腔—脑轴研究</w:t>
@@ -173,7 +102,7 @@
     </w:p>
     <w:p>
       <w:pPr>
-        <w:pStyle w:val="Normal"/>
+        <w:pStyle w:val="BodyText"/>
       </w:pPr>
       <w:r>
         <w:t>若干研究支持继续探索，同时也显示出现有证据缺口。AD相关死后组织中曾检出</w:t>
@@ -214,7 +143,7 @@
     </w:p>
     <w:p>
       <w:pPr>
-        <w:pStyle w:val="Normal"/>
+        <w:pStyle w:val="BodyText"/>
       </w:pPr>
       <w:r>
         <w:t>微生物组编码的小蛋白和微肽可能构成尚未充分研究的分子中介。人类微生物组大规模分析发现许多保守的小基因家族，其中多数缺少已知结构域或功能</w:t>
@@ -234,7 +163,7 @@
     </w:p>
     <w:p>
       <w:pPr>
-        <w:pStyle w:val="Normal"/>
+        <w:pStyle w:val="BodyText"/>
       </w:pPr>
       <w:r>
         <w:t>因此，相关分子机制仍不清楚。本研究定位于早期计算优选，而不是机制检验。我们重建汇总候选漏斗，按照实际算法描述各模型架构，表征一份12条序列清单，并限定现有AChE对接评分表的解释范围。研究目标是在不夸大模型输出的前提下缩小候选空间，并形成从序列追溯、独立计算、分子动力学（MD）到实验验证的科学顺序。</w:t>
@@ -260,7 +189,7 @@
     </w:p>
     <w:p>
       <w:pPr>
-        <w:pStyle w:val="Normal"/>
+        <w:pStyle w:val="BodyText"/>
       </w:pPr>
       <w:r>
         <w:t>本研究为纯计算二次分析，使用汇总筛选计数、模型汇总、一张12条序列表及相应AChE对接评分表。本文未开展参与者招募、标本采集、湿实验、新组学处理、预测器再训练或对接重跑；MD轨迹分析作为预设扩展正在进行。所提供的健康与牙周炎标签仅作为分支标签保留，不视为已经核实的候选层面疾病归属。</w:t>
@@ -268,7 +197,7 @@
     </w:p>
     <w:p>
       <w:pPr>
-        <w:pStyle w:val="Normal"/>
+        <w:pStyle w:val="BodyText"/>
       </w:pPr>
       <w:r>
         <w:t>我们核查公共登录号背景，以区分来源项目与衍生组装。PRJNA678453是配对口腔宏基因组和宏转录组测量的来源项目</w:t>
@@ -282,7 +211,7 @@
     </w:p>
     <w:p>
       <w:pPr>
-        <w:pStyle w:val="Normal"/>
+        <w:pStyle w:val="BodyText"/>
       </w:pPr>
       <w:r>
         <w:t>现有数据不含完整漏斗的候选核苷酸行、完整肽序列行、基因组坐标、样本映射、分类学归属、肽谱匹配、完整预测器输出或原始发现管线。因此，无法估计参与者层面患病率，不能进行分类学归属和疾病富集检验，也不能重建所有模型阶段之间的精确候选交接。</w:t>
@@ -299,7 +228,7 @@
     </w:p>
     <w:p>
       <w:pPr>
-        <w:pStyle w:val="Normal"/>
+        <w:pStyle w:val="BodyText"/>
       </w:pPr>
       <w:r>
         <w:t>所提供分析保留编码4–50 aa肽的翻译smORF。健康标记和牙周炎标记起始库分别包含11,269,961条和11,721,988条候选。候选序列与指定口腔序列和蛋白质组资源进行精确匹配并去冗余，最终保留31,510条健康标记候选和33,786条牙周炎标记候选。精确匹配仅解释为序列存在或曾在相关资源中被观察的支持信息，而不是分析疾病标记分支中真实表达的证明。</w:t>
@@ -307,7 +236,7 @@
     </w:p>
     <w:p>
       <w:pPr>
-        <w:pStyle w:val="Normal"/>
+        <w:pStyle w:val="BodyText"/>
       </w:pPr>
       <w:r>
         <w:t>过滤后候选分为短肽（5–30 aa）和长肽（31–50 aa）分支。健康标记分支含30,557条短肽和953条长肽；牙周炎标记分支含32,754条短肽和1,032条长肽。虽然初始定义包括4 aa肽，但下游分箱从5 aa开始，因此无法根据汇总表确定4 aa序列的去向。</w:t>
@@ -324,7 +253,7 @@
     </w:p>
     <w:p>
       <w:pPr>
-        <w:pStyle w:val="Normal"/>
+        <w:pStyle w:val="BodyText"/>
       </w:pPr>
       <w:r>
         <w:t>第一层功能优选采用UniDL4BioPep。该架构使用预训练ESM-2模型</w:t>
@@ -348,7 +277,7 @@
     </w:p>
     <w:p>
       <w:pPr>
-        <w:pStyle w:val="Normal"/>
+        <w:pStyle w:val="BodyText"/>
       </w:pPr>
       <w:r>
         <w:t>牙周炎标记BBB高分集合随后进入NTxPred2肽模式。该模型在神经毒性肽序列上微调ESM2-t30蛋白质语言模型</w:t>
@@ -362,7 +291,7 @@
     </w:p>
     <w:p>
       <w:pPr>
-        <w:pStyle w:val="Normal"/>
+        <w:pStyle w:val="BodyText"/>
       </w:pPr>
       <w:r>
         <w:t>Mebipred评价Cu、Fe和Zn相关结合潜力。与ESM模型不同，mebipred把氨基酸组成、理化描述符和金属结合5-mer频率整合到两级人工神经网络框架中：一般金属结合网络之后连接离子特异性分类器</w:t>
@@ -376,7 +305,7 @@
     </w:p>
     <w:p>
       <w:pPr>
-        <w:pStyle w:val="Normal"/>
+        <w:pStyle w:val="BodyText"/>
       </w:pPr>
       <w:r>
         <w:t>抗氧化相关性质采用多任务深度卷积神经网络AnOxPePred评价。经one-hot编码的肽序列依次通过一维卷积、平均池化和256单元全连接层，产生自由基清除（FRS）和螯合（CHEL）输出</w:t>
@@ -399,7 +328,7 @@
     </w:p>
     <w:p>
       <w:pPr>
-        <w:pStyle w:val="Normal"/>
+        <w:pStyle w:val="BodyText"/>
       </w:pPr>
       <w:r>
         <w:t>另一张表包含12条被描述为CHEL/FRS主集合的肽序列。因缺少稳定标识符和序列层面CHEL/FRS输出，无法确认其是否对应汇总终点。我们直接依据字符串重算长度，以及组氨酸、半胱氨酸、碱性残基（Arg+Lys）和芳香残基（Phe+Tyr+Trp）数量，并检查序列唯一性及标准氨基酸组成。</w:t>
@@ -407,7 +336,7 @@
     </w:p>
     <w:p>
       <w:pPr>
-        <w:pStyle w:val="Normal"/>
+        <w:pStyle w:val="BodyText"/>
       </w:pPr>
       <w:r>
         <w:t>选择AChE作为结构背景，是因为其外周区域与加速Aβ组装有关</w:t>
@@ -448,7 +377,7 @@
     </w:p>
     <w:p>
       <w:pPr>
-        <w:pStyle w:val="Normal"/>
+        <w:pStyle w:val="BodyText"/>
       </w:pPr>
       <w:r>
         <w:t>预设的100 ns MD扩展包括游离人AChE以及标记为ALLLHRC、FLLHTTR和YLSLLQR的AChE复合物。计划使用GROMACS</w:t>
@@ -468,10 +397,19 @@
     </w:p>
     <w:p>
       <w:pPr>
-        <w:pStyle w:val="Normal"/>
+        <w:pStyle w:val="BodyText"/>
       </w:pPr>
       <w:r>
         <w:t>生产阶段设定为100 ns，步长2 fs；含氢键采用LINCS约束，静电相互作用采用粒子网格Ewald法，温度耦合采用velocity-rescale方法，压力耦合采用Berendsen方法。坐标每20 ps保存一次，即每条轨迹计划得到5,000帧。预设输出包括复合物、AChE和肽层面的RMSD/RMSF、回转半径、溶剂可及表面积、二级结构、径向分布函数、氢键、残基接触及桥连水。轨迹处理与质量控制正在进行；稳定性、收敛性和接触结果将在预设分析完成后补充。</w:t>
+      </w:r>
+    </w:p>
+    <w:p>
+      <w:pPr>
+        <w:pStyle w:val="Heading2"/>
+        <w:keepNext/>
+      </w:pPr>
+      <w:r>
+        <w:t>结果</w:t>
       </w:r>
     </w:p>
     <w:p>
@@ -480,24 +418,31 @@
         <w:keepNext/>
       </w:pPr>
       <w:r>
-        <w:t>统计分析</w:t>
-      </w:r>
-    </w:p>
-    <w:p>
-      <w:pPr>
-        <w:pStyle w:val="Normal"/>
-      </w:pPr>
-      <w:r>
-        <w:t>当前分析均为描述性分析。保留率使用前一有明确记录的阶段或另行说明的分母。候选序列是嵌套于样本、组装、基因组和同源序列组的计算单位，不是独立生物学重复。因此，汇总肽计数不用于健康与牙周炎假设检验、置信区间或效应量估计。分支求和、分子≤分母约束、NTxPred2已评估/未评估分区、下游单调性、序列唯一性、组成及对接评分顺序均采用确定性方式核对。</w:t>
-      </w:r>
-    </w:p>
-    <w:p>
-      <w:pPr>
-        <w:pStyle w:val="Heading2"/>
-        <w:keepNext/>
-      </w:pPr>
-      <w:r>
-        <w:t>结果</w:t>
+        <w:t>序列证据过滤与BBB高分输出</w:t>
+      </w:r>
+    </w:p>
+    <w:p>
+      <w:pPr>
+        <w:pStyle w:val="BodyText"/>
+      </w:pPr>
+      <w:r>
+        <w:t>序列证据过滤分别保留31,510/11,269,961条健康标记候选（0.2796%）和33,786/11,721,988条牙周炎标记候选（0.2882%）。健康标记分支中，3,359/30,557条短肽（10.99%）和40/953条长肽（4.20%）为BBB高分。牙周炎标记分支中，3,446/32,754条短肽（10.52%）和72/1,032条长肽（6.98%）为BBB高分，总计3,518条；其中短肽占97.95%。</w:t>
+      </w:r>
+    </w:p>
+    <w:p>
+      <w:pPr>
+        <w:pStyle w:val="BodyText"/>
+      </w:pPr>
+      <w:r>
+        <w:t>所提供牙周炎标记长度汇总包括5–7 aa 547条、8–15 aa 2,893条、16–30 aa 6条以及31–50 aa 72条。因此，优选集合以短序列为主。由于缺少逐行身份，无法评价序列重叠、分类学分布或参与者层面患病率。</w:t>
+      </w:r>
+    </w:p>
+    <w:p>
+      <w:pPr>
+        <w:pStyle w:val="BodyText"/>
+      </w:pPr>
+      <w:r>
+        <w:t>广义抗菌输出接近饱和：健康标记短肽中30,537/30,557条（99.93%）、牙周炎标记短肽中32,721/32,754条（99.90%）超过共同0.80阈值。这种近乎普遍的阳性不太可能代表具有实验活性的口腔抗菌肽比例，更可能提示序列域偏移、校准限制或该标签不适合采用共同阈值。</w:t>
       </w:r>
     </w:p>
     <w:p>
@@ -506,45 +451,12 @@
         <w:keepNext/>
       </w:pPr>
       <w:r>
-        <w:t>序列证据过滤与BBB高分输出</w:t>
-      </w:r>
-    </w:p>
-    <w:p>
-      <w:pPr>
-        <w:pStyle w:val="Normal"/>
-      </w:pPr>
-      <w:r>
-        <w:t>序列证据过滤分别保留31,510/11,269,961条健康标记候选（0.2796%）和33,786/11,721,988条牙周炎标记候选（0.2882%）。健康标记分支中，3,359/30,557条短肽（10.99%）和40/953条长肽（4.20%）为BBB高分。牙周炎标记分支中，3,446/32,754条短肽（10.52%）和72/1,032条长肽（6.98%）为BBB高分，总计3,518条；其中短肽占97.95%。</w:t>
-      </w:r>
-    </w:p>
-    <w:p>
-      <w:pPr>
-        <w:pStyle w:val="Normal"/>
-      </w:pPr>
-      <w:r>
-        <w:t>所提供牙周炎标记长度汇总包括5–7 aa 547条、8–15 aa 2,893条、16–30 aa 6条以及31–50 aa 72条。因此，优选集合以短序列为主。由于缺少逐行身份，无法评价序列重叠、分类学分布或参与者层面患病率。</w:t>
-      </w:r>
-    </w:p>
-    <w:p>
-      <w:pPr>
-        <w:pStyle w:val="Normal"/>
-      </w:pPr>
-      <w:r>
-        <w:t>广义抗菌输出接近饱和：健康标记短肽中30,537/30,557条（99.93%）、牙周炎标记短肽中32,721/32,754条（99.90%）超过共同0.80阈值。这种近乎普遍的阳性不太可能代表具有实验活性的口腔抗菌肽比例，更可能提示序列域偏移、校准限制或该标签不适合采用共同阈值。</w:t>
-      </w:r>
-    </w:p>
-    <w:p>
-      <w:pPr>
-        <w:pStyle w:val="Heading3"/>
-        <w:keepNext/>
-      </w:pPr>
-      <w:r>
         <w:t>串行模型优选</w:t>
       </w:r>
     </w:p>
     <w:p>
       <w:pPr>
-        <w:pStyle w:val="Normal"/>
+        <w:pStyle w:val="BodyText"/>
       </w:pPr>
       <w:r>
         <w:t>NTxPred2评价3,299/3,518条牙周炎标记BBB高分候选（93.77%）；219/3,518条（6.23%）超出规定长度范围。在已评估候选中，923/3,299条（27.98%）为模型阳性。后续汇总筛选依次保留111条mebipred阳性、15条CHEL≥0.25、12条CHEL≥0.25且FRS&lt;0.50，以及8条CHEL≥0.25且FRS&lt;0.45候选（表1）。收紧FRS阈值后保留主集合的8/12（66.67%）。由于缺少候选层面交接数据，111/923不解释为已验证转换率。</w:t>
@@ -1711,7 +1623,7 @@
     </w:p>
     <w:p>
       <w:pPr>
-        <w:pStyle w:val="Normal"/>
+        <w:pStyle w:val="BodyText"/>
       </w:pPr>
       <w:r>
         <w:t>另一张表包含12条互不重复、仅由标准氨基酸组成的肽，长度为7–9个残基。其中11条含组氨酸，6条含半胱氨酸，每条均至少含一个Arg或Lys。这些性质可提出合成和配位假设，但不能证明金属结合、BBB转运、毒性、分类学归属或与汇总终点的对应关系。</w:t>
@@ -1719,7 +1631,7 @@
     </w:p>
     <w:p>
       <w:pPr>
-        <w:pStyle w:val="Normal"/>
+        <w:pStyle w:val="BodyText"/>
       </w:pPr>
       <w:r>
         <w:t>Vina均值范围为−9.60至−8.25 kcal/mol，标准差范围为0.04至0.12（表2）。FLLHTTR、YLSLLQR和ALLLHRC的均值最低，HLPLLHRCC和HVLLLRQCA的均值最高。1.35 kcal/mol的跨度仅描述该评分表。标准差的逐次运行分母不可获得；在缺少构象时也无法评价残基层面相互作用。</w:t>
@@ -3068,7 +2980,7 @@
     </w:p>
     <w:p>
       <w:pPr>
-        <w:pStyle w:val="Normal"/>
+        <w:pStyle w:val="BodyText"/>
       </w:pPr>
       <w:r>
         <w:t>本研究重建一条计算漏斗，把数百万条smORF候选缩减为12条主集合和8条严格子集的汇总终点，同时表征另一份12条明确序列并保留现有AChE对接表的评分顺序。主要科学贡献不是验证牙周炎—AD机制，而是形成边界清楚的候选集、明确模型适用性限制，并为恢复缺失的序列层面和实验依据提供有序路径。</w:t>
@@ -3085,7 +2997,7 @@
     </w:p>
     <w:p>
       <w:pPr>
-        <w:pStyle w:val="Normal"/>
+        <w:pStyle w:val="BodyText"/>
       </w:pPr>
       <w:r>
         <w:t>该级联整合现代神经网络架构，但不能视为多次独立确认。UniDL4BioPep和NTxPred2均使用蛋白质语言模型表示，而mebipred和AnOxPePred包含组成衍生信息，相关序列特征可能沿连续筛选传播。不同训练集在终点定义、序列长度、去冗余、类别平衡和阴性集构建上也存在差异。对于富亮氨酸、带正电且仅7–9 aa的微生物组肽，这些问题尤为重要，因为候选可能偏离训练分布。</w:t>
@@ -3093,7 +3005,7 @@
     </w:p>
     <w:p>
       <w:pPr>
-        <w:pStyle w:val="Normal"/>
+        <w:pStyle w:val="BodyText"/>
       </w:pPr>
       <w:r>
         <w:t>接近饱和的抗菌输出提供内部校准警示。它不否定所有排序，但表明共同概率阈值在不同任务中可能具有完全不同的意义。因此，“BBB高分”“神经毒性阳性”“金属结合阳性”、CHEL和FRS都只是操作性模型标签，并不等同于转运、神经元损伤、结合常数、配位几何或氧化还原活性。</w:t>
@@ -3110,7 +3022,7 @@
     </w:p>
     <w:p>
       <w:pPr>
-        <w:pStyle w:val="Normal"/>
+        <w:pStyle w:val="BodyText"/>
       </w:pPr>
       <w:r>
         <w:t>AChE外周区域可影响Aβ组装，因此具有生物学相关性，但这一背景不能把对接评分转化为靶点结合。柔性肽具有多种可达构象，质子化、末端状态、受体柔性、初始结构和搜索设置均可能改变排序。独立重现应包含制备后的受体和配体文件、多种起始构象、明确随机种子、全部原始分数与构象，以及FlexPepDock等肽特异性柔性精修</w:t>
@@ -3124,7 +3036,7 @@
     </w:p>
     <w:p>
       <w:pPr>
-        <w:pStyle w:val="Normal"/>
+        <w:pStyle w:val="BodyText"/>
       </w:pPr>
       <w:r>
         <w:t>组氨酸和半胱氨酸富集提供潜在金属配位基团，但序列组成不能确定亲和力、化学计量、离子选择性、配位几何、氧化态或氧化还原后果。直接测量应在受控pH和化学计量下比较Cu(II)、Fe(II/III)和Zn(II)，并包括光谱、热力学、活性氧及脂质过氧化终点。需要设置仅肽、仅金属、打乱序列、组成匹配及明确阳性和阴性对照。</w:t>
@@ -3141,7 +3053,7 @@
     </w:p>
     <w:p>
       <w:pPr>
-        <w:pStyle w:val="Normal"/>
+        <w:pStyle w:val="BodyText"/>
       </w:pPr>
       <w:r>
         <w:t>牙周背景仍属于假设生成。人体关联可能受到年龄、吸烟、糖尿病、用药、衰弱、社会经济因素、口腔护理可及性和反向因果影响。</w:t>
@@ -3167,7 +3079,7 @@
     </w:p>
     <w:p>
       <w:pPr>
-        <w:pStyle w:val="Normal"/>
+        <w:pStyle w:val="BodyText"/>
       </w:pPr>
       <w:r>
         <w:t>可信的分子链需要序列到contig或组装的映射、样本和临床分组、分类学解析、队列匹配的转录或翻译证据、系统暴露、BBB转运以及可重复的靶点或细胞表型。每一步回答不同问题，不能通过累积更多计算评分来替代。</w:t>
@@ -3184,7 +3096,7 @@
     </w:p>
     <w:p>
       <w:pPr>
-        <w:pStyle w:val="Normal"/>
+        <w:pStyle w:val="BodyText"/>
       </w:pPr>
       <w:r>
         <w:t>首要任务是恢复候选层面数据表，将序列、稳定标识符、基因组坐标、组装、样本、分组、分类学、肽谱证据、每个预测器评分与适用性标记、CHEL/FRS值、主/严格集合成员及对接配体身份连接起来。这将解决12条明确序列是否对应汇总终点，并确定严格8条子集。</w:t>
@@ -3192,7 +3104,7 @@
     </w:p>
     <w:p>
       <w:pPr>
-        <w:pStyle w:val="Normal"/>
+        <w:pStyle w:val="BodyText"/>
       </w:pPr>
       <w:r>
         <w:t>固定版本计算重现后，合成肽应依次接受身份、纯度、溶解性、聚集和血清/蛋白酶稳定性检验。BBB转运与细胞毒性应分别采用浓度—反应设计和非神经元对照。随后在预设条件下评价金属化学、AChE/BChE活性、直接结合及Aβ聚集。正在进行的MD扩展将在质量控制后提供轨迹稳定性和接触指标；只有分子身份、暴露、可重复生化活性和生物学重复表型均成立时，才适合进入疾病模型。</w:t>
@@ -3200,36 +3112,10 @@
     </w:p>
     <w:p>
       <w:pPr>
-        <w:pStyle w:val="Normal"/>
+        <w:pStyle w:val="BodyText"/>
       </w:pPr>
       <w:r>
         <w:t>决定性局限包括缺少漏斗逐行数据、12与8终点成员未解决、缺少原始对接输入和构象、MD轨迹分析仍在进行，以及缺少生物学测量。健康标记与牙周炎标记库相近的汇总保留率不能支持疾病富集，因为适当推断单位应是参与者或样本。这些限制将当前研究限定为计算优选与验证规划。</w:t>
-      </w:r>
-    </w:p>
-    <w:p>
-      <w:pPr>
-        <w:pStyle w:val="Heading2"/>
-        <w:keepNext/>
-      </w:pPr>
-      <w:r>
-        <w:t>结论</w:t>
-      </w:r>
-    </w:p>
-    <w:p>
-      <w:pPr>
-        <w:pStyle w:val="Normal"/>
-      </w:pPr>
-      <w:r>
-        <w:t>汇总数据支持一条透明计算漏斗，终点为12条主集合和8条严格子集计数。另一张12条肽的表格提供可复核的序列组成和AChE评分排序，但尚不能逐行连接到这些终点。扩展后的精简稿明确了实际神经网络架构、模型适用性限制、正在进行的100 ns MD扩展及顺序化实验要求。该候选清单适用于独立计算和实验验证，但不能证明</w:t>
-      </w:r>
-      <w:r>
-        <w:rPr>
-          <w:i/>
-        </w:rPr>
-        <w:t>P. gingivalis</w:t>
-      </w:r>
-      <w:r>
-        <w:t>来源、疾病特异性、脑暴露、靶点结合、生物活性或因果关系。</w:t>
       </w:r>
     </w:p>
     <w:p>
@@ -3920,6 +3806,22 @@
     <w:name w:val="Normal"/>
     <w:qFormat/>
     <w:pPr>
+      <w:spacing w:before="0" w:after="0" w:line="480" w:lineRule="auto"/>
+      <w:jc w:val="both"/>
+      <w:widowControl/>
+    </w:pPr>
+    <w:rPr>
+      <w:sz w:val="24"/>
+      <w:szCs w:val="24"/>
+    </w:rPr>
+  </w:style>
+  <w:style w:type="paragraph" w:styleId="BodyText">
+    <w:name w:val="Body Text"/>
+    <w:basedOn w:val="Normal"/>
+    <w:next w:val="BodyText"/>
+    <w:qFormat/>
+    <w:pPr>
+      <w:ind w:firstLine="480"/>
       <w:spacing w:before="0" w:after="0" w:line="480" w:lineRule="auto"/>
       <w:jc w:val="both"/>
       <w:widowControl/>

</xml_diff>